<commit_message>
ADDING TODAY'S WORK - 07.05.2026
</commit_message>
<xml_diff>
--- a/resources/Notes - Individual Research Project.docx
+++ b/resources/Notes - Individual Research Project.docx
@@ -257,19 +257,7 @@
           <w:rPr>
             <w:rStyle w:val="Hyperlink"/>
           </w:rPr>
-          <w:t>https://www.tamirn</w:t>
-        </w:r>
-        <w:r>
-          <w:rPr>
-            <w:rStyle w:val="Hyperlink"/>
-          </w:rPr>
-          <w:t>a</w:t>
-        </w:r>
-        <w:r>
-          <w:rPr>
-            <w:rStyle w:val="Hyperlink"/>
-          </w:rPr>
-          <w:t>.com/</w:t>
+          <w:t>https://www.tamirna.com/</w:t>
         </w:r>
       </w:hyperlink>
     </w:p>
@@ -464,6 +452,9 @@
         </w:numPr>
       </w:pPr>
       <w:r>
+        <w:rPr>
+          <w:noProof/>
+        </w:rPr>
         <w:drawing>
           <wp:inline distT="0" distB="0" distL="0" distR="0" wp14:anchorId="70D79C42" wp14:editId="05917C25">
             <wp:extent cx="4246880" cy="1247085"/>
@@ -580,6 +571,9 @@
     </w:p>
     <w:p>
       <w:r>
+        <w:rPr>
+          <w:noProof/>
+        </w:rPr>
         <w:drawing>
           <wp:inline distT="0" distB="0" distL="0" distR="0" wp14:anchorId="0F52D6F4" wp14:editId="62993AA3">
             <wp:extent cx="5731510" cy="955040"/>
@@ -670,10 +664,7 @@
         </w:numPr>
       </w:pPr>
       <w:r>
-        <w:t>See bioinformatics section of the methods</w:t>
-      </w:r>
-      <w:r>
-        <w:t xml:space="preserve">. This paper is from </w:t>
+        <w:t xml:space="preserve">See bioinformatics section of the methods. This paper is from </w:t>
       </w:r>
       <w:proofErr w:type="spellStart"/>
       <w:r>
@@ -698,10 +689,10 @@
       </w:pPr>
       <w:r>
         <w:drawing>
-          <wp:inline distT="0" distB="0" distL="0" distR="0" wp14:anchorId="7D450F05" wp14:editId="051CCDEA">
-            <wp:extent cx="5731510" cy="1924685"/>
-            <wp:effectExtent l="0" t="0" r="0" b="5715"/>
-            <wp:docPr id="1020196716" name="Picture 1"/>
+          <wp:inline distT="0" distB="0" distL="0" distR="0" wp14:anchorId="67F6F1FD" wp14:editId="63B20F00">
+            <wp:extent cx="5731510" cy="2835910"/>
+            <wp:effectExtent l="0" t="0" r="0" b="0"/>
+            <wp:docPr id="1250911431" name="Picture 1"/>
             <wp:cNvGraphicFramePr>
               <a:graphicFrameLocks xmlns:a="http://schemas.openxmlformats.org/drawingml/2006/main" noChangeAspect="1"/>
             </wp:cNvGraphicFramePr>
@@ -709,7 +700,7 @@
               <a:graphicData uri="http://schemas.openxmlformats.org/drawingml/2006/picture">
                 <pic:pic xmlns:pic="http://schemas.openxmlformats.org/drawingml/2006/picture">
                   <pic:nvPicPr>
-                    <pic:cNvPr id="1020196716" name=""/>
+                    <pic:cNvPr id="1250911431" name=""/>
                     <pic:cNvPicPr/>
                   </pic:nvPicPr>
                   <pic:blipFill>
@@ -721,7 +712,7 @@
                   <pic:spPr>
                     <a:xfrm>
                       <a:off x="0" y="0"/>
-                      <a:ext cx="5731510" cy="1924685"/>
+                      <a:ext cx="5731510" cy="2835910"/>
                     </a:xfrm>
                     <a:prstGeom prst="rect">
                       <a:avLst/>
@@ -888,6 +879,7 @@
         </w:numPr>
       </w:pPr>
       <w:r>
+        <w:lastRenderedPageBreak/>
         <w:t xml:space="preserve">Pathway analysis software used in one of the 3 initial references supplied </w:t>
       </w:r>
       <w:hyperlink r:id="rId17" w:history="1">
@@ -913,11 +905,7 @@
       </w:r>
       <w:proofErr w:type="spellEnd"/>
       <w:r>
-        <w:t xml:space="preserve"> was used for functional enrichment analysis of the miRNA targets (51) with a Bonferroni FDR &lt;0.05. Biological process gene ontology (GO) terms </w:t>
-      </w:r>
-      <w:r>
-        <w:lastRenderedPageBreak/>
-        <w:t xml:space="preserve">generated through </w:t>
+        <w:t xml:space="preserve"> was used for functional enrichment analysis of the miRNA targets (51) with a Bonferroni FDR &lt;0.05. Biological process gene ontology (GO) terms generated through </w:t>
       </w:r>
       <w:proofErr w:type="spellStart"/>
       <w:r>
@@ -1165,6 +1153,9 @@
     </w:p>
     <w:p>
       <w:r>
+        <w:rPr>
+          <w:noProof/>
+        </w:rPr>
         <w:drawing>
           <wp:inline distT="0" distB="0" distL="0" distR="0" wp14:anchorId="2CEE12F4" wp14:editId="0C07CE5A">
             <wp:extent cx="5181600" cy="1094761"/>
@@ -1237,6 +1228,9 @@
     </w:p>
     <w:p>
       <w:r>
+        <w:rPr>
+          <w:noProof/>
+        </w:rPr>
         <w:lastRenderedPageBreak/>
         <w:drawing>
           <wp:inline distT="0" distB="0" distL="0" distR="0" wp14:anchorId="6415A522" wp14:editId="593C753A">

</xml_diff>

<commit_message>
ADDING TODAY'S WORK - 22.05.2026
</commit_message>
<xml_diff>
--- a/resources/Notes - Individual Research Project.docx
+++ b/resources/Notes - Individual Research Project.docx
@@ -329,10 +329,72 @@
         </w:numPr>
       </w:pPr>
       <w:r>
+        <w:lastRenderedPageBreak/>
+        <w:t xml:space="preserve">Need to include R </w:t>
+      </w:r>
+      <w:proofErr w:type="spellStart"/>
+      <w:proofErr w:type="gramStart"/>
+      <w:r>
+        <w:t>sessionInfo</w:t>
+      </w:r>
+      <w:proofErr w:type="spellEnd"/>
+      <w:r>
+        <w:t>(</w:t>
+      </w:r>
+      <w:proofErr w:type="gramEnd"/>
+      <w:r>
+        <w:t xml:space="preserve">) somewhere: </w:t>
+      </w:r>
+      <w:r>
+        <w:drawing>
+          <wp:inline distT="0" distB="0" distL="0" distR="0" wp14:anchorId="77DF8924" wp14:editId="2B449833">
+            <wp:extent cx="2656373" cy="2965391"/>
+            <wp:effectExtent l="0" t="0" r="0" b="0"/>
+            <wp:docPr id="452597076" name="Picture 1"/>
+            <wp:cNvGraphicFramePr>
+              <a:graphicFrameLocks xmlns:a="http://schemas.openxmlformats.org/drawingml/2006/main" noChangeAspect="1"/>
+            </wp:cNvGraphicFramePr>
+            <a:graphic xmlns:a="http://schemas.openxmlformats.org/drawingml/2006/main">
+              <a:graphicData uri="http://schemas.openxmlformats.org/drawingml/2006/picture">
+                <pic:pic xmlns:pic="http://schemas.openxmlformats.org/drawingml/2006/picture">
+                  <pic:nvPicPr>
+                    <pic:cNvPr id="452597076" name=""/>
+                    <pic:cNvPicPr/>
+                  </pic:nvPicPr>
+                  <pic:blipFill>
+                    <a:blip r:embed="rId8"/>
+                    <a:stretch>
+                      <a:fillRect/>
+                    </a:stretch>
+                  </pic:blipFill>
+                  <pic:spPr>
+                    <a:xfrm>
+                      <a:off x="0" y="0"/>
+                      <a:ext cx="2670862" cy="2981565"/>
+                    </a:xfrm>
+                    <a:prstGeom prst="rect">
+                      <a:avLst/>
+                    </a:prstGeom>
+                  </pic:spPr>
+                </pic:pic>
+              </a:graphicData>
+            </a:graphic>
+          </wp:inline>
+        </w:drawing>
+      </w:r>
+    </w:p>
+    <w:p>
+      <w:pPr>
+        <w:pStyle w:val="ListParagraph"/>
+        <w:numPr>
+          <w:ilvl w:val="0"/>
+          <w:numId w:val="1"/>
+        </w:numPr>
+      </w:pPr>
+      <w:r>
         <w:rPr>
           <w:noProof/>
         </w:rPr>
-        <w:lastRenderedPageBreak/>
         <w:drawing>
           <wp:inline distT="0" distB="0" distL="0" distR="0" wp14:anchorId="282DEDBA" wp14:editId="237FB5B1">
             <wp:extent cx="5832079" cy="3371569"/>
@@ -349,7 +411,7 @@
                     <pic:cNvPicPr/>
                   </pic:nvPicPr>
                   <pic:blipFill>
-                    <a:blip r:embed="rId8"/>
+                    <a:blip r:embed="rId9"/>
                     <a:stretch>
                       <a:fillRect/>
                     </a:stretch>
@@ -456,6 +518,7 @@
         </w:numPr>
       </w:pPr>
       <w:r>
+        <w:lastRenderedPageBreak/>
         <w:t>Simple guides/help buttons at each step to indicate to reader how to make decision (can just be placeholder, e.g. state what the button will do, if not finished in time)</w:t>
       </w:r>
     </w:p>
@@ -487,7 +550,7 @@
                     <pic:cNvPicPr/>
                   </pic:nvPicPr>
                   <pic:blipFill rotWithShape="1">
-                    <a:blip r:embed="rId9"/>
+                    <a:blip r:embed="rId10"/>
                     <a:srcRect l="7683" r="4987" b="7377"/>
                     <a:stretch>
                       <a:fillRect/>
@@ -567,10 +630,9 @@
         </w:numPr>
       </w:pPr>
       <w:r>
-        <w:lastRenderedPageBreak/>
         <w:t xml:space="preserve">Need to be confident with the annotation for miRNA. </w:t>
       </w:r>
-      <w:hyperlink r:id="rId10" w:history="1">
+      <w:hyperlink r:id="rId11" w:history="1">
         <w:r>
           <w:rPr>
             <w:rStyle w:val="Hyperlink"/>
@@ -606,7 +668,7 @@
                     <pic:cNvPicPr/>
                   </pic:nvPicPr>
                   <pic:blipFill rotWithShape="1">
-                    <a:blip r:embed="rId11"/>
+                    <a:blip r:embed="rId12"/>
                     <a:srcRect b="29389"/>
                     <a:stretch>
                       <a:fillRect/>
@@ -662,7 +724,7 @@
       <w:r>
         <w:t xml:space="preserve"> </w:t>
       </w:r>
-      <w:hyperlink r:id="rId12" w:history="1">
+      <w:hyperlink r:id="rId13" w:history="1">
         <w:r>
           <w:rPr>
             <w:rStyle w:val="Hyperlink"/>
@@ -690,7 +752,7 @@
       <w:r>
         <w:t xml:space="preserve"> analysis of their propriety miRNA workflow </w:t>
       </w:r>
-      <w:hyperlink r:id="rId13" w:history="1">
+      <w:hyperlink r:id="rId14" w:history="1">
         <w:r>
           <w:rPr>
             <w:rStyle w:val="Hyperlink"/>
@@ -723,7 +785,7 @@
                     <pic:cNvPicPr/>
                   </pic:nvPicPr>
                   <pic:blipFill>
-                    <a:blip r:embed="rId14"/>
+                    <a:blip r:embed="rId15"/>
                     <a:stretch>
                       <a:fillRect/>
                     </a:stretch>
@@ -786,7 +848,7 @@
       <w:r>
         <w:t xml:space="preserve"> etc. </w:t>
       </w:r>
-      <w:hyperlink r:id="rId15" w:history="1">
+      <w:hyperlink r:id="rId16" w:history="1">
         <w:r>
           <w:rPr>
             <w:rStyle w:val="Hyperlink"/>
@@ -812,7 +874,7 @@
       <w:r>
         <w:t xml:space="preserve"> </w:t>
       </w:r>
-      <w:hyperlink r:id="rId16" w:history="1">
+      <w:hyperlink r:id="rId17" w:history="1">
         <w:r>
           <w:rPr>
             <w:rStyle w:val="Hyperlink"/>
@@ -898,10 +960,9 @@
         </w:numPr>
       </w:pPr>
       <w:r>
-        <w:lastRenderedPageBreak/>
         <w:t xml:space="preserve">Pathway analysis software used in one of the 3 initial references supplied </w:t>
       </w:r>
-      <w:hyperlink r:id="rId17" w:history="1">
+      <w:hyperlink r:id="rId18" w:history="1">
         <w:r>
           <w:rPr>
             <w:rStyle w:val="Hyperlink"/>
@@ -953,7 +1014,7 @@
       <w:r>
         <w:t xml:space="preserve"> </w:t>
       </w:r>
-      <w:hyperlink r:id="rId18" w:history="1">
+      <w:hyperlink r:id="rId19" w:history="1">
         <w:r>
           <w:rPr>
             <w:rStyle w:val="Hyperlink"/>
@@ -1175,6 +1236,7 @@
         <w:rPr>
           <w:noProof/>
         </w:rPr>
+        <w:lastRenderedPageBreak/>
         <w:drawing>
           <wp:inline distT="0" distB="0" distL="0" distR="0" wp14:anchorId="2CEE12F4" wp14:editId="0C07CE5A">
             <wp:extent cx="5181600" cy="1094761"/>
@@ -1191,7 +1253,7 @@
                     <pic:cNvPicPr/>
                   </pic:nvPicPr>
                   <pic:blipFill>
-                    <a:blip r:embed="rId19"/>
+                    <a:blip r:embed="rId20"/>
                     <a:stretch>
                       <a:fillRect/>
                     </a:stretch>
@@ -1250,7 +1312,6 @@
         <w:rPr>
           <w:noProof/>
         </w:rPr>
-        <w:lastRenderedPageBreak/>
         <w:drawing>
           <wp:inline distT="0" distB="0" distL="0" distR="0" wp14:anchorId="6415A522" wp14:editId="593C753A">
             <wp:extent cx="5731510" cy="1586865"/>
@@ -1267,7 +1328,7 @@
                     <pic:cNvPicPr/>
                   </pic:nvPicPr>
                   <pic:blipFill>
-                    <a:blip r:embed="rId20"/>
+                    <a:blip r:embed="rId21"/>
                     <a:stretch>
                       <a:fillRect/>
                     </a:stretch>

</xml_diff>

<commit_message>
ADDING TODAY'S WORK - 28.05.2026
</commit_message>
<xml_diff>
--- a/resources/Notes - Individual Research Project.docx
+++ b/resources/Notes - Individual Research Project.docx
@@ -346,6 +346,9 @@
         <w:t xml:space="preserve">) somewhere: </w:t>
       </w:r>
       <w:r>
+        <w:rPr>
+          <w:noProof/>
+        </w:rPr>
         <w:drawing>
           <wp:inline distT="0" distB="0" distL="0" distR="0" wp14:anchorId="77DF8924" wp14:editId="2B449833">
             <wp:extent cx="2656373" cy="2965391"/>
@@ -596,6 +599,790 @@
           <w:ilvl w:val="0"/>
           <w:numId w:val="1"/>
         </w:numPr>
+        <w:shd w:val="clear" w:color="auto" w:fill="F5F5F5"/>
+        <w:tabs>
+          <w:tab w:val="left" w:pos="916"/>
+          <w:tab w:val="left" w:pos="1832"/>
+          <w:tab w:val="left" w:pos="2748"/>
+          <w:tab w:val="left" w:pos="3664"/>
+          <w:tab w:val="left" w:pos="4580"/>
+          <w:tab w:val="left" w:pos="5496"/>
+          <w:tab w:val="left" w:pos="6412"/>
+          <w:tab w:val="left" w:pos="7328"/>
+          <w:tab w:val="left" w:pos="8244"/>
+          <w:tab w:val="left" w:pos="9160"/>
+          <w:tab w:val="left" w:pos="10076"/>
+          <w:tab w:val="left" w:pos="10992"/>
+          <w:tab w:val="left" w:pos="11908"/>
+          <w:tab w:val="left" w:pos="12824"/>
+          <w:tab w:val="left" w:pos="13740"/>
+          <w:tab w:val="left" w:pos="14656"/>
+        </w:tabs>
+        <w:spacing w:after="0" w:line="240" w:lineRule="auto"/>
+        <w:rPr>
+          <w:rFonts w:ascii="Menlo" w:eastAsia="Times New Roman" w:hAnsi="Menlo" w:cs="Menlo"/>
+          <w:color w:val="B509AC"/>
+          <w:kern w:val="0"/>
+          <w:sz w:val="21"/>
+          <w:szCs w:val="21"/>
+          <w:lang w:eastAsia="en-GB"/>
+          <w14:ligatures w14:val="none"/>
+        </w:rPr>
+      </w:pPr>
+      <w:proofErr w:type="spellStart"/>
+      <w:proofErr w:type="gramStart"/>
+      <w:r>
+        <w:rPr>
+          <w:rFonts w:ascii="Menlo" w:eastAsia="Times New Roman" w:hAnsi="Menlo" w:cs="Menlo"/>
+          <w:color w:val="000000"/>
+          <w:kern w:val="0"/>
+          <w:sz w:val="20"/>
+          <w:szCs w:val="20"/>
+          <w:lang w:eastAsia="en-GB"/>
+          <w14:ligatures w14:val="none"/>
+        </w:rPr>
+        <w:t>BiocManager</w:t>
+      </w:r>
+      <w:proofErr w:type="spellEnd"/>
+      <w:r>
+        <w:rPr>
+          <w:rFonts w:ascii="Menlo" w:eastAsia="Times New Roman" w:hAnsi="Menlo" w:cs="Menlo"/>
+          <w:b/>
+          <w:bCs/>
+          <w:color w:val="000000"/>
+          <w:kern w:val="0"/>
+          <w:sz w:val="20"/>
+          <w:szCs w:val="20"/>
+          <w:lang w:eastAsia="en-GB"/>
+          <w14:ligatures w14:val="none"/>
+        </w:rPr>
+        <w:t>::</w:t>
+      </w:r>
+      <w:r>
+        <w:rPr>
+          <w:rFonts w:ascii="Menlo" w:eastAsia="Times New Roman" w:hAnsi="Menlo" w:cs="Menlo"/>
+          <w:color w:val="000000"/>
+          <w:kern w:val="0"/>
+          <w:sz w:val="20"/>
+          <w:szCs w:val="20"/>
+          <w:lang w:eastAsia="en-GB"/>
+          <w14:ligatures w14:val="none"/>
+        </w:rPr>
+        <w:t>install(</w:t>
+      </w:r>
+      <w:r>
+        <w:rPr>
+          <w:rFonts w:ascii="Menlo" w:eastAsia="Times New Roman" w:hAnsi="Menlo" w:cs="Menlo"/>
+          <w:b/>
+          <w:bCs/>
+          <w:color w:val="990000"/>
+          <w:kern w:val="0"/>
+          <w:sz w:val="20"/>
+          <w:szCs w:val="20"/>
+          <w:lang w:eastAsia="en-GB"/>
+          <w14:ligatures w14:val="none"/>
+        </w:rPr>
+        <w:t>c</w:t>
+      </w:r>
+      <w:r>
+        <w:rPr>
+          <w:rFonts w:ascii="Menlo" w:eastAsia="Times New Roman" w:hAnsi="Menlo" w:cs="Menlo"/>
+          <w:color w:val="000000"/>
+          <w:kern w:val="0"/>
+          <w:sz w:val="20"/>
+          <w:szCs w:val="20"/>
+          <w:lang w:eastAsia="en-GB"/>
+          <w14:ligatures w14:val="none"/>
+        </w:rPr>
+        <w:t>(</w:t>
+      </w:r>
+      <w:proofErr w:type="gramEnd"/>
+      <w:r>
+        <w:rPr>
+          <w:rFonts w:ascii="Menlo" w:eastAsia="Times New Roman" w:hAnsi="Menlo" w:cs="Menlo"/>
+          <w:color w:val="D01040"/>
+          <w:kern w:val="0"/>
+          <w:sz w:val="20"/>
+          <w:szCs w:val="20"/>
+          <w:lang w:eastAsia="en-GB"/>
+          <w14:ligatures w14:val="none"/>
+        </w:rPr>
+        <w:t>"</w:t>
+      </w:r>
+      <w:proofErr w:type="spellStart"/>
+      <w:r>
+        <w:rPr>
+          <w:rFonts w:ascii="Menlo" w:eastAsia="Times New Roman" w:hAnsi="Menlo" w:cs="Menlo"/>
+          <w:color w:val="D01040"/>
+          <w:kern w:val="0"/>
+          <w:sz w:val="20"/>
+          <w:szCs w:val="20"/>
+          <w:lang w:eastAsia="en-GB"/>
+          <w14:ligatures w14:val="none"/>
+        </w:rPr>
+        <w:t>globaltest</w:t>
+      </w:r>
+      <w:proofErr w:type="spellEnd"/>
+      <w:r>
+        <w:rPr>
+          <w:rFonts w:ascii="Menlo" w:eastAsia="Times New Roman" w:hAnsi="Menlo" w:cs="Menlo"/>
+          <w:color w:val="D01040"/>
+          <w:kern w:val="0"/>
+          <w:sz w:val="20"/>
+          <w:szCs w:val="20"/>
+          <w:lang w:eastAsia="en-GB"/>
+          <w14:ligatures w14:val="none"/>
+        </w:rPr>
+        <w:t>"</w:t>
+      </w:r>
+      <w:r>
+        <w:rPr>
+          <w:rFonts w:ascii="Menlo" w:eastAsia="Times New Roman" w:hAnsi="Menlo" w:cs="Menlo"/>
+          <w:color w:val="000000"/>
+          <w:kern w:val="0"/>
+          <w:sz w:val="20"/>
+          <w:szCs w:val="20"/>
+          <w:lang w:eastAsia="en-GB"/>
+          <w14:ligatures w14:val="none"/>
+        </w:rPr>
+        <w:t>,</w:t>
+      </w:r>
+      <w:r>
+        <w:rPr>
+          <w:rFonts w:ascii="Menlo" w:eastAsia="Times New Roman" w:hAnsi="Menlo" w:cs="Menlo"/>
+          <w:color w:val="BBBBBB"/>
+          <w:kern w:val="0"/>
+          <w:sz w:val="20"/>
+          <w:szCs w:val="20"/>
+          <w:lang w:eastAsia="en-GB"/>
+          <w14:ligatures w14:val="none"/>
+        </w:rPr>
+        <w:t xml:space="preserve"> </w:t>
+      </w:r>
+      <w:r>
+        <w:rPr>
+          <w:rFonts w:ascii="Menlo" w:eastAsia="Times New Roman" w:hAnsi="Menlo" w:cs="Menlo"/>
+          <w:color w:val="D01040"/>
+          <w:kern w:val="0"/>
+          <w:sz w:val="20"/>
+          <w:szCs w:val="20"/>
+          <w:lang w:eastAsia="en-GB"/>
+          <w14:ligatures w14:val="none"/>
+        </w:rPr>
+        <w:t>"</w:t>
+      </w:r>
+      <w:proofErr w:type="spellStart"/>
+      <w:r>
+        <w:rPr>
+          <w:rFonts w:ascii="Menlo" w:eastAsia="Times New Roman" w:hAnsi="Menlo" w:cs="Menlo"/>
+          <w:color w:val="D01040"/>
+          <w:kern w:val="0"/>
+          <w:sz w:val="20"/>
+          <w:szCs w:val="20"/>
+          <w:lang w:eastAsia="en-GB"/>
+          <w14:ligatures w14:val="none"/>
+        </w:rPr>
+        <w:t>topGO</w:t>
+      </w:r>
+      <w:proofErr w:type="spellEnd"/>
+      <w:r>
+        <w:rPr>
+          <w:rFonts w:ascii="Menlo" w:eastAsia="Times New Roman" w:hAnsi="Menlo" w:cs="Menlo"/>
+          <w:color w:val="D01040"/>
+          <w:kern w:val="0"/>
+          <w:sz w:val="20"/>
+          <w:szCs w:val="20"/>
+          <w:lang w:eastAsia="en-GB"/>
+          <w14:ligatures w14:val="none"/>
+        </w:rPr>
+        <w:t>"</w:t>
+      </w:r>
+      <w:r>
+        <w:rPr>
+          <w:rFonts w:ascii="Menlo" w:eastAsia="Times New Roman" w:hAnsi="Menlo" w:cs="Menlo"/>
+          <w:color w:val="000000"/>
+          <w:kern w:val="0"/>
+          <w:sz w:val="20"/>
+          <w:szCs w:val="20"/>
+          <w:lang w:eastAsia="en-GB"/>
+          <w14:ligatures w14:val="none"/>
+        </w:rPr>
+        <w:t>,</w:t>
+      </w:r>
+      <w:r>
+        <w:rPr>
+          <w:rFonts w:ascii="Menlo" w:eastAsia="Times New Roman" w:hAnsi="Menlo" w:cs="Menlo"/>
+          <w:color w:val="BBBBBB"/>
+          <w:kern w:val="0"/>
+          <w:sz w:val="20"/>
+          <w:szCs w:val="20"/>
+          <w:lang w:eastAsia="en-GB"/>
+          <w14:ligatures w14:val="none"/>
+        </w:rPr>
+        <w:t xml:space="preserve"> </w:t>
+      </w:r>
+      <w:r>
+        <w:rPr>
+          <w:rFonts w:ascii="Menlo" w:eastAsia="Times New Roman" w:hAnsi="Menlo" w:cs="Menlo"/>
+          <w:color w:val="D01040"/>
+          <w:kern w:val="0"/>
+          <w:sz w:val="20"/>
+          <w:szCs w:val="20"/>
+          <w:lang w:eastAsia="en-GB"/>
+          <w14:ligatures w14:val="none"/>
+        </w:rPr>
+        <w:t>"</w:t>
+      </w:r>
+      <w:proofErr w:type="spellStart"/>
+      <w:r>
+        <w:rPr>
+          <w:rFonts w:ascii="Menlo" w:eastAsia="Times New Roman" w:hAnsi="Menlo" w:cs="Menlo"/>
+          <w:color w:val="D01040"/>
+          <w:kern w:val="0"/>
+          <w:sz w:val="20"/>
+          <w:szCs w:val="20"/>
+          <w:lang w:eastAsia="en-GB"/>
+          <w14:ligatures w14:val="none"/>
+        </w:rPr>
+        <w:t>golubEsets</w:t>
+      </w:r>
+      <w:proofErr w:type="spellEnd"/>
+      <w:r>
+        <w:rPr>
+          <w:rFonts w:ascii="Menlo" w:eastAsia="Times New Roman" w:hAnsi="Menlo" w:cs="Menlo"/>
+          <w:color w:val="D01040"/>
+          <w:kern w:val="0"/>
+          <w:sz w:val="20"/>
+          <w:szCs w:val="20"/>
+          <w:lang w:eastAsia="en-GB"/>
+          <w14:ligatures w14:val="none"/>
+        </w:rPr>
+        <w:t>"</w:t>
+      </w:r>
+      <w:r>
+        <w:rPr>
+          <w:rFonts w:ascii="Menlo" w:eastAsia="Times New Roman" w:hAnsi="Menlo" w:cs="Menlo"/>
+          <w:color w:val="000000"/>
+          <w:kern w:val="0"/>
+          <w:sz w:val="20"/>
+          <w:szCs w:val="20"/>
+          <w:lang w:eastAsia="en-GB"/>
+          <w14:ligatures w14:val="none"/>
+        </w:rPr>
+        <w:t>,</w:t>
+      </w:r>
+      <w:r>
+        <w:rPr>
+          <w:rFonts w:ascii="Menlo" w:eastAsia="Times New Roman" w:hAnsi="Menlo" w:cs="Menlo"/>
+          <w:color w:val="BBBBBB"/>
+          <w:kern w:val="0"/>
+          <w:sz w:val="20"/>
+          <w:szCs w:val="20"/>
+          <w:lang w:eastAsia="en-GB"/>
+          <w14:ligatures w14:val="none"/>
+        </w:rPr>
+        <w:t xml:space="preserve"> </w:t>
+      </w:r>
+      <w:r>
+        <w:rPr>
+          <w:rFonts w:ascii="Menlo" w:eastAsia="Times New Roman" w:hAnsi="Menlo" w:cs="Menlo"/>
+          <w:color w:val="D01040"/>
+          <w:kern w:val="0"/>
+          <w:sz w:val="20"/>
+          <w:szCs w:val="20"/>
+          <w:lang w:eastAsia="en-GB"/>
+          <w14:ligatures w14:val="none"/>
+        </w:rPr>
+        <w:t>"</w:t>
+      </w:r>
+      <w:proofErr w:type="spellStart"/>
+      <w:r>
+        <w:rPr>
+          <w:rFonts w:ascii="Menlo" w:eastAsia="Times New Roman" w:hAnsi="Menlo" w:cs="Menlo"/>
+          <w:color w:val="D01040"/>
+          <w:kern w:val="0"/>
+          <w:sz w:val="20"/>
+          <w:szCs w:val="20"/>
+          <w:lang w:eastAsia="en-GB"/>
+          <w14:ligatures w14:val="none"/>
+        </w:rPr>
+        <w:t>vsn</w:t>
+      </w:r>
+      <w:proofErr w:type="spellEnd"/>
+      <w:r>
+        <w:rPr>
+          <w:rFonts w:ascii="Menlo" w:eastAsia="Times New Roman" w:hAnsi="Menlo" w:cs="Menlo"/>
+          <w:color w:val="D01040"/>
+          <w:kern w:val="0"/>
+          <w:sz w:val="20"/>
+          <w:szCs w:val="20"/>
+          <w:lang w:eastAsia="en-GB"/>
+          <w14:ligatures w14:val="none"/>
+        </w:rPr>
+        <w:t>"</w:t>
+      </w:r>
+      <w:r>
+        <w:rPr>
+          <w:rFonts w:ascii="Menlo" w:eastAsia="Times New Roman" w:hAnsi="Menlo" w:cs="Menlo"/>
+          <w:color w:val="000000"/>
+          <w:kern w:val="0"/>
+          <w:sz w:val="20"/>
+          <w:szCs w:val="20"/>
+          <w:lang w:eastAsia="en-GB"/>
+          <w14:ligatures w14:val="none"/>
+        </w:rPr>
+        <w:t>,</w:t>
+      </w:r>
+      <w:r>
+        <w:rPr>
+          <w:rFonts w:ascii="Menlo" w:eastAsia="Times New Roman" w:hAnsi="Menlo" w:cs="Menlo"/>
+          <w:color w:val="BBBBBB"/>
+          <w:kern w:val="0"/>
+          <w:sz w:val="20"/>
+          <w:szCs w:val="20"/>
+          <w:lang w:eastAsia="en-GB"/>
+          <w14:ligatures w14:val="none"/>
+        </w:rPr>
+        <w:t xml:space="preserve"> </w:t>
+      </w:r>
+      <w:r>
+        <w:rPr>
+          <w:rFonts w:ascii="Menlo" w:eastAsia="Times New Roman" w:hAnsi="Menlo" w:cs="Menlo"/>
+          <w:color w:val="D01040"/>
+          <w:kern w:val="0"/>
+          <w:sz w:val="20"/>
+          <w:szCs w:val="20"/>
+          <w:lang w:eastAsia="en-GB"/>
+          <w14:ligatures w14:val="none"/>
+        </w:rPr>
+        <w:t>"hu6800.db"</w:t>
+      </w:r>
+      <w:r>
+        <w:rPr>
+          <w:rFonts w:ascii="Menlo" w:eastAsia="Times New Roman" w:hAnsi="Menlo" w:cs="Menlo"/>
+          <w:color w:val="000000"/>
+          <w:kern w:val="0"/>
+          <w:sz w:val="20"/>
+          <w:szCs w:val="20"/>
+          <w:lang w:eastAsia="en-GB"/>
+          <w14:ligatures w14:val="none"/>
+        </w:rPr>
+        <w:t>,</w:t>
+      </w:r>
+      <w:r>
+        <w:rPr>
+          <w:rFonts w:ascii="Menlo" w:eastAsia="Times New Roman" w:hAnsi="Menlo" w:cs="Menlo"/>
+          <w:color w:val="BBBBBB"/>
+          <w:kern w:val="0"/>
+          <w:sz w:val="20"/>
+          <w:szCs w:val="20"/>
+          <w:lang w:eastAsia="en-GB"/>
+          <w14:ligatures w14:val="none"/>
+        </w:rPr>
+        <w:t xml:space="preserve"> </w:t>
+      </w:r>
+      <w:r>
+        <w:rPr>
+          <w:rFonts w:ascii="Menlo" w:eastAsia="Times New Roman" w:hAnsi="Menlo" w:cs="Menlo"/>
+          <w:color w:val="D01040"/>
+          <w:kern w:val="0"/>
+          <w:sz w:val="20"/>
+          <w:szCs w:val="20"/>
+          <w:lang w:eastAsia="en-GB"/>
+          <w14:ligatures w14:val="none"/>
+        </w:rPr>
+        <w:t>"</w:t>
+      </w:r>
+      <w:proofErr w:type="spellStart"/>
+      <w:r>
+        <w:rPr>
+          <w:rFonts w:ascii="Menlo" w:eastAsia="Times New Roman" w:hAnsi="Menlo" w:cs="Menlo"/>
+          <w:color w:val="D01040"/>
+          <w:kern w:val="0"/>
+          <w:sz w:val="20"/>
+          <w:szCs w:val="20"/>
+          <w:lang w:eastAsia="en-GB"/>
+          <w14:ligatures w14:val="none"/>
+        </w:rPr>
+        <w:t>GO.db</w:t>
+      </w:r>
+      <w:proofErr w:type="spellEnd"/>
+      <w:r>
+        <w:rPr>
+          <w:rFonts w:ascii="Menlo" w:eastAsia="Times New Roman" w:hAnsi="Menlo" w:cs="Menlo"/>
+          <w:color w:val="D01040"/>
+          <w:kern w:val="0"/>
+          <w:sz w:val="20"/>
+          <w:szCs w:val="20"/>
+          <w:lang w:eastAsia="en-GB"/>
+          <w14:ligatures w14:val="none"/>
+        </w:rPr>
+        <w:t>"</w:t>
+      </w:r>
+      <w:r>
+        <w:rPr>
+          <w:rFonts w:ascii="Menlo" w:eastAsia="Times New Roman" w:hAnsi="Menlo" w:cs="Menlo"/>
+          <w:color w:val="000000"/>
+          <w:kern w:val="0"/>
+          <w:sz w:val="20"/>
+          <w:szCs w:val="20"/>
+          <w:lang w:eastAsia="en-GB"/>
+          <w14:ligatures w14:val="none"/>
+        </w:rPr>
+        <w:t>,</w:t>
+      </w:r>
+      <w:r>
+        <w:rPr>
+          <w:rFonts w:ascii="Menlo" w:eastAsia="Times New Roman" w:hAnsi="Menlo" w:cs="Menlo"/>
+          <w:color w:val="BBBBBB"/>
+          <w:kern w:val="0"/>
+          <w:sz w:val="20"/>
+          <w:szCs w:val="20"/>
+          <w:lang w:eastAsia="en-GB"/>
+          <w14:ligatures w14:val="none"/>
+        </w:rPr>
+        <w:t xml:space="preserve"> </w:t>
+      </w:r>
+      <w:r>
+        <w:rPr>
+          <w:rFonts w:ascii="Menlo" w:eastAsia="Times New Roman" w:hAnsi="Menlo" w:cs="Menlo"/>
+          <w:color w:val="D01040"/>
+          <w:kern w:val="0"/>
+          <w:sz w:val="20"/>
+          <w:szCs w:val="20"/>
+          <w:lang w:eastAsia="en-GB"/>
+          <w14:ligatures w14:val="none"/>
+        </w:rPr>
+        <w:t>"</w:t>
+      </w:r>
+      <w:proofErr w:type="spellStart"/>
+      <w:r>
+        <w:rPr>
+          <w:rFonts w:ascii="Menlo" w:eastAsia="Times New Roman" w:hAnsi="Menlo" w:cs="Menlo"/>
+          <w:color w:val="D01040"/>
+          <w:kern w:val="0"/>
+          <w:sz w:val="20"/>
+          <w:szCs w:val="20"/>
+          <w:lang w:eastAsia="en-GB"/>
+          <w14:ligatures w14:val="none"/>
+        </w:rPr>
+        <w:t>AnnotationDbi</w:t>
+      </w:r>
+      <w:proofErr w:type="spellEnd"/>
+      <w:r>
+        <w:rPr>
+          <w:rFonts w:ascii="Menlo" w:eastAsia="Times New Roman" w:hAnsi="Menlo" w:cs="Menlo"/>
+          <w:color w:val="D01040"/>
+          <w:kern w:val="0"/>
+          <w:sz w:val="20"/>
+          <w:szCs w:val="20"/>
+          <w:lang w:eastAsia="en-GB"/>
+          <w14:ligatures w14:val="none"/>
+        </w:rPr>
+        <w:t>"</w:t>
+      </w:r>
+      <w:r>
+        <w:rPr>
+          <w:rFonts w:ascii="Menlo" w:eastAsia="Times New Roman" w:hAnsi="Menlo" w:cs="Menlo"/>
+          <w:color w:val="000000"/>
+          <w:kern w:val="0"/>
+          <w:sz w:val="20"/>
+          <w:szCs w:val="20"/>
+          <w:lang w:eastAsia="en-GB"/>
+          <w14:ligatures w14:val="none"/>
+        </w:rPr>
+        <w:t>,</w:t>
+      </w:r>
+      <w:r>
+        <w:rPr>
+          <w:rFonts w:ascii="Menlo" w:eastAsia="Times New Roman" w:hAnsi="Menlo" w:cs="Menlo"/>
+          <w:color w:val="BBBBBB"/>
+          <w:kern w:val="0"/>
+          <w:sz w:val="20"/>
+          <w:szCs w:val="20"/>
+          <w:lang w:eastAsia="en-GB"/>
+          <w14:ligatures w14:val="none"/>
+        </w:rPr>
+        <w:t xml:space="preserve"> </w:t>
+      </w:r>
+      <w:r>
+        <w:rPr>
+          <w:rFonts w:ascii="Menlo" w:eastAsia="Times New Roman" w:hAnsi="Menlo" w:cs="Menlo"/>
+          <w:color w:val="D01040"/>
+          <w:kern w:val="0"/>
+          <w:sz w:val="20"/>
+          <w:szCs w:val="20"/>
+          <w:lang w:eastAsia="en-GB"/>
+          <w14:ligatures w14:val="none"/>
+        </w:rPr>
+        <w:t>"annotate"</w:t>
+      </w:r>
+      <w:r>
+        <w:rPr>
+          <w:rFonts w:ascii="Menlo" w:eastAsia="Times New Roman" w:hAnsi="Menlo" w:cs="Menlo"/>
+          <w:color w:val="000000"/>
+          <w:kern w:val="0"/>
+          <w:sz w:val="20"/>
+          <w:szCs w:val="20"/>
+          <w:lang w:eastAsia="en-GB"/>
+          <w14:ligatures w14:val="none"/>
+        </w:rPr>
+        <w:t>,</w:t>
+      </w:r>
+      <w:r>
+        <w:rPr>
+          <w:rFonts w:ascii="Menlo" w:eastAsia="Times New Roman" w:hAnsi="Menlo" w:cs="Menlo"/>
+          <w:color w:val="BBBBBB"/>
+          <w:kern w:val="0"/>
+          <w:sz w:val="20"/>
+          <w:szCs w:val="20"/>
+          <w:lang w:eastAsia="en-GB"/>
+          <w14:ligatures w14:val="none"/>
+        </w:rPr>
+        <w:t xml:space="preserve"> </w:t>
+      </w:r>
+      <w:r>
+        <w:rPr>
+          <w:rFonts w:ascii="Menlo" w:eastAsia="Times New Roman" w:hAnsi="Menlo" w:cs="Menlo"/>
+          <w:color w:val="D01040"/>
+          <w:kern w:val="0"/>
+          <w:sz w:val="20"/>
+          <w:szCs w:val="20"/>
+          <w:lang w:eastAsia="en-GB"/>
+          <w14:ligatures w14:val="none"/>
+        </w:rPr>
+        <w:t>"</w:t>
+      </w:r>
+      <w:proofErr w:type="spellStart"/>
+      <w:r>
+        <w:rPr>
+          <w:rFonts w:ascii="Menlo" w:eastAsia="Times New Roman" w:hAnsi="Menlo" w:cs="Menlo"/>
+          <w:color w:val="D01040"/>
+          <w:kern w:val="0"/>
+          <w:sz w:val="20"/>
+          <w:szCs w:val="20"/>
+          <w:lang w:eastAsia="en-GB"/>
+          <w14:ligatures w14:val="none"/>
+        </w:rPr>
+        <w:t>topGO</w:t>
+      </w:r>
+      <w:proofErr w:type="spellEnd"/>
+      <w:r>
+        <w:rPr>
+          <w:rFonts w:ascii="Menlo" w:eastAsia="Times New Roman" w:hAnsi="Menlo" w:cs="Menlo"/>
+          <w:color w:val="D01040"/>
+          <w:kern w:val="0"/>
+          <w:sz w:val="20"/>
+          <w:szCs w:val="20"/>
+          <w:lang w:eastAsia="en-GB"/>
+          <w14:ligatures w14:val="none"/>
+        </w:rPr>
+        <w:t>"</w:t>
+      </w:r>
+      <w:r>
+        <w:rPr>
+          <w:rFonts w:ascii="Menlo" w:eastAsia="Times New Roman" w:hAnsi="Menlo" w:cs="Menlo"/>
+          <w:color w:val="000000"/>
+          <w:kern w:val="0"/>
+          <w:sz w:val="20"/>
+          <w:szCs w:val="20"/>
+          <w:lang w:eastAsia="en-GB"/>
+          <w14:ligatures w14:val="none"/>
+        </w:rPr>
+        <w:t>,</w:t>
+      </w:r>
+      <w:r>
+        <w:rPr>
+          <w:rFonts w:ascii="Menlo" w:eastAsia="Times New Roman" w:hAnsi="Menlo" w:cs="Menlo"/>
+          <w:color w:val="BBBBBB"/>
+          <w:kern w:val="0"/>
+          <w:sz w:val="20"/>
+          <w:szCs w:val="20"/>
+          <w:lang w:eastAsia="en-GB"/>
+          <w14:ligatures w14:val="none"/>
+        </w:rPr>
+        <w:t xml:space="preserve"> </w:t>
+      </w:r>
+      <w:r>
+        <w:rPr>
+          <w:rFonts w:ascii="Menlo" w:eastAsia="Times New Roman" w:hAnsi="Menlo" w:cs="Menlo"/>
+          <w:color w:val="D01040"/>
+          <w:kern w:val="0"/>
+          <w:sz w:val="20"/>
+          <w:szCs w:val="20"/>
+          <w:lang w:eastAsia="en-GB"/>
+          <w14:ligatures w14:val="none"/>
+        </w:rPr>
+        <w:t>"ALL"</w:t>
+      </w:r>
+      <w:r>
+        <w:rPr>
+          <w:rFonts w:ascii="Menlo" w:eastAsia="Times New Roman" w:hAnsi="Menlo" w:cs="Menlo"/>
+          <w:color w:val="000000"/>
+          <w:kern w:val="0"/>
+          <w:sz w:val="20"/>
+          <w:szCs w:val="20"/>
+          <w:lang w:eastAsia="en-GB"/>
+          <w14:ligatures w14:val="none"/>
+        </w:rPr>
+        <w:t>,</w:t>
+      </w:r>
+      <w:r>
+        <w:rPr>
+          <w:rFonts w:ascii="Menlo" w:eastAsia="Times New Roman" w:hAnsi="Menlo" w:cs="Menlo"/>
+          <w:color w:val="BBBBBB"/>
+          <w:kern w:val="0"/>
+          <w:sz w:val="20"/>
+          <w:szCs w:val="20"/>
+          <w:lang w:eastAsia="en-GB"/>
+          <w14:ligatures w14:val="none"/>
+        </w:rPr>
+        <w:t xml:space="preserve"> </w:t>
+      </w:r>
+      <w:r>
+        <w:rPr>
+          <w:rFonts w:ascii="Menlo" w:eastAsia="Times New Roman" w:hAnsi="Menlo" w:cs="Menlo"/>
+          <w:color w:val="D01040"/>
+          <w:kern w:val="0"/>
+          <w:sz w:val="20"/>
+          <w:szCs w:val="20"/>
+          <w:lang w:eastAsia="en-GB"/>
+          <w14:ligatures w14:val="none"/>
+        </w:rPr>
+        <w:t>"</w:t>
+      </w:r>
+      <w:proofErr w:type="spellStart"/>
+      <w:r>
+        <w:rPr>
+          <w:rFonts w:ascii="Menlo" w:eastAsia="Times New Roman" w:hAnsi="Menlo" w:cs="Menlo"/>
+          <w:color w:val="D01040"/>
+          <w:kern w:val="0"/>
+          <w:sz w:val="20"/>
+          <w:szCs w:val="20"/>
+          <w:lang w:eastAsia="en-GB"/>
+          <w14:ligatures w14:val="none"/>
+        </w:rPr>
+        <w:t>Biobase</w:t>
+      </w:r>
+      <w:proofErr w:type="spellEnd"/>
+      <w:r>
+        <w:rPr>
+          <w:rFonts w:ascii="Menlo" w:eastAsia="Times New Roman" w:hAnsi="Menlo" w:cs="Menlo"/>
+          <w:color w:val="D01040"/>
+          <w:kern w:val="0"/>
+          <w:sz w:val="20"/>
+          <w:szCs w:val="20"/>
+          <w:lang w:eastAsia="en-GB"/>
+          <w14:ligatures w14:val="none"/>
+        </w:rPr>
+        <w:t>"</w:t>
+      </w:r>
+      <w:r>
+        <w:rPr>
+          <w:rFonts w:ascii="Menlo" w:eastAsia="Times New Roman" w:hAnsi="Menlo" w:cs="Menlo"/>
+          <w:color w:val="000000"/>
+          <w:kern w:val="0"/>
+          <w:sz w:val="20"/>
+          <w:szCs w:val="20"/>
+          <w:lang w:eastAsia="en-GB"/>
+          <w14:ligatures w14:val="none"/>
+        </w:rPr>
+        <w:t>,</w:t>
+      </w:r>
+      <w:r>
+        <w:rPr>
+          <w:rFonts w:ascii="Menlo" w:eastAsia="Times New Roman" w:hAnsi="Menlo" w:cs="Menlo"/>
+          <w:color w:val="BBBBBB"/>
+          <w:kern w:val="0"/>
+          <w:sz w:val="20"/>
+          <w:szCs w:val="20"/>
+          <w:lang w:eastAsia="en-GB"/>
+          <w14:ligatures w14:val="none"/>
+        </w:rPr>
+        <w:t xml:space="preserve"> </w:t>
+      </w:r>
+      <w:r>
+        <w:rPr>
+          <w:rFonts w:ascii="Menlo" w:eastAsia="Times New Roman" w:hAnsi="Menlo" w:cs="Menlo"/>
+          <w:color w:val="D01040"/>
+          <w:kern w:val="0"/>
+          <w:sz w:val="20"/>
+          <w:szCs w:val="20"/>
+          <w:lang w:eastAsia="en-GB"/>
+          <w14:ligatures w14:val="none"/>
+        </w:rPr>
+        <w:t>"</w:t>
+      </w:r>
+      <w:proofErr w:type="spellStart"/>
+      <w:r>
+        <w:rPr>
+          <w:rFonts w:ascii="Menlo" w:eastAsia="Times New Roman" w:hAnsi="Menlo" w:cs="Menlo"/>
+          <w:color w:val="D01040"/>
+          <w:kern w:val="0"/>
+          <w:sz w:val="20"/>
+          <w:szCs w:val="20"/>
+          <w:lang w:eastAsia="en-GB"/>
+          <w14:ligatures w14:val="none"/>
+        </w:rPr>
+        <w:t>limma</w:t>
+      </w:r>
+      <w:proofErr w:type="spellEnd"/>
+      <w:r>
+        <w:rPr>
+          <w:rFonts w:ascii="Menlo" w:eastAsia="Times New Roman" w:hAnsi="Menlo" w:cs="Menlo"/>
+          <w:color w:val="D01040"/>
+          <w:kern w:val="0"/>
+          <w:sz w:val="20"/>
+          <w:szCs w:val="20"/>
+          <w:lang w:eastAsia="en-GB"/>
+          <w14:ligatures w14:val="none"/>
+        </w:rPr>
+        <w:t>"</w:t>
+      </w:r>
+      <w:r>
+        <w:rPr>
+          <w:rFonts w:ascii="Menlo" w:eastAsia="Times New Roman" w:hAnsi="Menlo" w:cs="Menlo"/>
+          <w:color w:val="000000"/>
+          <w:kern w:val="0"/>
+          <w:sz w:val="20"/>
+          <w:szCs w:val="20"/>
+          <w:lang w:eastAsia="en-GB"/>
+          <w14:ligatures w14:val="none"/>
+        </w:rPr>
+        <w:t>))</w:t>
+      </w:r>
+      <w:r>
+        <w:rPr>
+          <w:rFonts w:ascii="Menlo" w:eastAsia="Times New Roman" w:hAnsi="Menlo" w:cs="Menlo"/>
+          <w:color w:val="BBBBBB"/>
+          <w:kern w:val="0"/>
+          <w:sz w:val="20"/>
+          <w:szCs w:val="20"/>
+          <w:lang w:eastAsia="en-GB"/>
+          <w14:ligatures w14:val="none"/>
+        </w:rPr>
+        <w:t xml:space="preserve">  </w:t>
+      </w:r>
+    </w:p>
+    <w:p>
+      <w:pPr>
+        <w:pStyle w:val="ListParagraph"/>
+        <w:ind w:left="1440"/>
+      </w:pPr>
+      <w:r>
+        <w:sym w:font="Wingdings" w:char="F0E0"/>
+      </w:r>
+      <w:r>
+        <w:t xml:space="preserve"> could use this to install multiple packages at once?</w:t>
+      </w:r>
+    </w:p>
+    <w:p>
+      <w:pPr>
+        <w:pStyle w:val="ListParagraph"/>
+        <w:numPr>
+          <w:ilvl w:val="0"/>
+          <w:numId w:val="1"/>
+        </w:numPr>
       </w:pPr>
       <w:r>
         <w:t>Normalisation method is discussion point</w:t>
@@ -769,6 +1556,7 @@
         <w:rPr>
           <w:noProof/>
         </w:rPr>
+        <w:lastRenderedPageBreak/>
         <w:drawing>
           <wp:inline distT="0" distB="0" distL="0" distR="0" wp14:anchorId="67F6F1FD" wp14:editId="63B20F00">
             <wp:extent cx="5731510" cy="2835910"/>
@@ -1054,6 +1842,7 @@
           <w:b/>
           <w:bCs/>
         </w:rPr>
+        <w:lastRenderedPageBreak/>
         <w:t>Data Observations</w:t>
       </w:r>
     </w:p>
@@ -1236,7 +2025,6 @@
         <w:rPr>
           <w:noProof/>
         </w:rPr>
-        <w:lastRenderedPageBreak/>
         <w:drawing>
           <wp:inline distT="0" distB="0" distL="0" distR="0" wp14:anchorId="2CEE12F4" wp14:editId="0C07CE5A">
             <wp:extent cx="5181600" cy="1094761"/>
@@ -2888,6 +3676,90 @@
       <w:u w:val="single"/>
     </w:rPr>
   </w:style>
+  <w:style w:type="paragraph" w:styleId="HTMLPreformatted">
+    <w:name w:val="HTML Preformatted"/>
+    <w:basedOn w:val="Normal"/>
+    <w:link w:val="HTMLPreformattedChar"/>
+    <w:uiPriority w:val="99"/>
+    <w:semiHidden/>
+    <w:unhideWhenUsed/>
+    <w:rsid w:val="00786A75"/>
+    <w:pPr>
+      <w:tabs>
+        <w:tab w:val="left" w:pos="916"/>
+        <w:tab w:val="left" w:pos="1832"/>
+        <w:tab w:val="left" w:pos="2748"/>
+        <w:tab w:val="left" w:pos="3664"/>
+        <w:tab w:val="left" w:pos="4580"/>
+        <w:tab w:val="left" w:pos="5496"/>
+        <w:tab w:val="left" w:pos="6412"/>
+        <w:tab w:val="left" w:pos="7328"/>
+        <w:tab w:val="left" w:pos="8244"/>
+        <w:tab w:val="left" w:pos="9160"/>
+        <w:tab w:val="left" w:pos="10076"/>
+        <w:tab w:val="left" w:pos="10992"/>
+        <w:tab w:val="left" w:pos="11908"/>
+        <w:tab w:val="left" w:pos="12824"/>
+        <w:tab w:val="left" w:pos="13740"/>
+        <w:tab w:val="left" w:pos="14656"/>
+      </w:tabs>
+      <w:spacing w:after="0" w:line="240" w:lineRule="auto"/>
+    </w:pPr>
+    <w:rPr>
+      <w:rFonts w:ascii="Courier New" w:eastAsia="Times New Roman" w:hAnsi="Courier New" w:cs="Courier New"/>
+      <w:kern w:val="0"/>
+      <w:sz w:val="20"/>
+      <w:szCs w:val="20"/>
+      <w:lang w:eastAsia="en-GB"/>
+      <w14:ligatures w14:val="none"/>
+    </w:rPr>
+  </w:style>
+  <w:style w:type="character" w:customStyle="1" w:styleId="HTMLPreformattedChar">
+    <w:name w:val="HTML Preformatted Char"/>
+    <w:basedOn w:val="DefaultParagraphFont"/>
+    <w:link w:val="HTMLPreformatted"/>
+    <w:uiPriority w:val="99"/>
+    <w:semiHidden/>
+    <w:rsid w:val="00786A75"/>
+    <w:rPr>
+      <w:rFonts w:ascii="Courier New" w:eastAsia="Times New Roman" w:hAnsi="Courier New" w:cs="Courier New"/>
+      <w:kern w:val="0"/>
+      <w:sz w:val="20"/>
+      <w:szCs w:val="20"/>
+      <w:lang w:eastAsia="en-GB"/>
+      <w14:ligatures w14:val="none"/>
+    </w:rPr>
+  </w:style>
+  <w:style w:type="character" w:customStyle="1" w:styleId="n">
+    <w:name w:val="n"/>
+    <w:basedOn w:val="DefaultParagraphFont"/>
+    <w:rsid w:val="00786A75"/>
+  </w:style>
+  <w:style w:type="character" w:customStyle="1" w:styleId="o">
+    <w:name w:val="o"/>
+    <w:basedOn w:val="DefaultParagraphFont"/>
+    <w:rsid w:val="00786A75"/>
+  </w:style>
+  <w:style w:type="character" w:customStyle="1" w:styleId="p">
+    <w:name w:val="p"/>
+    <w:basedOn w:val="DefaultParagraphFont"/>
+    <w:rsid w:val="00786A75"/>
+  </w:style>
+  <w:style w:type="character" w:customStyle="1" w:styleId="nf">
+    <w:name w:val="nf"/>
+    <w:basedOn w:val="DefaultParagraphFont"/>
+    <w:rsid w:val="00786A75"/>
+  </w:style>
+  <w:style w:type="character" w:customStyle="1" w:styleId="s2">
+    <w:name w:val="s2"/>
+    <w:basedOn w:val="DefaultParagraphFont"/>
+    <w:rsid w:val="00786A75"/>
+  </w:style>
+  <w:style w:type="character" w:customStyle="1" w:styleId="w">
+    <w:name w:val="w"/>
+    <w:basedOn w:val="DefaultParagraphFont"/>
+    <w:rsid w:val="00786A75"/>
+  </w:style>
 </w:styles>
 </file>
 

</xml_diff>

<commit_message>
ADDING TODAY'S WORK - 02.06.2026
</commit_message>
<xml_diff>
--- a/resources/Notes - Individual Research Project.docx
+++ b/resources/Notes - Individual Research Project.docx
@@ -1825,6 +1825,45 @@
     </w:p>
     <w:p>
       <w:pPr>
+        <w:pStyle w:val="ListParagraph"/>
+        <w:numPr>
+          <w:ilvl w:val="0"/>
+          <w:numId w:val="1"/>
+        </w:numPr>
+      </w:pPr>
+      <w:r>
+        <w:t xml:space="preserve">Use </w:t>
+      </w:r>
+      <w:proofErr w:type="spellStart"/>
+      <w:r>
+        <w:t>plotly</w:t>
+      </w:r>
+      <w:proofErr w:type="spellEnd"/>
+      <w:r>
+        <w:t xml:space="preserve"> in r for interactive plots. See for details </w:t>
+      </w:r>
+      <w:r>
+        <w:sym w:font="Wingdings" w:char="F0E0"/>
+      </w:r>
+      <w:r>
+        <w:t xml:space="preserve"> </w:t>
+      </w:r>
+      <w:hyperlink r:id="rId20" w:history="1">
+        <w:r>
+          <w:rPr>
+            <w:rStyle w:val="Hyperlink"/>
+          </w:rPr>
+          <w:t>https://github.com/tamirna/miND/blob/main/scripts/report.Rmd</w:t>
+        </w:r>
+      </w:hyperlink>
+    </w:p>
+    <w:p>
+      <w:pPr>
+        <w:pStyle w:val="ListParagraph"/>
+      </w:pPr>
+    </w:p>
+    <w:p>
+      <w:pPr>
         <w:rPr>
           <w:b/>
           <w:bCs/>
@@ -1845,7 +1884,6 @@
           <w:b/>
           <w:bCs/>
         </w:rPr>
-        <w:lastRenderedPageBreak/>
         <w:t>Data Observations</w:t>
       </w:r>
     </w:p>
@@ -2044,7 +2082,7 @@
                     <pic:cNvPicPr/>
                   </pic:nvPicPr>
                   <pic:blipFill>
-                    <a:blip r:embed="rId20"/>
+                    <a:blip r:embed="rId21"/>
                     <a:stretch>
                       <a:fillRect/>
                     </a:stretch>
@@ -2119,7 +2157,7 @@
                     <pic:cNvPicPr/>
                   </pic:nvPicPr>
                   <pic:blipFill>
-                    <a:blip r:embed="rId21"/>
+                    <a:blip r:embed="rId22"/>
                     <a:stretch>
                       <a:fillRect/>
                     </a:stretch>
@@ -2152,8 +2190,369 @@
     <w:p/>
     <w:p>
       <w:pPr>
-        <w:pStyle w:val="ListParagraph"/>
-        <w:ind w:left="2160"/>
+        <w:rPr>
+          <w:b/>
+          <w:bCs/>
+        </w:rPr>
+      </w:pPr>
+      <w:r>
+        <w:rPr>
+          <w:b/>
+          <w:bCs/>
+        </w:rPr>
+        <w:t>UoN Analysis Notes</w:t>
+      </w:r>
+    </w:p>
+    <w:p>
+      <w:pPr>
+        <w:pStyle w:val="ListParagraph"/>
+        <w:numPr>
+          <w:ilvl w:val="0"/>
+          <w:numId w:val="6"/>
+        </w:numPr>
+      </w:pPr>
+      <w:r>
+        <w:t>These notes were shared by GH, HJ or LF</w:t>
+      </w:r>
+    </w:p>
+    <w:p>
+      <w:pPr>
+        <w:pStyle w:val="ListParagraph"/>
+        <w:numPr>
+          <w:ilvl w:val="0"/>
+          <w:numId w:val="7"/>
+        </w:numPr>
+      </w:pPr>
+      <w:r>
+        <w:rPr>
+          <w:b/>
+          <w:bCs/>
+        </w:rPr>
+        <w:lastRenderedPageBreak/>
+        <w:t xml:space="preserve">Extract from project pt1 paper </w:t>
+      </w:r>
+      <w:r>
+        <w:rPr>
+          <w:b/>
+          <w:bCs/>
+        </w:rPr>
+        <w:sym w:font="Wingdings" w:char="F0E0"/>
+      </w:r>
+      <w:r>
+        <w:rPr>
+          <w:b/>
+          <w:bCs/>
+        </w:rPr>
+        <w:t xml:space="preserve"> </w:t>
+      </w:r>
+      <w:r>
+        <w:t xml:space="preserve">Next-generation sequencing (NGS) data was analysed using the </w:t>
+      </w:r>
+      <w:proofErr w:type="spellStart"/>
+      <w:r>
+        <w:t>miND</w:t>
+      </w:r>
+      <w:proofErr w:type="spellEnd"/>
+      <w:r>
+        <w:t xml:space="preserve">® analysis pipeline (20). The resulting differentially expressed miRNAs were investigated using Qiagen Ingenuity Pathway Software. This analysis used MicroRNA Target Filter to identify the gene targets of the differentially expressed miRNAs, genes were selected based on experimental evidence from </w:t>
+      </w:r>
+      <w:proofErr w:type="spellStart"/>
+      <w:r>
+        <w:t>TargetScan</w:t>
+      </w:r>
+      <w:proofErr w:type="spellEnd"/>
+      <w:r>
+        <w:t xml:space="preserve">. </w:t>
+      </w:r>
+      <w:proofErr w:type="spellStart"/>
+      <w:r>
+        <w:t>TarBase</w:t>
+      </w:r>
+      <w:proofErr w:type="spellEnd"/>
+      <w:r>
+        <w:t xml:space="preserve">, </w:t>
+      </w:r>
+      <w:proofErr w:type="spellStart"/>
+      <w:r>
+        <w:t>miRecords</w:t>
+      </w:r>
+      <w:proofErr w:type="spellEnd"/>
+      <w:r>
+        <w:t xml:space="preserve"> and Ingenuity Knowledge Base. The miRNA-gene pairings were matched based on the directionality of the miRNA abundance and used to perform pathway enrichment analysis.</w:t>
+      </w:r>
+    </w:p>
+    <w:p>
+      <w:pPr>
+        <w:pStyle w:val="ListParagraph"/>
+      </w:pPr>
+    </w:p>
+    <w:p>
+      <w:pPr>
+        <w:pStyle w:val="ListParagraph"/>
+      </w:pPr>
+    </w:p>
+    <w:p>
+      <w:pPr>
+        <w:pStyle w:val="ListParagraph"/>
+        <w:numPr>
+          <w:ilvl w:val="0"/>
+          <w:numId w:val="7"/>
+        </w:numPr>
+      </w:pPr>
+      <w:r>
+        <w:rPr>
+          <w:b/>
+          <w:bCs/>
+        </w:rPr>
+        <w:t xml:space="preserve">Email from Vicky R.E. pathway analysis </w:t>
+      </w:r>
+      <w:r>
+        <w:rPr>
+          <w:b/>
+          <w:bCs/>
+        </w:rPr>
+        <w:sym w:font="Wingdings" w:char="F0E0"/>
+      </w:r>
+      <w:r>
+        <w:rPr>
+          <w:b/>
+          <w:bCs/>
+        </w:rPr>
+        <w:t xml:space="preserve"> </w:t>
+      </w:r>
+      <w:r>
+        <w:t>Vicky James:</w:t>
+      </w:r>
+      <w:r>
+        <w:br/>
+      </w:r>
+      <w:r>
+        <w:br/>
+      </w:r>
+      <w:r>
+        <w:t>I’ve completed</w:t>
+      </w:r>
+      <w:r>
+        <w:t xml:space="preserve"> the analysis on your first miRNA dataset (this is not the one normalised to EV counts). </w:t>
+      </w:r>
+      <w:r>
+        <w:br/>
+        <w:t>What I’ve done:</w:t>
+      </w:r>
+      <w:r>
+        <w:br/>
+        <w:t>Identified all the genes that have been experimentally validated to be mRNA targets of those miRNAs in your list (File: miRNA Target Finder Output)</w:t>
+      </w:r>
+      <w:r>
+        <w:br/>
+        <w:t>Used gene enrichment to identify the canonical pathways these mRNA target genes fall into. This is displayed by category as a bubble plot (jpg), I have also outputted each canonical pathway for each dot on the bubble blot so that you can see what they are (File: Bubble plot categories).</w:t>
+      </w:r>
+      <w:r>
+        <w:br/>
+        <w:t>I had a look at a couple of the significant interesting ones and have included the Kegg pathways for Interleukin 4 and 13 signalling and S100 signalling. The genes with a pink/purple ring around them are the genes targeted by your miRNAs.</w:t>
+      </w:r>
+    </w:p>
+    <w:p>
+      <w:pPr>
+        <w:pStyle w:val="ListParagraph"/>
+      </w:pPr>
+    </w:p>
+    <w:p>
+      <w:pPr>
+        <w:pStyle w:val="ListParagraph"/>
+      </w:pPr>
+    </w:p>
+    <w:p>
+      <w:pPr>
+        <w:pStyle w:val="ListParagraph"/>
+        <w:numPr>
+          <w:ilvl w:val="0"/>
+          <w:numId w:val="7"/>
+        </w:numPr>
+      </w:pPr>
+      <w:r>
+        <w:rPr>
+          <w:b/>
+          <w:bCs/>
+        </w:rPr>
+        <w:t xml:space="preserve">Potential open-source pipelines for pathway analysis </w:t>
+      </w:r>
+      <w:r>
+        <w:rPr>
+          <w:b/>
+          <w:bCs/>
+        </w:rPr>
+        <w:sym w:font="Wingdings" w:char="F0E0"/>
+      </w:r>
+      <w:r>
+        <w:rPr>
+          <w:b/>
+          <w:bCs/>
+        </w:rPr>
+        <w:t xml:space="preserve"> </w:t>
+      </w:r>
+      <w:r>
+        <w:t>If you are looking for free, open-source alternatives or pipelines related to miRNA target finding on GitHub, consider the following repositories:</w:t>
+      </w:r>
+    </w:p>
+    <w:p>
+      <w:pPr>
+        <w:pStyle w:val="ListParagraph"/>
+        <w:numPr>
+          <w:ilvl w:val="1"/>
+          <w:numId w:val="7"/>
+        </w:numPr>
+      </w:pPr>
+      <w:proofErr w:type="spellStart"/>
+      <w:r>
+        <w:t>TargetFinder</w:t>
+      </w:r>
+      <w:proofErr w:type="spellEnd"/>
+      <w:r>
+        <w:t>: A widely used command-line tool designed by the Carrington Lab to computationally predict small RNA binding sites on target transcripts.</w:t>
+      </w:r>
+    </w:p>
+    <w:p>
+      <w:pPr>
+        <w:pStyle w:val="ListParagraph"/>
+        <w:numPr>
+          <w:ilvl w:val="1"/>
+          <w:numId w:val="7"/>
+        </w:numPr>
+      </w:pPr>
+      <w:proofErr w:type="spellStart"/>
+      <w:r>
+        <w:t>MiRNATarget</w:t>
+      </w:r>
+      <w:proofErr w:type="spellEnd"/>
+      <w:r>
+        <w:t xml:space="preserve">: A command-line wrapper for the </w:t>
+      </w:r>
+      <w:proofErr w:type="spellStart"/>
+      <w:r>
+        <w:t>psRNATarget</w:t>
+      </w:r>
+      <w:proofErr w:type="spellEnd"/>
+      <w:r>
+        <w:t xml:space="preserve"> workflow that identifies potential miRNA target locations across a genome.</w:t>
+      </w:r>
+    </w:p>
+    <w:p>
+      <w:pPr>
+        <w:pStyle w:val="ListParagraph"/>
+        <w:numPr>
+          <w:ilvl w:val="1"/>
+          <w:numId w:val="7"/>
+        </w:numPr>
+      </w:pPr>
+      <w:proofErr w:type="spellStart"/>
+      <w:r>
+        <w:t>miRTarget</w:t>
+      </w:r>
+      <w:proofErr w:type="spellEnd"/>
+      <w:r>
+        <w:t>: A package that pulls predicted miRNA targets by aggregating results across multiple established databases. [1, 2, 3, 4, 5]</w:t>
+      </w:r>
+    </w:p>
+    <w:p>
+      <w:pPr>
+        <w:pStyle w:val="ListParagraph"/>
+      </w:pPr>
+      <w:r>
+        <w:t xml:space="preserve"> </w:t>
+      </w:r>
+    </w:p>
+    <w:p>
+      <w:pPr>
+        <w:pStyle w:val="ListParagraph"/>
+      </w:pPr>
+      <w:r>
+        <w:t xml:space="preserve">GitHub - </w:t>
+      </w:r>
+      <w:proofErr w:type="spellStart"/>
+      <w:r>
+        <w:t>jtremblay</w:t>
+      </w:r>
+      <w:proofErr w:type="spellEnd"/>
+      <w:r>
+        <w:t>/</w:t>
+      </w:r>
+      <w:proofErr w:type="spellStart"/>
+      <w:r>
+        <w:t>MiRNATarget</w:t>
+      </w:r>
+      <w:proofErr w:type="spellEnd"/>
+      <w:r>
+        <w:t xml:space="preserve">: A command line version of the </w:t>
+      </w:r>
+      <w:proofErr w:type="spellStart"/>
+      <w:r>
+        <w:t>psRNATarget</w:t>
+      </w:r>
+      <w:proofErr w:type="spellEnd"/>
+      <w:r>
+        <w:t xml:space="preserve"> workflow that predicts potential miRNA target locations on a genome.</w:t>
+      </w:r>
+    </w:p>
+    <w:p>
+      <w:pPr>
+        <w:pStyle w:val="ListParagraph"/>
+      </w:pPr>
+      <w:r>
+        <w:t xml:space="preserve">A command line version of the </w:t>
+      </w:r>
+      <w:proofErr w:type="spellStart"/>
+      <w:r>
+        <w:t>psRNATarget</w:t>
+      </w:r>
+      <w:proofErr w:type="spellEnd"/>
+      <w:r>
+        <w:t xml:space="preserve"> workflow that predicts potential miRNA target locations on a genome. - </w:t>
+      </w:r>
+      <w:proofErr w:type="spellStart"/>
+      <w:r>
+        <w:t>jtremblay</w:t>
+      </w:r>
+      <w:proofErr w:type="spellEnd"/>
+      <w:r>
+        <w:t>/</w:t>
+      </w:r>
+      <w:proofErr w:type="spellStart"/>
+      <w:r>
+        <w:t>MiRNATarget</w:t>
+      </w:r>
+      <w:proofErr w:type="spellEnd"/>
+    </w:p>
+    <w:p>
+      <w:pPr>
+        <w:pStyle w:val="ListParagraph"/>
+      </w:pPr>
+      <w:r>
+        <w:lastRenderedPageBreak/>
+        <w:t xml:space="preserve"> </w:t>
+      </w:r>
+    </w:p>
+    <w:p>
+      <w:pPr>
+        <w:pStyle w:val="ListParagraph"/>
+      </w:pPr>
+      <w:hyperlink r:id="rId23" w:history="1">
+        <w:r>
+          <w:rPr>
+            <w:rStyle w:val="Hyperlink"/>
+          </w:rPr>
+          <w:t>https://github.com/Bart-Edelbroek/miRNA-targetfinder</w:t>
+        </w:r>
+      </w:hyperlink>
+    </w:p>
+    <w:p>
+      <w:pPr>
+        <w:pStyle w:val="ListParagraph"/>
+      </w:pPr>
+    </w:p>
+    <w:p>
+      <w:pPr>
+        <w:pStyle w:val="ListParagraph"/>
       </w:pPr>
     </w:p>
     <w:sectPr>
@@ -2282,6 +2681,119 @@
     </w:lvl>
   </w:abstractNum>
   <w:abstractNum w:abstractNumId="1" w15:restartNumberingAfterBreak="0">
+    <w:nsid w:val="22B531EC"/>
+    <w:multiLevelType w:val="hybridMultilevel"/>
+    <w:tmpl w:val="F5F43330"/>
+    <w:lvl w:ilvl="0" w:tplc="08090001">
+      <w:start w:val="1"/>
+      <w:numFmt w:val="bullet"/>
+      <w:lvlText w:val=""/>
+      <w:lvlJc w:val="left"/>
+      <w:pPr>
+        <w:ind w:left="720" w:hanging="360"/>
+      </w:pPr>
+      <w:rPr>
+        <w:rFonts w:ascii="Symbol" w:hAnsi="Symbol" w:hint="default"/>
+      </w:rPr>
+    </w:lvl>
+    <w:lvl w:ilvl="1" w:tplc="08090003" w:tentative="1">
+      <w:start w:val="1"/>
+      <w:numFmt w:val="bullet"/>
+      <w:lvlText w:val="o"/>
+      <w:lvlJc w:val="left"/>
+      <w:pPr>
+        <w:ind w:left="1440" w:hanging="360"/>
+      </w:pPr>
+      <w:rPr>
+        <w:rFonts w:ascii="Courier New" w:hAnsi="Courier New" w:hint="default"/>
+      </w:rPr>
+    </w:lvl>
+    <w:lvl w:ilvl="2" w:tplc="08090005" w:tentative="1">
+      <w:start w:val="1"/>
+      <w:numFmt w:val="bullet"/>
+      <w:lvlText w:val=""/>
+      <w:lvlJc w:val="left"/>
+      <w:pPr>
+        <w:ind w:left="2160" w:hanging="360"/>
+      </w:pPr>
+      <w:rPr>
+        <w:rFonts w:ascii="Wingdings" w:hAnsi="Wingdings" w:hint="default"/>
+      </w:rPr>
+    </w:lvl>
+    <w:lvl w:ilvl="3" w:tplc="08090001" w:tentative="1">
+      <w:start w:val="1"/>
+      <w:numFmt w:val="bullet"/>
+      <w:lvlText w:val=""/>
+      <w:lvlJc w:val="left"/>
+      <w:pPr>
+        <w:ind w:left="2880" w:hanging="360"/>
+      </w:pPr>
+      <w:rPr>
+        <w:rFonts w:ascii="Symbol" w:hAnsi="Symbol" w:hint="default"/>
+      </w:rPr>
+    </w:lvl>
+    <w:lvl w:ilvl="4" w:tplc="08090003" w:tentative="1">
+      <w:start w:val="1"/>
+      <w:numFmt w:val="bullet"/>
+      <w:lvlText w:val="o"/>
+      <w:lvlJc w:val="left"/>
+      <w:pPr>
+        <w:ind w:left="3600" w:hanging="360"/>
+      </w:pPr>
+      <w:rPr>
+        <w:rFonts w:ascii="Courier New" w:hAnsi="Courier New" w:hint="default"/>
+      </w:rPr>
+    </w:lvl>
+    <w:lvl w:ilvl="5" w:tplc="08090005" w:tentative="1">
+      <w:start w:val="1"/>
+      <w:numFmt w:val="bullet"/>
+      <w:lvlText w:val=""/>
+      <w:lvlJc w:val="left"/>
+      <w:pPr>
+        <w:ind w:left="4320" w:hanging="360"/>
+      </w:pPr>
+      <w:rPr>
+        <w:rFonts w:ascii="Wingdings" w:hAnsi="Wingdings" w:hint="default"/>
+      </w:rPr>
+    </w:lvl>
+    <w:lvl w:ilvl="6" w:tplc="08090001" w:tentative="1">
+      <w:start w:val="1"/>
+      <w:numFmt w:val="bullet"/>
+      <w:lvlText w:val=""/>
+      <w:lvlJc w:val="left"/>
+      <w:pPr>
+        <w:ind w:left="5040" w:hanging="360"/>
+      </w:pPr>
+      <w:rPr>
+        <w:rFonts w:ascii="Symbol" w:hAnsi="Symbol" w:hint="default"/>
+      </w:rPr>
+    </w:lvl>
+    <w:lvl w:ilvl="7" w:tplc="08090003" w:tentative="1">
+      <w:start w:val="1"/>
+      <w:numFmt w:val="bullet"/>
+      <w:lvlText w:val="o"/>
+      <w:lvlJc w:val="left"/>
+      <w:pPr>
+        <w:ind w:left="5760" w:hanging="360"/>
+      </w:pPr>
+      <w:rPr>
+        <w:rFonts w:ascii="Courier New" w:hAnsi="Courier New" w:hint="default"/>
+      </w:rPr>
+    </w:lvl>
+    <w:lvl w:ilvl="8" w:tplc="08090005" w:tentative="1">
+      <w:start w:val="1"/>
+      <w:numFmt w:val="bullet"/>
+      <w:lvlText w:val=""/>
+      <w:lvlJc w:val="left"/>
+      <w:pPr>
+        <w:ind w:left="6480" w:hanging="360"/>
+      </w:pPr>
+      <w:rPr>
+        <w:rFonts w:ascii="Wingdings" w:hAnsi="Wingdings" w:hint="default"/>
+      </w:rPr>
+    </w:lvl>
+  </w:abstractNum>
+  <w:abstractNum w:abstractNumId="2" w15:restartNumberingAfterBreak="0">
     <w:nsid w:val="33226CEC"/>
     <w:multiLevelType w:val="hybridMultilevel"/>
     <w:tmpl w:val="42423388"/>
@@ -2394,7 +2906,7 @@
       </w:rPr>
     </w:lvl>
   </w:abstractNum>
-  <w:abstractNum w:abstractNumId="2" w15:restartNumberingAfterBreak="0">
+  <w:abstractNum w:abstractNumId="3" w15:restartNumberingAfterBreak="0">
     <w:nsid w:val="5D263DF1"/>
     <w:multiLevelType w:val="hybridMultilevel"/>
     <w:tmpl w:val="F09E9DC2"/>
@@ -2507,7 +3019,7 @@
       </w:rPr>
     </w:lvl>
   </w:abstractNum>
-  <w:abstractNum w:abstractNumId="3" w15:restartNumberingAfterBreak="0">
+  <w:abstractNum w:abstractNumId="4" w15:restartNumberingAfterBreak="0">
     <w:nsid w:val="67267932"/>
     <w:multiLevelType w:val="hybridMultilevel"/>
     <w:tmpl w:val="C434B5DE"/>
@@ -2596,7 +3108,7 @@
       </w:pPr>
     </w:lvl>
   </w:abstractNum>
-  <w:abstractNum w:abstractNumId="4" w15:restartNumberingAfterBreak="0">
+  <w:abstractNum w:abstractNumId="5" w15:restartNumberingAfterBreak="0">
     <w:nsid w:val="6A7D0274"/>
     <w:multiLevelType w:val="hybridMultilevel"/>
     <w:tmpl w:val="A748E56A"/>
@@ -2709,20 +3221,115 @@
       </w:rPr>
     </w:lvl>
   </w:abstractNum>
+  <w:abstractNum w:abstractNumId="6" w15:restartNumberingAfterBreak="0">
+    <w:nsid w:val="75935492"/>
+    <w:multiLevelType w:val="hybridMultilevel"/>
+    <w:tmpl w:val="93F49E94"/>
+    <w:lvl w:ilvl="0" w:tplc="0809000F">
+      <w:start w:val="1"/>
+      <w:numFmt w:val="decimal"/>
+      <w:lvlText w:val="%1."/>
+      <w:lvlJc w:val="left"/>
+      <w:pPr>
+        <w:ind w:left="720" w:hanging="360"/>
+      </w:pPr>
+      <w:rPr>
+        <w:rFonts w:hint="default"/>
+      </w:rPr>
+    </w:lvl>
+    <w:lvl w:ilvl="1" w:tplc="08090019">
+      <w:start w:val="1"/>
+      <w:numFmt w:val="lowerLetter"/>
+      <w:lvlText w:val="%2."/>
+      <w:lvlJc w:val="left"/>
+      <w:pPr>
+        <w:ind w:left="1440" w:hanging="360"/>
+      </w:pPr>
+    </w:lvl>
+    <w:lvl w:ilvl="2" w:tplc="0809001B" w:tentative="1">
+      <w:start w:val="1"/>
+      <w:numFmt w:val="lowerRoman"/>
+      <w:lvlText w:val="%3."/>
+      <w:lvlJc w:val="right"/>
+      <w:pPr>
+        <w:ind w:left="2160" w:hanging="180"/>
+      </w:pPr>
+    </w:lvl>
+    <w:lvl w:ilvl="3" w:tplc="0809000F" w:tentative="1">
+      <w:start w:val="1"/>
+      <w:numFmt w:val="decimal"/>
+      <w:lvlText w:val="%4."/>
+      <w:lvlJc w:val="left"/>
+      <w:pPr>
+        <w:ind w:left="2880" w:hanging="360"/>
+      </w:pPr>
+    </w:lvl>
+    <w:lvl w:ilvl="4" w:tplc="08090019" w:tentative="1">
+      <w:start w:val="1"/>
+      <w:numFmt w:val="lowerLetter"/>
+      <w:lvlText w:val="%5."/>
+      <w:lvlJc w:val="left"/>
+      <w:pPr>
+        <w:ind w:left="3600" w:hanging="360"/>
+      </w:pPr>
+    </w:lvl>
+    <w:lvl w:ilvl="5" w:tplc="0809001B" w:tentative="1">
+      <w:start w:val="1"/>
+      <w:numFmt w:val="lowerRoman"/>
+      <w:lvlText w:val="%6."/>
+      <w:lvlJc w:val="right"/>
+      <w:pPr>
+        <w:ind w:left="4320" w:hanging="180"/>
+      </w:pPr>
+    </w:lvl>
+    <w:lvl w:ilvl="6" w:tplc="0809000F" w:tentative="1">
+      <w:start w:val="1"/>
+      <w:numFmt w:val="decimal"/>
+      <w:lvlText w:val="%7."/>
+      <w:lvlJc w:val="left"/>
+      <w:pPr>
+        <w:ind w:left="5040" w:hanging="360"/>
+      </w:pPr>
+    </w:lvl>
+    <w:lvl w:ilvl="7" w:tplc="08090019" w:tentative="1">
+      <w:start w:val="1"/>
+      <w:numFmt w:val="lowerLetter"/>
+      <w:lvlText w:val="%8."/>
+      <w:lvlJc w:val="left"/>
+      <w:pPr>
+        <w:ind w:left="5760" w:hanging="360"/>
+      </w:pPr>
+    </w:lvl>
+    <w:lvl w:ilvl="8" w:tplc="0809001B" w:tentative="1">
+      <w:start w:val="1"/>
+      <w:numFmt w:val="lowerRoman"/>
+      <w:lvlText w:val="%9."/>
+      <w:lvlJc w:val="right"/>
+      <w:pPr>
+        <w:ind w:left="6480" w:hanging="180"/>
+      </w:pPr>
+    </w:lvl>
+  </w:abstractNum>
   <w:num w:numId="1" w16cid:durableId="1210652915">
-    <w:abstractNumId w:val="4"/>
+    <w:abstractNumId w:val="5"/>
   </w:num>
   <w:num w:numId="2" w16cid:durableId="1742025653">
+    <w:abstractNumId w:val="3"/>
+  </w:num>
+  <w:num w:numId="3" w16cid:durableId="710153718">
     <w:abstractNumId w:val="2"/>
   </w:num>
-  <w:num w:numId="3" w16cid:durableId="710153718">
-    <w:abstractNumId w:val="1"/>
-  </w:num>
   <w:num w:numId="4" w16cid:durableId="462582228">
-    <w:abstractNumId w:val="3"/>
+    <w:abstractNumId w:val="4"/>
   </w:num>
   <w:num w:numId="5" w16cid:durableId="197397511">
     <w:abstractNumId w:val="0"/>
+  </w:num>
+  <w:num w:numId="6" w16cid:durableId="870260951">
+    <w:abstractNumId w:val="1"/>
+  </w:num>
+  <w:num w:numId="7" w16cid:durableId="1551922095">
+    <w:abstractNumId w:val="6"/>
   </w:num>
 </w:numbering>
 </file>

</xml_diff>

<commit_message>
ADDING TODAY'S WORK - 10.06.2026
</commit_message>
<xml_diff>
--- a/resources/Notes - Individual Research Project.docx
+++ b/resources/Notes - Individual Research Project.docx
@@ -1386,6 +1386,21 @@
       </w:pPr>
       <w:r>
         <w:t>Normalisation method is discussion point</w:t>
+      </w:r>
+    </w:p>
+    <w:p>
+      <w:pPr>
+        <w:pStyle w:val="ListParagraph"/>
+        <w:numPr>
+          <w:ilvl w:val="0"/>
+          <w:numId w:val="1"/>
+        </w:numPr>
+      </w:pPr>
+      <w:r>
+        <w:t xml:space="preserve">GH new (associate) email: </w:t>
+      </w:r>
+      <w:r>
+        <w:t>Georgina.hopkins3@nottingham.ac.uk</w:t>
       </w:r>
     </w:p>
     <w:p>

</xml_diff>

<commit_message>
ADDING TODAY'S WORK - 25.06.2026
</commit_message>
<xml_diff>
--- a/resources/Notes - Individual Research Project.docx
+++ b/resources/Notes - Individual Research Project.docx
@@ -1,6 +1,6 @@
 
 <file path=word/document.xml><?xml version="1.0" encoding="utf-8"?>
-<w:document xmlns:wpc="http://schemas.microsoft.com/office/word/2010/wordprocessingCanvas" xmlns:cx="http://schemas.microsoft.com/office/drawing/2014/chartex" xmlns:cx1="http://schemas.microsoft.com/office/drawing/2015/9/8/chartex" xmlns:cx2="http://schemas.microsoft.com/office/drawing/2015/10/21/chartex" xmlns:cx3="http://schemas.microsoft.com/office/drawing/2016/5/9/chartex" xmlns:cx4="http://schemas.microsoft.com/office/drawing/2016/5/10/chartex" xmlns:cx5="http://schemas.microsoft.com/office/drawing/2016/5/11/chartex" xmlns:cx6="http://schemas.microsoft.com/office/drawing/2016/5/12/chartex" xmlns:cx7="http://schemas.microsoft.com/office/drawing/2016/5/13/chartex" xmlns:cx8="http://schemas.microsoft.com/office/drawing/2016/5/14/chartex" xmlns:mc="http://schemas.openxmlformats.org/markup-compatibility/2006" xmlns:aink="http://schemas.microsoft.com/office/drawing/2016/ink" xmlns:am3d="http://schemas.microsoft.com/office/drawing/2017/model3d" xmlns:o="urn:schemas-microsoft-com:office:office" xmlns:oel="http://schemas.microsoft.com/office/2019/extlst" xmlns:r="http://schemas.openxmlformats.org/officeDocument/2006/relationships" xmlns:m="http://schemas.openxmlformats.org/officeDocument/2006/math" xmlns:v="urn:schemas-microsoft-com:vml" xmlns:wp14="http://schemas.microsoft.com/office/word/2010/wordprocessingDrawing" xmlns:wp="http://schemas.openxmlformats.org/drawingml/2006/wordprocessingDrawing" xmlns:w10="urn:schemas-microsoft-com:office:word" xmlns:w="http://schemas.openxmlformats.org/wordprocessingml/2006/main" xmlns:w14="http://schemas.microsoft.com/office/word/2010/wordml" xmlns:w15="http://schemas.microsoft.com/office/word/2012/wordml" xmlns:w16cex="http://schemas.microsoft.com/office/word/2018/wordml/cex" xmlns:w16cid="http://schemas.microsoft.com/office/word/2016/wordml/cid" xmlns:w16="http://schemas.microsoft.com/office/word/2018/wordml" xmlns:w16du="http://schemas.microsoft.com/office/word/2023/wordml/word16du" xmlns:w16sdtdh="http://schemas.microsoft.com/office/word/2020/wordml/sdtdatahash" xmlns:w16sdtfl="http://schemas.microsoft.com/office/word/2024/wordml/sdtformatlock" xmlns:w16se="http://schemas.microsoft.com/office/word/2015/wordml/symex" xmlns:wpg="http://schemas.microsoft.com/office/word/2010/wordprocessingGroup" xmlns:wpi="http://schemas.microsoft.com/office/word/2010/wordprocessingInk" xmlns:wne="http://schemas.microsoft.com/office/word/2006/wordml" xmlns:wps="http://schemas.microsoft.com/office/word/2010/wordprocessingShape" mc:Ignorable="w14 w15 w16se w16cid w16 w16cex w16sdtdh w16sdtfl w16du wp14">
+<w:document xmlns:wpc="http://schemas.microsoft.com/office/word/2010/wordprocessingCanvas" xmlns:cx="http://schemas.microsoft.com/office/drawing/2014/chartex" xmlns:cx1="http://schemas.microsoft.com/office/drawing/2015/9/8/chartex" xmlns:cx2="http://schemas.microsoft.com/office/drawing/2015/10/21/chartex" xmlns:cx3="http://schemas.microsoft.com/office/drawing/2016/5/9/chartex" xmlns:cx4="http://schemas.microsoft.com/office/drawing/2016/5/10/chartex" xmlns:cx5="http://schemas.microsoft.com/office/drawing/2016/5/11/chartex" xmlns:cx6="http://schemas.microsoft.com/office/drawing/2016/5/12/chartex" xmlns:cx7="http://schemas.microsoft.com/office/drawing/2016/5/13/chartex" xmlns:cx8="http://schemas.microsoft.com/office/drawing/2016/5/14/chartex" xmlns:mc="http://schemas.openxmlformats.org/markup-compatibility/2006" xmlns:m="http://schemas.openxmlformats.org/officeDocument/2006/math" xmlns:aink="http://schemas.microsoft.com/office/drawing/2016/ink" xmlns:am3d="http://schemas.microsoft.com/office/drawing/2017/model3d" xmlns:oel="http://schemas.microsoft.com/office/2019/extlst" xmlns:r="http://schemas.openxmlformats.org/officeDocument/2006/relationships" xmlns:wp14="http://schemas.microsoft.com/office/word/2010/wordprocessingDrawing" xmlns:wp="http://schemas.openxmlformats.org/drawingml/2006/wordprocessingDrawing" xmlns:wpg="http://schemas.microsoft.com/office/word/2010/wordprocessingGroup" xmlns:wpi="http://schemas.microsoft.com/office/word/2010/wordprocessingInk" xmlns:wps="http://schemas.microsoft.com/office/word/2010/wordprocessingShape" xmlns:o="urn:schemas-microsoft-com:office:office" xmlns:v="urn:schemas-microsoft-com:vml" xmlns:w10="urn:schemas-microsoft-com:office:word" xmlns:w="http://schemas.openxmlformats.org/wordprocessingml/2006/main" xmlns:w14="http://schemas.microsoft.com/office/word/2010/wordml" xmlns:w15="http://schemas.microsoft.com/office/word/2012/wordml" xmlns:w16cex="http://schemas.microsoft.com/office/word/2018/wordml/cex" xmlns:w16cid="http://schemas.microsoft.com/office/word/2016/wordml/cid" xmlns:w16="http://schemas.microsoft.com/office/word/2018/wordml" xmlns:w16sdtdh="http://schemas.microsoft.com/office/word/2020/wordml/sdtdatahash" xmlns:w16sdtfl="http://schemas.microsoft.com/office/word/2024/wordml/sdtformatlock" xmlns:w16se="http://schemas.microsoft.com/office/word/2015/wordml/symex" xmlns:w16du="http://schemas.microsoft.com/office/word/2023/wordml/word16du" xmlns:wne="http://schemas.microsoft.com/office/word/2006/wordml" mc:Ignorable="w14 w15 w16se w16cid w16 w16cex w16sdtdh w16sdtfl w16du wp14">
   <w:body>
     <w:p>
       <w:pPr>
@@ -319,6 +319,31 @@
           <w:t>https://github.com/adharafardhin/LIFE4137/tree/main</w:t>
         </w:r>
       </w:hyperlink>
+    </w:p>
+    <w:p>
+      <w:pPr>
+        <w:pStyle w:val="ListParagraph"/>
+        <w:numPr>
+          <w:ilvl w:val="0"/>
+          <w:numId w:val="1"/>
+        </w:numPr>
+      </w:pPr>
+      <w:r>
+        <w:t xml:space="preserve">allowed maximum of 6 figures and tables </w:t>
+      </w:r>
+      <w:r>
+        <w:rPr>
+          <w:b/>
+          <w:bCs/>
+        </w:rPr>
+        <w:t>combined</w:t>
+      </w:r>
+      <w:r>
+        <w:t xml:space="preserve"> e.g. 4 figures and 2 tables, not 6 figures and 2 tables.</w:t>
+      </w:r>
+      <w:r>
+        <w:t xml:space="preserve"> Note: HJ confirmed this in email 25.06.2026</w:t>
+      </w:r>
     </w:p>
     <w:p>
       <w:pPr>
@@ -2581,7 +2606,7 @@
 </file>
 
 <file path=word/numbering.xml><?xml version="1.0" encoding="utf-8"?>
-<w:numbering xmlns:wpc="http://schemas.microsoft.com/office/word/2010/wordprocessingCanvas" xmlns:cx="http://schemas.microsoft.com/office/drawing/2014/chartex" xmlns:cx1="http://schemas.microsoft.com/office/drawing/2015/9/8/chartex" xmlns:cx2="http://schemas.microsoft.com/office/drawing/2015/10/21/chartex" xmlns:cx3="http://schemas.microsoft.com/office/drawing/2016/5/9/chartex" xmlns:cx4="http://schemas.microsoft.com/office/drawing/2016/5/10/chartex" xmlns:cx5="http://schemas.microsoft.com/office/drawing/2016/5/11/chartex" xmlns:cx6="http://schemas.microsoft.com/office/drawing/2016/5/12/chartex" xmlns:cx7="http://schemas.microsoft.com/office/drawing/2016/5/13/chartex" xmlns:cx8="http://schemas.microsoft.com/office/drawing/2016/5/14/chartex" xmlns:mc="http://schemas.openxmlformats.org/markup-compatibility/2006" xmlns:aink="http://schemas.microsoft.com/office/drawing/2016/ink" xmlns:am3d="http://schemas.microsoft.com/office/drawing/2017/model3d" xmlns:o="urn:schemas-microsoft-com:office:office" xmlns:oel="http://schemas.microsoft.com/office/2019/extlst" xmlns:r="http://schemas.openxmlformats.org/officeDocument/2006/relationships" xmlns:m="http://schemas.openxmlformats.org/officeDocument/2006/math" xmlns:v="urn:schemas-microsoft-com:vml" xmlns:wp14="http://schemas.microsoft.com/office/word/2010/wordprocessingDrawing" xmlns:wp="http://schemas.openxmlformats.org/drawingml/2006/wordprocessingDrawing" xmlns:w10="urn:schemas-microsoft-com:office:word" xmlns:w="http://schemas.openxmlformats.org/wordprocessingml/2006/main" xmlns:w14="http://schemas.microsoft.com/office/word/2010/wordml" xmlns:w15="http://schemas.microsoft.com/office/word/2012/wordml" xmlns:w16cex="http://schemas.microsoft.com/office/word/2018/wordml/cex" xmlns:w16cid="http://schemas.microsoft.com/office/word/2016/wordml/cid" xmlns:w16="http://schemas.microsoft.com/office/word/2018/wordml" xmlns:w16du="http://schemas.microsoft.com/office/word/2023/wordml/word16du" xmlns:w16sdtdh="http://schemas.microsoft.com/office/word/2020/wordml/sdtdatahash" xmlns:w16sdtfl="http://schemas.microsoft.com/office/word/2024/wordml/sdtformatlock" xmlns:w16se="http://schemas.microsoft.com/office/word/2015/wordml/symex" xmlns:wpg="http://schemas.microsoft.com/office/word/2010/wordprocessingGroup" xmlns:wpi="http://schemas.microsoft.com/office/word/2010/wordprocessingInk" xmlns:wne="http://schemas.microsoft.com/office/word/2006/wordml" xmlns:wps="http://schemas.microsoft.com/office/word/2010/wordprocessingShape" mc:Ignorable="w14 w15 w16se w16cid w16 w16cex w16sdtdh w16sdtfl w16du wp14">
+<w:numbering xmlns:wpc="http://schemas.microsoft.com/office/word/2010/wordprocessingCanvas" xmlns:cx="http://schemas.microsoft.com/office/drawing/2014/chartex" xmlns:cx1="http://schemas.microsoft.com/office/drawing/2015/9/8/chartex" xmlns:cx2="http://schemas.microsoft.com/office/drawing/2015/10/21/chartex" xmlns:cx3="http://schemas.microsoft.com/office/drawing/2016/5/9/chartex" xmlns:cx4="http://schemas.microsoft.com/office/drawing/2016/5/10/chartex" xmlns:cx5="http://schemas.microsoft.com/office/drawing/2016/5/11/chartex" xmlns:cx6="http://schemas.microsoft.com/office/drawing/2016/5/12/chartex" xmlns:cx7="http://schemas.microsoft.com/office/drawing/2016/5/13/chartex" xmlns:cx8="http://schemas.microsoft.com/office/drawing/2016/5/14/chartex" xmlns:mc="http://schemas.openxmlformats.org/markup-compatibility/2006" xmlns:m="http://schemas.openxmlformats.org/officeDocument/2006/math" xmlns:aink="http://schemas.microsoft.com/office/drawing/2016/ink" xmlns:am3d="http://schemas.microsoft.com/office/drawing/2017/model3d" xmlns:oel="http://schemas.microsoft.com/office/2019/extlst" xmlns:r="http://schemas.openxmlformats.org/officeDocument/2006/relationships" xmlns:wp14="http://schemas.microsoft.com/office/word/2010/wordprocessingDrawing" xmlns:wp="http://schemas.openxmlformats.org/drawingml/2006/wordprocessingDrawing" xmlns:wpg="http://schemas.microsoft.com/office/word/2010/wordprocessingGroup" xmlns:wpi="http://schemas.microsoft.com/office/word/2010/wordprocessingInk" xmlns:wps="http://schemas.microsoft.com/office/word/2010/wordprocessingShape" xmlns:o="urn:schemas-microsoft-com:office:office" xmlns:v="urn:schemas-microsoft-com:vml" xmlns:w10="urn:schemas-microsoft-com:office:word" xmlns:w="http://schemas.openxmlformats.org/wordprocessingml/2006/main" xmlns:w14="http://schemas.microsoft.com/office/word/2010/wordml" xmlns:w15="http://schemas.microsoft.com/office/word/2012/wordml" xmlns:w16cex="http://schemas.microsoft.com/office/word/2018/wordml/cex" xmlns:w16cid="http://schemas.microsoft.com/office/word/2016/wordml/cid" xmlns:w16="http://schemas.microsoft.com/office/word/2018/wordml" xmlns:w16sdtdh="http://schemas.microsoft.com/office/word/2020/wordml/sdtdatahash" xmlns:w16sdtfl="http://schemas.microsoft.com/office/word/2024/wordml/sdtformatlock" xmlns:w16se="http://schemas.microsoft.com/office/word/2015/wordml/symex" xmlns:w16du="http://schemas.microsoft.com/office/word/2023/wordml/word16du" xmlns:wne="http://schemas.microsoft.com/office/word/2006/wordml" mc:Ignorable="w14 w15 w16se w16cid w16 w16cex w16sdtdh w16sdtfl w16du wp14">
   <w:abstractNum w:abstractNumId="0" w15:restartNumberingAfterBreak="0">
     <w:nsid w:val="1F7D26DC"/>
     <w:multiLevelType w:val="hybridMultilevel"/>
@@ -3350,7 +3375,7 @@
 </file>
 
 <file path=word/styles.xml><?xml version="1.0" encoding="utf-8"?>
-<w:styles xmlns:mc="http://schemas.openxmlformats.org/markup-compatibility/2006" xmlns:r="http://schemas.openxmlformats.org/officeDocument/2006/relationships" xmlns:w="http://schemas.openxmlformats.org/wordprocessingml/2006/main" xmlns:w14="http://schemas.microsoft.com/office/word/2010/wordml" xmlns:w15="http://schemas.microsoft.com/office/word/2012/wordml" xmlns:w16cex="http://schemas.microsoft.com/office/word/2018/wordml/cex" xmlns:w16cid="http://schemas.microsoft.com/office/word/2016/wordml/cid" xmlns:w16="http://schemas.microsoft.com/office/word/2018/wordml" xmlns:w16du="http://schemas.microsoft.com/office/word/2023/wordml/word16du" xmlns:w16sdtdh="http://schemas.microsoft.com/office/word/2020/wordml/sdtdatahash" xmlns:w16sdtfl="http://schemas.microsoft.com/office/word/2024/wordml/sdtformatlock" xmlns:w16se="http://schemas.microsoft.com/office/word/2015/wordml/symex" mc:Ignorable="w14 w15 w16se w16cid w16 w16cex w16sdtdh w16sdtfl w16du">
+<w:styles xmlns:mc="http://schemas.openxmlformats.org/markup-compatibility/2006" xmlns:r="http://schemas.openxmlformats.org/officeDocument/2006/relationships" xmlns:w="http://schemas.openxmlformats.org/wordprocessingml/2006/main" xmlns:w14="http://schemas.microsoft.com/office/word/2010/wordml" xmlns:w15="http://schemas.microsoft.com/office/word/2012/wordml" xmlns:w16cex="http://schemas.microsoft.com/office/word/2018/wordml/cex" xmlns:w16cid="http://schemas.microsoft.com/office/word/2016/wordml/cid" xmlns:w16="http://schemas.microsoft.com/office/word/2018/wordml" xmlns:w16sdtdh="http://schemas.microsoft.com/office/word/2020/wordml/sdtdatahash" xmlns:w16sdtfl="http://schemas.microsoft.com/office/word/2024/wordml/sdtformatlock" xmlns:w16se="http://schemas.microsoft.com/office/word/2015/wordml/symex" xmlns:w16du="http://schemas.microsoft.com/office/word/2023/wordml/word16du" mc:Ignorable="w14 w15 w16se w16cid w16 w16cex w16sdtdh w16sdtfl w16du">
   <w:docDefaults>
     <w:rPrDefault>
       <w:rPr>

</xml_diff>

<commit_message>
ADDING TODAY'S WORK - 30.06.2026
</commit_message>
<xml_diff>
--- a/resources/Notes - Individual Research Project.docx
+++ b/resources/Notes - Individual Research Project.docx
@@ -1424,8 +1424,25 @@
       <w:r>
         <w:t xml:space="preserve">GH new (associate) email: </w:t>
       </w:r>
-      <w:r>
-        <w:t>Georgina.hopkins3@nottingham.ac.uk</w:t>
+      <w:hyperlink r:id="rId11" w:history="1">
+        <w:r>
+          <w:rPr>
+            <w:rStyle w:val="Hyperlink"/>
+          </w:rPr>
+          <w:t>Georgina.hopkins3@nottingham.ac.uk</w:t>
+        </w:r>
+      </w:hyperlink>
+    </w:p>
+    <w:p>
+      <w:pPr>
+        <w:pStyle w:val="ListParagraph"/>
+        <w:numPr>
+          <w:ilvl w:val="0"/>
+          <w:numId w:val="1"/>
+        </w:numPr>
+      </w:pPr>
+      <w:r>
+        <w:t>Italicise P value, FDR etc. correctly and consistently throughout.</w:t>
       </w:r>
     </w:p>
     <w:p>
@@ -1459,7 +1476,7 @@
       <w:r>
         <w:t xml:space="preserve">Need to be confident with the annotation for miRNA. </w:t>
       </w:r>
-      <w:hyperlink r:id="rId11" w:history="1">
+      <w:hyperlink r:id="rId12" w:history="1">
         <w:r>
           <w:rPr>
             <w:rStyle w:val="Hyperlink"/>
@@ -1495,7 +1512,7 @@
                     <pic:cNvPicPr/>
                   </pic:nvPicPr>
                   <pic:blipFill rotWithShape="1">
-                    <a:blip r:embed="rId12"/>
+                    <a:blip r:embed="rId13"/>
                     <a:srcRect b="29389"/>
                     <a:stretch>
                       <a:fillRect/>
@@ -1551,7 +1568,7 @@
       <w:r>
         <w:t xml:space="preserve"> </w:t>
       </w:r>
-      <w:hyperlink r:id="rId13" w:history="1">
+      <w:hyperlink r:id="rId14" w:history="1">
         <w:r>
           <w:rPr>
             <w:rStyle w:val="Hyperlink"/>
@@ -1579,7 +1596,7 @@
       <w:r>
         <w:t xml:space="preserve"> analysis of their propriety miRNA workflow </w:t>
       </w:r>
-      <w:hyperlink r:id="rId14" w:history="1">
+      <w:hyperlink r:id="rId15" w:history="1">
         <w:r>
           <w:rPr>
             <w:rStyle w:val="Hyperlink"/>
@@ -1613,7 +1630,7 @@
                     <pic:cNvPicPr/>
                   </pic:nvPicPr>
                   <pic:blipFill>
-                    <a:blip r:embed="rId15"/>
+                    <a:blip r:embed="rId16"/>
                     <a:stretch>
                       <a:fillRect/>
                     </a:stretch>
@@ -1676,7 +1693,7 @@
       <w:r>
         <w:t xml:space="preserve"> etc. </w:t>
       </w:r>
-      <w:hyperlink r:id="rId16" w:history="1">
+      <w:hyperlink r:id="rId17" w:history="1">
         <w:r>
           <w:rPr>
             <w:rStyle w:val="Hyperlink"/>
@@ -1702,7 +1719,7 @@
       <w:r>
         <w:t xml:space="preserve"> </w:t>
       </w:r>
-      <w:hyperlink r:id="rId17" w:history="1">
+      <w:hyperlink r:id="rId18" w:history="1">
         <w:r>
           <w:rPr>
             <w:rStyle w:val="Hyperlink"/>
@@ -1790,7 +1807,7 @@
       <w:r>
         <w:t xml:space="preserve">Pathway analysis software used in one of the 3 initial references supplied </w:t>
       </w:r>
-      <w:hyperlink r:id="rId18" w:history="1">
+      <w:hyperlink r:id="rId19" w:history="1">
         <w:r>
           <w:rPr>
             <w:rStyle w:val="Hyperlink"/>
@@ -1842,7 +1859,7 @@
       <w:r>
         <w:t xml:space="preserve"> </w:t>
       </w:r>
-      <w:hyperlink r:id="rId19" w:history="1">
+      <w:hyperlink r:id="rId20" w:history="1">
         <w:r>
           <w:rPr>
             <w:rStyle w:val="Hyperlink"/>
@@ -1888,7 +1905,7 @@
       <w:r>
         <w:t xml:space="preserve"> </w:t>
       </w:r>
-      <w:hyperlink r:id="rId20" w:history="1">
+      <w:hyperlink r:id="rId21" w:history="1">
         <w:r>
           <w:rPr>
             <w:rStyle w:val="Hyperlink"/>
@@ -2122,7 +2139,7 @@
                     <pic:cNvPicPr/>
                   </pic:nvPicPr>
                   <pic:blipFill>
-                    <a:blip r:embed="rId21"/>
+                    <a:blip r:embed="rId22"/>
                     <a:stretch>
                       <a:fillRect/>
                     </a:stretch>
@@ -2197,7 +2214,7 @@
                     <pic:cNvPicPr/>
                   </pic:nvPicPr>
                   <pic:blipFill>
-                    <a:blip r:embed="rId22"/>
+                    <a:blip r:embed="rId23"/>
                     <a:stretch>
                       <a:fillRect/>
                     </a:stretch>
@@ -2576,7 +2593,7 @@
       <w:pPr>
         <w:pStyle w:val="ListParagraph"/>
       </w:pPr>
-      <w:hyperlink r:id="rId23" w:history="1">
+      <w:hyperlink r:id="rId24" w:history="1">
         <w:r>
           <w:rPr>
             <w:rStyle w:val="Hyperlink"/>

</xml_diff>

<commit_message>
ADDING TODAY'S WORK - 03.07.2026
</commit_message>
<xml_diff>
--- a/resources/Notes - Individual Research Project.docx
+++ b/resources/Notes - Individual Research Project.docx
@@ -1443,6 +1443,87 @@
       </w:pPr>
       <w:r>
         <w:t>Italicise P value, FDR etc. correctly and consistently throughout.</w:t>
+      </w:r>
+    </w:p>
+    <w:p>
+      <w:pPr>
+        <w:pStyle w:val="ListParagraph"/>
+        <w:numPr>
+          <w:ilvl w:val="0"/>
+          <w:numId w:val="1"/>
+        </w:numPr>
+      </w:pPr>
+      <w:r>
+        <w:t>Replace ‘dog’ with ‘Can</w:t>
+      </w:r>
+      <w:r>
+        <w:t xml:space="preserve"> f 1</w:t>
+      </w:r>
+      <w:r>
+        <w:t>’ throughout the report</w:t>
+      </w:r>
+      <w:r>
+        <w:t xml:space="preserve"> [that is the correct case use for Can f 1]</w:t>
+      </w:r>
+    </w:p>
+    <w:p>
+      <w:pPr>
+        <w:pStyle w:val="ListParagraph"/>
+        <w:numPr>
+          <w:ilvl w:val="1"/>
+          <w:numId w:val="1"/>
+        </w:numPr>
+      </w:pPr>
+      <w:r>
+        <w:t xml:space="preserve">Replace </w:t>
+      </w:r>
+      <w:proofErr w:type="spellStart"/>
+      <w:r>
+        <w:t>hdm</w:t>
+      </w:r>
+      <w:proofErr w:type="spellEnd"/>
+      <w:r>
+        <w:t xml:space="preserve"> with der p 1 (active/inactive) as well?</w:t>
+      </w:r>
+    </w:p>
+    <w:p>
+      <w:pPr>
+        <w:pStyle w:val="ListParagraph"/>
+        <w:numPr>
+          <w:ilvl w:val="0"/>
+          <w:numId w:val="1"/>
+        </w:numPr>
+      </w:pPr>
+      <w:r>
+        <w:t>Remove ‘has</w:t>
+      </w:r>
+      <w:proofErr w:type="gramStart"/>
+      <w:r>
+        <w:t>-‘ from</w:t>
+      </w:r>
+      <w:proofErr w:type="gramEnd"/>
+      <w:r>
+        <w:t xml:space="preserve"> micro </w:t>
+      </w:r>
+      <w:proofErr w:type="spellStart"/>
+      <w:r>
+        <w:t>rna</w:t>
+      </w:r>
+      <w:proofErr w:type="spellEnd"/>
+      <w:r>
+        <w:t xml:space="preserve"> names. Looks like people just have it as miR-574-5p instead of hsa-miR-574-5p in research papers.</w:t>
+      </w:r>
+    </w:p>
+    <w:p>
+      <w:pPr>
+        <w:pStyle w:val="ListParagraph"/>
+        <w:numPr>
+          <w:ilvl w:val="0"/>
+          <w:numId w:val="1"/>
+        </w:numPr>
+      </w:pPr>
+      <w:r>
+        <w:t>Check all abbreviations have been expanded somewhere</w:t>
       </w:r>
     </w:p>
     <w:p>

</xml_diff>

<commit_message>
ADDING TODAY'S WORK - 06.07.2026
</commit_message>
<xml_diff>
--- a/resources/Notes - Individual Research Project.docx
+++ b/resources/Notes - Individual Research Project.docx
@@ -1524,6 +1524,18 @@
       </w:pPr>
       <w:r>
         <w:t>Check all abbreviations have been expanded somewhere</w:t>
+      </w:r>
+    </w:p>
+    <w:p>
+      <w:pPr>
+        <w:pStyle w:val="ListParagraph"/>
+        <w:numPr>
+          <w:ilvl w:val="0"/>
+          <w:numId w:val="1"/>
+        </w:numPr>
+      </w:pPr>
+      <w:r>
+        <w:t>Need to make sure all plots say ‘untreated’ because saying control is ambiguous – as you can have positive and negative controls</w:t>
       </w:r>
     </w:p>
     <w:p>

</xml_diff>

<commit_message>
ADDING TODAY'S WORK - 07.07.2026
</commit_message>
<xml_diff>
--- a/resources/Notes - Individual Research Project.docx
+++ b/resources/Notes - Individual Research Project.docx
@@ -149,28 +149,7 @@
         </w:numPr>
       </w:pPr>
       <w:r>
-        <w:t xml:space="preserve">Using </w:t>
-      </w:r>
-      <w:proofErr w:type="spellStart"/>
-      <w:proofErr w:type="gramStart"/>
-      <w:r>
-        <w:t>dplyr</w:t>
-      </w:r>
-      <w:proofErr w:type="spellEnd"/>
-      <w:r>
-        <w:t>::select(</w:t>
-      </w:r>
-      <w:proofErr w:type="gramEnd"/>
-      <w:r>
-        <w:t xml:space="preserve">) might be better for reproducibility than just </w:t>
-      </w:r>
-      <w:proofErr w:type="gramStart"/>
-      <w:r>
-        <w:t>select(</w:t>
-      </w:r>
-      <w:proofErr w:type="gramEnd"/>
-      <w:r>
-        <w:t>).</w:t>
+        <w:t>Using dplyr::select() might be better for reproducibility than just select().</w:t>
       </w:r>
     </w:p>
     <w:p>
@@ -182,26 +161,10 @@
         </w:numPr>
       </w:pPr>
       <w:r>
-        <w:t xml:space="preserve">I’ve had issues when using </w:t>
-      </w:r>
-      <w:proofErr w:type="gramStart"/>
-      <w:r>
-        <w:t>select(</w:t>
-      </w:r>
-      <w:proofErr w:type="gramEnd"/>
-      <w:r>
-        <w:t>) with deseq2 due to a conflict with deseq2-associated packages</w:t>
-      </w:r>
-      <w:r>
-        <w:t xml:space="preserve">. Using </w:t>
-      </w:r>
-      <w:proofErr w:type="gramStart"/>
-      <w:r>
-        <w:t>the :</w:t>
-      </w:r>
-      <w:proofErr w:type="gramEnd"/>
-      <w:r>
-        <w:t>: will make it reproducible in case someone else has conflicting packages loaded or they update packages which will then cause conflict.</w:t>
+        <w:t>I’ve had issues when using select() with deseq2 due to a conflict with deseq2-associated packages</w:t>
+      </w:r>
+      <w:r>
+        <w:t>. Using the :: will make it reproducible in case someone else has conflicting packages loaded or they update packages which will then cause conflict.</w:t>
       </w:r>
       <w:r>
         <w:t xml:space="preserve"> </w:t>
@@ -225,17 +188,8 @@
           <w:b/>
           <w:bCs/>
         </w:rPr>
-        <w:t xml:space="preserve">– seen it in other </w:t>
-      </w:r>
-      <w:proofErr w:type="spellStart"/>
-      <w:r>
-        <w:rPr>
-          <w:b/>
-          <w:bCs/>
-        </w:rPr>
-        <w:t>githubs</w:t>
-      </w:r>
-      <w:proofErr w:type="spellEnd"/>
+        <w:t>– seen it in other githubs</w:t>
+      </w:r>
     </w:p>
     <w:p>
       <w:pPr>
@@ -258,15 +212,7 @@
         </w:numPr>
       </w:pPr>
       <w:r>
-        <w:t xml:space="preserve">Company that performed the bioinformatics analysis for them = </w:t>
-      </w:r>
-      <w:proofErr w:type="spellStart"/>
-      <w:r>
-        <w:t>tamiRNA</w:t>
-      </w:r>
-      <w:proofErr w:type="spellEnd"/>
-      <w:r>
-        <w:t xml:space="preserve"> </w:t>
+        <w:t xml:space="preserve">Company that performed the bioinformatics analysis for them = tamiRNA </w:t>
       </w:r>
       <w:hyperlink r:id="rId6" w:history="1">
         <w:r>
@@ -298,15 +244,7 @@
         </w:numPr>
       </w:pPr>
       <w:r>
-        <w:t xml:space="preserve">see l4137 example </w:t>
-      </w:r>
-      <w:proofErr w:type="spellStart"/>
-      <w:r>
-        <w:t>github</w:t>
-      </w:r>
-      <w:proofErr w:type="spellEnd"/>
-      <w:r>
-        <w:t xml:space="preserve"> from previous year</w:t>
+        <w:t>see l4137 example github from previous year</w:t>
       </w:r>
       <w:r>
         <w:t xml:space="preserve"> </w:t>
@@ -355,20 +293,7 @@
       </w:pPr>
       <w:r>
         <w:lastRenderedPageBreak/>
-        <w:t xml:space="preserve">Need to include R </w:t>
-      </w:r>
-      <w:proofErr w:type="spellStart"/>
-      <w:proofErr w:type="gramStart"/>
-      <w:r>
-        <w:t>sessionInfo</w:t>
-      </w:r>
-      <w:proofErr w:type="spellEnd"/>
-      <w:r>
-        <w:t>(</w:t>
-      </w:r>
-      <w:proofErr w:type="gramEnd"/>
-      <w:r>
-        <w:t xml:space="preserve">) somewhere: </w:t>
+        <w:t xml:space="preserve">Need to include R sessionInfo() somewhere: </w:t>
       </w:r>
       <w:r>
         <w:rPr>
@@ -471,27 +396,14 @@
       <w:r>
         <w:t xml:space="preserve">If there’s time AND my results align with the </w:t>
       </w:r>
-      <w:proofErr w:type="spellStart"/>
-      <w:r>
-        <w:t>tamiRNA</w:t>
-      </w:r>
-      <w:proofErr w:type="spellEnd"/>
-      <w:r>
-        <w:t xml:space="preserve"> results, can look at making a simple</w:t>
+      <w:r>
+        <w:t>tamiRNA results, can look at making a simple</w:t>
       </w:r>
       <w:r>
         <w:t xml:space="preserve"> web</w:t>
       </w:r>
       <w:r>
-        <w:t xml:space="preserve"> app that takes the data in then you can select what you want to do with </w:t>
-      </w:r>
-      <w:proofErr w:type="gramStart"/>
-      <w:r>
-        <w:t>it</w:t>
-      </w:r>
-      <w:proofErr w:type="gramEnd"/>
-      <w:r>
-        <w:t xml:space="preserve"> and it will output the deseq2 results/graphs</w:t>
+        <w:t xml:space="preserve"> app that takes the data in then you can select what you want to do with it and it will output the deseq2 results/graphs</w:t>
       </w:r>
     </w:p>
     <w:p>
@@ -515,23 +427,7 @@
         </w:numPr>
       </w:pPr>
       <w:r>
-        <w:t>Could create a parallel report at the end (</w:t>
-      </w:r>
-      <w:proofErr w:type="gramStart"/>
-      <w:r>
-        <w:t>similar to</w:t>
-      </w:r>
-      <w:proofErr w:type="gramEnd"/>
-      <w:r>
-        <w:t xml:space="preserve"> the </w:t>
-      </w:r>
-      <w:proofErr w:type="spellStart"/>
-      <w:r>
-        <w:t>quast</w:t>
-      </w:r>
-      <w:proofErr w:type="spellEnd"/>
-      <w:r>
-        <w:t xml:space="preserve"> reports) that compares the </w:t>
+        <w:t xml:space="preserve">Could create a parallel report at the end (similar to the quast reports) that compares the </w:t>
       </w:r>
       <w:r>
         <w:t>results from multiple tests with different parameters e.g. different samples excluded based on quality</w:t>
@@ -654,8 +550,6 @@
           <w14:ligatures w14:val="none"/>
         </w:rPr>
       </w:pPr>
-      <w:proofErr w:type="spellStart"/>
-      <w:proofErr w:type="gramStart"/>
       <w:r>
         <w:rPr>
           <w:rFonts w:ascii="Menlo" w:eastAsia="Times New Roman" w:hAnsi="Menlo" w:cs="Menlo"/>
@@ -668,7 +562,6 @@
         </w:rPr>
         <w:t>BiocManager</w:t>
       </w:r>
-      <w:proofErr w:type="spellEnd"/>
       <w:r>
         <w:rPr>
           <w:rFonts w:ascii="Menlo" w:eastAsia="Times New Roman" w:hAnsi="Menlo" w:cs="Menlo"/>
@@ -721,7 +614,6 @@
         </w:rPr>
         <w:t>(</w:t>
       </w:r>
-      <w:proofErr w:type="gramEnd"/>
       <w:r>
         <w:rPr>
           <w:rFonts w:ascii="Menlo" w:eastAsia="Times New Roman" w:hAnsi="Menlo" w:cs="Menlo"/>
@@ -732,9 +624,32 @@
           <w:lang w:eastAsia="en-GB"/>
           <w14:ligatures w14:val="none"/>
         </w:rPr>
-        <w:t>"</w:t>
-      </w:r>
-      <w:proofErr w:type="spellStart"/>
+        <w:t>"globaltest"</w:t>
+      </w:r>
+      <w:r>
+        <w:rPr>
+          <w:rFonts w:ascii="Menlo" w:eastAsia="Times New Roman" w:hAnsi="Menlo" w:cs="Menlo"/>
+          <w:color w:val="000000"/>
+          <w:kern w:val="0"/>
+          <w:sz w:val="20"/>
+          <w:szCs w:val="20"/>
+          <w:lang w:eastAsia="en-GB"/>
+          <w14:ligatures w14:val="none"/>
+        </w:rPr>
+        <w:t>,</w:t>
+      </w:r>
+      <w:r>
+        <w:rPr>
+          <w:rFonts w:ascii="Menlo" w:eastAsia="Times New Roman" w:hAnsi="Menlo" w:cs="Menlo"/>
+          <w:color w:val="BBBBBB"/>
+          <w:kern w:val="0"/>
+          <w:sz w:val="20"/>
+          <w:szCs w:val="20"/>
+          <w:lang w:eastAsia="en-GB"/>
+          <w14:ligatures w14:val="none"/>
+        </w:rPr>
+        <w:t xml:space="preserve"> </w:t>
+      </w:r>
       <w:r>
         <w:rPr>
           <w:rFonts w:ascii="Menlo" w:eastAsia="Times New Roman" w:hAnsi="Menlo" w:cs="Menlo"/>
@@ -745,9 +660,32 @@
           <w:lang w:eastAsia="en-GB"/>
           <w14:ligatures w14:val="none"/>
         </w:rPr>
-        <w:t>globaltest</w:t>
-      </w:r>
-      <w:proofErr w:type="spellEnd"/>
+        <w:t>"topGO"</w:t>
+      </w:r>
+      <w:r>
+        <w:rPr>
+          <w:rFonts w:ascii="Menlo" w:eastAsia="Times New Roman" w:hAnsi="Menlo" w:cs="Menlo"/>
+          <w:color w:val="000000"/>
+          <w:kern w:val="0"/>
+          <w:sz w:val="20"/>
+          <w:szCs w:val="20"/>
+          <w:lang w:eastAsia="en-GB"/>
+          <w14:ligatures w14:val="none"/>
+        </w:rPr>
+        <w:t>,</w:t>
+      </w:r>
+      <w:r>
+        <w:rPr>
+          <w:rFonts w:ascii="Menlo" w:eastAsia="Times New Roman" w:hAnsi="Menlo" w:cs="Menlo"/>
+          <w:color w:val="BBBBBB"/>
+          <w:kern w:val="0"/>
+          <w:sz w:val="20"/>
+          <w:szCs w:val="20"/>
+          <w:lang w:eastAsia="en-GB"/>
+          <w14:ligatures w14:val="none"/>
+        </w:rPr>
+        <w:t xml:space="preserve"> </w:t>
+      </w:r>
       <w:r>
         <w:rPr>
           <w:rFonts w:ascii="Menlo" w:eastAsia="Times New Roman" w:hAnsi="Menlo" w:cs="Menlo"/>
@@ -758,7 +696,7 @@
           <w:lang w:eastAsia="en-GB"/>
           <w14:ligatures w14:val="none"/>
         </w:rPr>
-        <w:t>"</w:t>
+        <w:t>"golubEsets"</w:t>
       </w:r>
       <w:r>
         <w:rPr>
@@ -794,9 +732,32 @@
           <w:lang w:eastAsia="en-GB"/>
           <w14:ligatures w14:val="none"/>
         </w:rPr>
-        <w:t>"</w:t>
-      </w:r>
-      <w:proofErr w:type="spellStart"/>
+        <w:t>"vsn"</w:t>
+      </w:r>
+      <w:r>
+        <w:rPr>
+          <w:rFonts w:ascii="Menlo" w:eastAsia="Times New Roman" w:hAnsi="Menlo" w:cs="Menlo"/>
+          <w:color w:val="000000"/>
+          <w:kern w:val="0"/>
+          <w:sz w:val="20"/>
+          <w:szCs w:val="20"/>
+          <w:lang w:eastAsia="en-GB"/>
+          <w14:ligatures w14:val="none"/>
+        </w:rPr>
+        <w:t>,</w:t>
+      </w:r>
+      <w:r>
+        <w:rPr>
+          <w:rFonts w:ascii="Menlo" w:eastAsia="Times New Roman" w:hAnsi="Menlo" w:cs="Menlo"/>
+          <w:color w:val="BBBBBB"/>
+          <w:kern w:val="0"/>
+          <w:sz w:val="20"/>
+          <w:szCs w:val="20"/>
+          <w:lang w:eastAsia="en-GB"/>
+          <w14:ligatures w14:val="none"/>
+        </w:rPr>
+        <w:t xml:space="preserve"> </w:t>
+      </w:r>
       <w:r>
         <w:rPr>
           <w:rFonts w:ascii="Menlo" w:eastAsia="Times New Roman" w:hAnsi="Menlo" w:cs="Menlo"/>
@@ -807,9 +768,32 @@
           <w:lang w:eastAsia="en-GB"/>
           <w14:ligatures w14:val="none"/>
         </w:rPr>
-        <w:t>topGO</w:t>
-      </w:r>
-      <w:proofErr w:type="spellEnd"/>
+        <w:t>"hu6800.db"</w:t>
+      </w:r>
+      <w:r>
+        <w:rPr>
+          <w:rFonts w:ascii="Menlo" w:eastAsia="Times New Roman" w:hAnsi="Menlo" w:cs="Menlo"/>
+          <w:color w:val="000000"/>
+          <w:kern w:val="0"/>
+          <w:sz w:val="20"/>
+          <w:szCs w:val="20"/>
+          <w:lang w:eastAsia="en-GB"/>
+          <w14:ligatures w14:val="none"/>
+        </w:rPr>
+        <w:t>,</w:t>
+      </w:r>
+      <w:r>
+        <w:rPr>
+          <w:rFonts w:ascii="Menlo" w:eastAsia="Times New Roman" w:hAnsi="Menlo" w:cs="Menlo"/>
+          <w:color w:val="BBBBBB"/>
+          <w:kern w:val="0"/>
+          <w:sz w:val="20"/>
+          <w:szCs w:val="20"/>
+          <w:lang w:eastAsia="en-GB"/>
+          <w14:ligatures w14:val="none"/>
+        </w:rPr>
+        <w:t xml:space="preserve"> </w:t>
+      </w:r>
       <w:r>
         <w:rPr>
           <w:rFonts w:ascii="Menlo" w:eastAsia="Times New Roman" w:hAnsi="Menlo" w:cs="Menlo"/>
@@ -820,7 +804,7 @@
           <w:lang w:eastAsia="en-GB"/>
           <w14:ligatures w14:val="none"/>
         </w:rPr>
-        <w:t>"</w:t>
+        <w:t>"GO.db"</w:t>
       </w:r>
       <w:r>
         <w:rPr>
@@ -856,9 +840,32 @@
           <w:lang w:eastAsia="en-GB"/>
           <w14:ligatures w14:val="none"/>
         </w:rPr>
-        <w:t>"</w:t>
-      </w:r>
-      <w:proofErr w:type="spellStart"/>
+        <w:t>"AnnotationDbi"</w:t>
+      </w:r>
+      <w:r>
+        <w:rPr>
+          <w:rFonts w:ascii="Menlo" w:eastAsia="Times New Roman" w:hAnsi="Menlo" w:cs="Menlo"/>
+          <w:color w:val="000000"/>
+          <w:kern w:val="0"/>
+          <w:sz w:val="20"/>
+          <w:szCs w:val="20"/>
+          <w:lang w:eastAsia="en-GB"/>
+          <w14:ligatures w14:val="none"/>
+        </w:rPr>
+        <w:t>,</w:t>
+      </w:r>
+      <w:r>
+        <w:rPr>
+          <w:rFonts w:ascii="Menlo" w:eastAsia="Times New Roman" w:hAnsi="Menlo" w:cs="Menlo"/>
+          <w:color w:val="BBBBBB"/>
+          <w:kern w:val="0"/>
+          <w:sz w:val="20"/>
+          <w:szCs w:val="20"/>
+          <w:lang w:eastAsia="en-GB"/>
+          <w14:ligatures w14:val="none"/>
+        </w:rPr>
+        <w:t xml:space="preserve"> </w:t>
+      </w:r>
       <w:r>
         <w:rPr>
           <w:rFonts w:ascii="Menlo" w:eastAsia="Times New Roman" w:hAnsi="Menlo" w:cs="Menlo"/>
@@ -869,9 +876,32 @@
           <w:lang w:eastAsia="en-GB"/>
           <w14:ligatures w14:val="none"/>
         </w:rPr>
-        <w:t>golubEsets</w:t>
-      </w:r>
-      <w:proofErr w:type="spellEnd"/>
+        <w:t>"annotate"</w:t>
+      </w:r>
+      <w:r>
+        <w:rPr>
+          <w:rFonts w:ascii="Menlo" w:eastAsia="Times New Roman" w:hAnsi="Menlo" w:cs="Menlo"/>
+          <w:color w:val="000000"/>
+          <w:kern w:val="0"/>
+          <w:sz w:val="20"/>
+          <w:szCs w:val="20"/>
+          <w:lang w:eastAsia="en-GB"/>
+          <w14:ligatures w14:val="none"/>
+        </w:rPr>
+        <w:t>,</w:t>
+      </w:r>
+      <w:r>
+        <w:rPr>
+          <w:rFonts w:ascii="Menlo" w:eastAsia="Times New Roman" w:hAnsi="Menlo" w:cs="Menlo"/>
+          <w:color w:val="BBBBBB"/>
+          <w:kern w:val="0"/>
+          <w:sz w:val="20"/>
+          <w:szCs w:val="20"/>
+          <w:lang w:eastAsia="en-GB"/>
+          <w14:ligatures w14:val="none"/>
+        </w:rPr>
+        <w:t xml:space="preserve"> </w:t>
+      </w:r>
       <w:r>
         <w:rPr>
           <w:rFonts w:ascii="Menlo" w:eastAsia="Times New Roman" w:hAnsi="Menlo" w:cs="Menlo"/>
@@ -882,7 +912,7 @@
           <w:lang w:eastAsia="en-GB"/>
           <w14:ligatures w14:val="none"/>
         </w:rPr>
-        <w:t>"</w:t>
+        <w:t>"topGO"</w:t>
       </w:r>
       <w:r>
         <w:rPr>
@@ -918,9 +948,32 @@
           <w:lang w:eastAsia="en-GB"/>
           <w14:ligatures w14:val="none"/>
         </w:rPr>
-        <w:t>"</w:t>
-      </w:r>
-      <w:proofErr w:type="spellStart"/>
+        <w:t>"ALL"</w:t>
+      </w:r>
+      <w:r>
+        <w:rPr>
+          <w:rFonts w:ascii="Menlo" w:eastAsia="Times New Roman" w:hAnsi="Menlo" w:cs="Menlo"/>
+          <w:color w:val="000000"/>
+          <w:kern w:val="0"/>
+          <w:sz w:val="20"/>
+          <w:szCs w:val="20"/>
+          <w:lang w:eastAsia="en-GB"/>
+          <w14:ligatures w14:val="none"/>
+        </w:rPr>
+        <w:t>,</w:t>
+      </w:r>
+      <w:r>
+        <w:rPr>
+          <w:rFonts w:ascii="Menlo" w:eastAsia="Times New Roman" w:hAnsi="Menlo" w:cs="Menlo"/>
+          <w:color w:val="BBBBBB"/>
+          <w:kern w:val="0"/>
+          <w:sz w:val="20"/>
+          <w:szCs w:val="20"/>
+          <w:lang w:eastAsia="en-GB"/>
+          <w14:ligatures w14:val="none"/>
+        </w:rPr>
+        <w:t xml:space="preserve"> </w:t>
+      </w:r>
       <w:r>
         <w:rPr>
           <w:rFonts w:ascii="Menlo" w:eastAsia="Times New Roman" w:hAnsi="Menlo" w:cs="Menlo"/>
@@ -931,9 +984,32 @@
           <w:lang w:eastAsia="en-GB"/>
           <w14:ligatures w14:val="none"/>
         </w:rPr>
-        <w:t>vsn</w:t>
-      </w:r>
-      <w:proofErr w:type="spellEnd"/>
+        <w:t>"Biobase"</w:t>
+      </w:r>
+      <w:r>
+        <w:rPr>
+          <w:rFonts w:ascii="Menlo" w:eastAsia="Times New Roman" w:hAnsi="Menlo" w:cs="Menlo"/>
+          <w:color w:val="000000"/>
+          <w:kern w:val="0"/>
+          <w:sz w:val="20"/>
+          <w:szCs w:val="20"/>
+          <w:lang w:eastAsia="en-GB"/>
+          <w14:ligatures w14:val="none"/>
+        </w:rPr>
+        <w:t>,</w:t>
+      </w:r>
+      <w:r>
+        <w:rPr>
+          <w:rFonts w:ascii="Menlo" w:eastAsia="Times New Roman" w:hAnsi="Menlo" w:cs="Menlo"/>
+          <w:color w:val="BBBBBB"/>
+          <w:kern w:val="0"/>
+          <w:sz w:val="20"/>
+          <w:szCs w:val="20"/>
+          <w:lang w:eastAsia="en-GB"/>
+          <w14:ligatures w14:val="none"/>
+        </w:rPr>
+        <w:t xml:space="preserve"> </w:t>
+      </w:r>
       <w:r>
         <w:rPr>
           <w:rFonts w:ascii="Menlo" w:eastAsia="Times New Roman" w:hAnsi="Menlo" w:cs="Menlo"/>
@@ -944,425 +1020,7 @@
           <w:lang w:eastAsia="en-GB"/>
           <w14:ligatures w14:val="none"/>
         </w:rPr>
-        <w:t>"</w:t>
-      </w:r>
-      <w:r>
-        <w:rPr>
-          <w:rFonts w:ascii="Menlo" w:eastAsia="Times New Roman" w:hAnsi="Menlo" w:cs="Menlo"/>
-          <w:color w:val="000000"/>
-          <w:kern w:val="0"/>
-          <w:sz w:val="20"/>
-          <w:szCs w:val="20"/>
-          <w:lang w:eastAsia="en-GB"/>
-          <w14:ligatures w14:val="none"/>
-        </w:rPr>
-        <w:t>,</w:t>
-      </w:r>
-      <w:r>
-        <w:rPr>
-          <w:rFonts w:ascii="Menlo" w:eastAsia="Times New Roman" w:hAnsi="Menlo" w:cs="Menlo"/>
-          <w:color w:val="BBBBBB"/>
-          <w:kern w:val="0"/>
-          <w:sz w:val="20"/>
-          <w:szCs w:val="20"/>
-          <w:lang w:eastAsia="en-GB"/>
-          <w14:ligatures w14:val="none"/>
-        </w:rPr>
-        <w:t xml:space="preserve"> </w:t>
-      </w:r>
-      <w:r>
-        <w:rPr>
-          <w:rFonts w:ascii="Menlo" w:eastAsia="Times New Roman" w:hAnsi="Menlo" w:cs="Menlo"/>
-          <w:color w:val="D01040"/>
-          <w:kern w:val="0"/>
-          <w:sz w:val="20"/>
-          <w:szCs w:val="20"/>
-          <w:lang w:eastAsia="en-GB"/>
-          <w14:ligatures w14:val="none"/>
-        </w:rPr>
-        <w:t>"hu6800.db"</w:t>
-      </w:r>
-      <w:r>
-        <w:rPr>
-          <w:rFonts w:ascii="Menlo" w:eastAsia="Times New Roman" w:hAnsi="Menlo" w:cs="Menlo"/>
-          <w:color w:val="000000"/>
-          <w:kern w:val="0"/>
-          <w:sz w:val="20"/>
-          <w:szCs w:val="20"/>
-          <w:lang w:eastAsia="en-GB"/>
-          <w14:ligatures w14:val="none"/>
-        </w:rPr>
-        <w:t>,</w:t>
-      </w:r>
-      <w:r>
-        <w:rPr>
-          <w:rFonts w:ascii="Menlo" w:eastAsia="Times New Roman" w:hAnsi="Menlo" w:cs="Menlo"/>
-          <w:color w:val="BBBBBB"/>
-          <w:kern w:val="0"/>
-          <w:sz w:val="20"/>
-          <w:szCs w:val="20"/>
-          <w:lang w:eastAsia="en-GB"/>
-          <w14:ligatures w14:val="none"/>
-        </w:rPr>
-        <w:t xml:space="preserve"> </w:t>
-      </w:r>
-      <w:r>
-        <w:rPr>
-          <w:rFonts w:ascii="Menlo" w:eastAsia="Times New Roman" w:hAnsi="Menlo" w:cs="Menlo"/>
-          <w:color w:val="D01040"/>
-          <w:kern w:val="0"/>
-          <w:sz w:val="20"/>
-          <w:szCs w:val="20"/>
-          <w:lang w:eastAsia="en-GB"/>
-          <w14:ligatures w14:val="none"/>
-        </w:rPr>
-        <w:t>"</w:t>
-      </w:r>
-      <w:proofErr w:type="spellStart"/>
-      <w:r>
-        <w:rPr>
-          <w:rFonts w:ascii="Menlo" w:eastAsia="Times New Roman" w:hAnsi="Menlo" w:cs="Menlo"/>
-          <w:color w:val="D01040"/>
-          <w:kern w:val="0"/>
-          <w:sz w:val="20"/>
-          <w:szCs w:val="20"/>
-          <w:lang w:eastAsia="en-GB"/>
-          <w14:ligatures w14:val="none"/>
-        </w:rPr>
-        <w:t>GO.db</w:t>
-      </w:r>
-      <w:proofErr w:type="spellEnd"/>
-      <w:r>
-        <w:rPr>
-          <w:rFonts w:ascii="Menlo" w:eastAsia="Times New Roman" w:hAnsi="Menlo" w:cs="Menlo"/>
-          <w:color w:val="D01040"/>
-          <w:kern w:val="0"/>
-          <w:sz w:val="20"/>
-          <w:szCs w:val="20"/>
-          <w:lang w:eastAsia="en-GB"/>
-          <w14:ligatures w14:val="none"/>
-        </w:rPr>
-        <w:t>"</w:t>
-      </w:r>
-      <w:r>
-        <w:rPr>
-          <w:rFonts w:ascii="Menlo" w:eastAsia="Times New Roman" w:hAnsi="Menlo" w:cs="Menlo"/>
-          <w:color w:val="000000"/>
-          <w:kern w:val="0"/>
-          <w:sz w:val="20"/>
-          <w:szCs w:val="20"/>
-          <w:lang w:eastAsia="en-GB"/>
-          <w14:ligatures w14:val="none"/>
-        </w:rPr>
-        <w:t>,</w:t>
-      </w:r>
-      <w:r>
-        <w:rPr>
-          <w:rFonts w:ascii="Menlo" w:eastAsia="Times New Roman" w:hAnsi="Menlo" w:cs="Menlo"/>
-          <w:color w:val="BBBBBB"/>
-          <w:kern w:val="0"/>
-          <w:sz w:val="20"/>
-          <w:szCs w:val="20"/>
-          <w:lang w:eastAsia="en-GB"/>
-          <w14:ligatures w14:val="none"/>
-        </w:rPr>
-        <w:t xml:space="preserve"> </w:t>
-      </w:r>
-      <w:r>
-        <w:rPr>
-          <w:rFonts w:ascii="Menlo" w:eastAsia="Times New Roman" w:hAnsi="Menlo" w:cs="Menlo"/>
-          <w:color w:val="D01040"/>
-          <w:kern w:val="0"/>
-          <w:sz w:val="20"/>
-          <w:szCs w:val="20"/>
-          <w:lang w:eastAsia="en-GB"/>
-          <w14:ligatures w14:val="none"/>
-        </w:rPr>
-        <w:t>"</w:t>
-      </w:r>
-      <w:proofErr w:type="spellStart"/>
-      <w:r>
-        <w:rPr>
-          <w:rFonts w:ascii="Menlo" w:eastAsia="Times New Roman" w:hAnsi="Menlo" w:cs="Menlo"/>
-          <w:color w:val="D01040"/>
-          <w:kern w:val="0"/>
-          <w:sz w:val="20"/>
-          <w:szCs w:val="20"/>
-          <w:lang w:eastAsia="en-GB"/>
-          <w14:ligatures w14:val="none"/>
-        </w:rPr>
-        <w:t>AnnotationDbi</w:t>
-      </w:r>
-      <w:proofErr w:type="spellEnd"/>
-      <w:r>
-        <w:rPr>
-          <w:rFonts w:ascii="Menlo" w:eastAsia="Times New Roman" w:hAnsi="Menlo" w:cs="Menlo"/>
-          <w:color w:val="D01040"/>
-          <w:kern w:val="0"/>
-          <w:sz w:val="20"/>
-          <w:szCs w:val="20"/>
-          <w:lang w:eastAsia="en-GB"/>
-          <w14:ligatures w14:val="none"/>
-        </w:rPr>
-        <w:t>"</w:t>
-      </w:r>
-      <w:r>
-        <w:rPr>
-          <w:rFonts w:ascii="Menlo" w:eastAsia="Times New Roman" w:hAnsi="Menlo" w:cs="Menlo"/>
-          <w:color w:val="000000"/>
-          <w:kern w:val="0"/>
-          <w:sz w:val="20"/>
-          <w:szCs w:val="20"/>
-          <w:lang w:eastAsia="en-GB"/>
-          <w14:ligatures w14:val="none"/>
-        </w:rPr>
-        <w:t>,</w:t>
-      </w:r>
-      <w:r>
-        <w:rPr>
-          <w:rFonts w:ascii="Menlo" w:eastAsia="Times New Roman" w:hAnsi="Menlo" w:cs="Menlo"/>
-          <w:color w:val="BBBBBB"/>
-          <w:kern w:val="0"/>
-          <w:sz w:val="20"/>
-          <w:szCs w:val="20"/>
-          <w:lang w:eastAsia="en-GB"/>
-          <w14:ligatures w14:val="none"/>
-        </w:rPr>
-        <w:t xml:space="preserve"> </w:t>
-      </w:r>
-      <w:r>
-        <w:rPr>
-          <w:rFonts w:ascii="Menlo" w:eastAsia="Times New Roman" w:hAnsi="Menlo" w:cs="Menlo"/>
-          <w:color w:val="D01040"/>
-          <w:kern w:val="0"/>
-          <w:sz w:val="20"/>
-          <w:szCs w:val="20"/>
-          <w:lang w:eastAsia="en-GB"/>
-          <w14:ligatures w14:val="none"/>
-        </w:rPr>
-        <w:t>"annotate"</w:t>
-      </w:r>
-      <w:r>
-        <w:rPr>
-          <w:rFonts w:ascii="Menlo" w:eastAsia="Times New Roman" w:hAnsi="Menlo" w:cs="Menlo"/>
-          <w:color w:val="000000"/>
-          <w:kern w:val="0"/>
-          <w:sz w:val="20"/>
-          <w:szCs w:val="20"/>
-          <w:lang w:eastAsia="en-GB"/>
-          <w14:ligatures w14:val="none"/>
-        </w:rPr>
-        <w:t>,</w:t>
-      </w:r>
-      <w:r>
-        <w:rPr>
-          <w:rFonts w:ascii="Menlo" w:eastAsia="Times New Roman" w:hAnsi="Menlo" w:cs="Menlo"/>
-          <w:color w:val="BBBBBB"/>
-          <w:kern w:val="0"/>
-          <w:sz w:val="20"/>
-          <w:szCs w:val="20"/>
-          <w:lang w:eastAsia="en-GB"/>
-          <w14:ligatures w14:val="none"/>
-        </w:rPr>
-        <w:t xml:space="preserve"> </w:t>
-      </w:r>
-      <w:r>
-        <w:rPr>
-          <w:rFonts w:ascii="Menlo" w:eastAsia="Times New Roman" w:hAnsi="Menlo" w:cs="Menlo"/>
-          <w:color w:val="D01040"/>
-          <w:kern w:val="0"/>
-          <w:sz w:val="20"/>
-          <w:szCs w:val="20"/>
-          <w:lang w:eastAsia="en-GB"/>
-          <w14:ligatures w14:val="none"/>
-        </w:rPr>
-        <w:t>"</w:t>
-      </w:r>
-      <w:proofErr w:type="spellStart"/>
-      <w:r>
-        <w:rPr>
-          <w:rFonts w:ascii="Menlo" w:eastAsia="Times New Roman" w:hAnsi="Menlo" w:cs="Menlo"/>
-          <w:color w:val="D01040"/>
-          <w:kern w:val="0"/>
-          <w:sz w:val="20"/>
-          <w:szCs w:val="20"/>
-          <w:lang w:eastAsia="en-GB"/>
-          <w14:ligatures w14:val="none"/>
-        </w:rPr>
-        <w:t>topGO</w:t>
-      </w:r>
-      <w:proofErr w:type="spellEnd"/>
-      <w:r>
-        <w:rPr>
-          <w:rFonts w:ascii="Menlo" w:eastAsia="Times New Roman" w:hAnsi="Menlo" w:cs="Menlo"/>
-          <w:color w:val="D01040"/>
-          <w:kern w:val="0"/>
-          <w:sz w:val="20"/>
-          <w:szCs w:val="20"/>
-          <w:lang w:eastAsia="en-GB"/>
-          <w14:ligatures w14:val="none"/>
-        </w:rPr>
-        <w:t>"</w:t>
-      </w:r>
-      <w:r>
-        <w:rPr>
-          <w:rFonts w:ascii="Menlo" w:eastAsia="Times New Roman" w:hAnsi="Menlo" w:cs="Menlo"/>
-          <w:color w:val="000000"/>
-          <w:kern w:val="0"/>
-          <w:sz w:val="20"/>
-          <w:szCs w:val="20"/>
-          <w:lang w:eastAsia="en-GB"/>
-          <w14:ligatures w14:val="none"/>
-        </w:rPr>
-        <w:t>,</w:t>
-      </w:r>
-      <w:r>
-        <w:rPr>
-          <w:rFonts w:ascii="Menlo" w:eastAsia="Times New Roman" w:hAnsi="Menlo" w:cs="Menlo"/>
-          <w:color w:val="BBBBBB"/>
-          <w:kern w:val="0"/>
-          <w:sz w:val="20"/>
-          <w:szCs w:val="20"/>
-          <w:lang w:eastAsia="en-GB"/>
-          <w14:ligatures w14:val="none"/>
-        </w:rPr>
-        <w:t xml:space="preserve"> </w:t>
-      </w:r>
-      <w:r>
-        <w:rPr>
-          <w:rFonts w:ascii="Menlo" w:eastAsia="Times New Roman" w:hAnsi="Menlo" w:cs="Menlo"/>
-          <w:color w:val="D01040"/>
-          <w:kern w:val="0"/>
-          <w:sz w:val="20"/>
-          <w:szCs w:val="20"/>
-          <w:lang w:eastAsia="en-GB"/>
-          <w14:ligatures w14:val="none"/>
-        </w:rPr>
-        <w:t>"ALL"</w:t>
-      </w:r>
-      <w:r>
-        <w:rPr>
-          <w:rFonts w:ascii="Menlo" w:eastAsia="Times New Roman" w:hAnsi="Menlo" w:cs="Menlo"/>
-          <w:color w:val="000000"/>
-          <w:kern w:val="0"/>
-          <w:sz w:val="20"/>
-          <w:szCs w:val="20"/>
-          <w:lang w:eastAsia="en-GB"/>
-          <w14:ligatures w14:val="none"/>
-        </w:rPr>
-        <w:t>,</w:t>
-      </w:r>
-      <w:r>
-        <w:rPr>
-          <w:rFonts w:ascii="Menlo" w:eastAsia="Times New Roman" w:hAnsi="Menlo" w:cs="Menlo"/>
-          <w:color w:val="BBBBBB"/>
-          <w:kern w:val="0"/>
-          <w:sz w:val="20"/>
-          <w:szCs w:val="20"/>
-          <w:lang w:eastAsia="en-GB"/>
-          <w14:ligatures w14:val="none"/>
-        </w:rPr>
-        <w:t xml:space="preserve"> </w:t>
-      </w:r>
-      <w:r>
-        <w:rPr>
-          <w:rFonts w:ascii="Menlo" w:eastAsia="Times New Roman" w:hAnsi="Menlo" w:cs="Menlo"/>
-          <w:color w:val="D01040"/>
-          <w:kern w:val="0"/>
-          <w:sz w:val="20"/>
-          <w:szCs w:val="20"/>
-          <w:lang w:eastAsia="en-GB"/>
-          <w14:ligatures w14:val="none"/>
-        </w:rPr>
-        <w:t>"</w:t>
-      </w:r>
-      <w:proofErr w:type="spellStart"/>
-      <w:r>
-        <w:rPr>
-          <w:rFonts w:ascii="Menlo" w:eastAsia="Times New Roman" w:hAnsi="Menlo" w:cs="Menlo"/>
-          <w:color w:val="D01040"/>
-          <w:kern w:val="0"/>
-          <w:sz w:val="20"/>
-          <w:szCs w:val="20"/>
-          <w:lang w:eastAsia="en-GB"/>
-          <w14:ligatures w14:val="none"/>
-        </w:rPr>
-        <w:t>Biobase</w:t>
-      </w:r>
-      <w:proofErr w:type="spellEnd"/>
-      <w:r>
-        <w:rPr>
-          <w:rFonts w:ascii="Menlo" w:eastAsia="Times New Roman" w:hAnsi="Menlo" w:cs="Menlo"/>
-          <w:color w:val="D01040"/>
-          <w:kern w:val="0"/>
-          <w:sz w:val="20"/>
-          <w:szCs w:val="20"/>
-          <w:lang w:eastAsia="en-GB"/>
-          <w14:ligatures w14:val="none"/>
-        </w:rPr>
-        <w:t>"</w:t>
-      </w:r>
-      <w:r>
-        <w:rPr>
-          <w:rFonts w:ascii="Menlo" w:eastAsia="Times New Roman" w:hAnsi="Menlo" w:cs="Menlo"/>
-          <w:color w:val="000000"/>
-          <w:kern w:val="0"/>
-          <w:sz w:val="20"/>
-          <w:szCs w:val="20"/>
-          <w:lang w:eastAsia="en-GB"/>
-          <w14:ligatures w14:val="none"/>
-        </w:rPr>
-        <w:t>,</w:t>
-      </w:r>
-      <w:r>
-        <w:rPr>
-          <w:rFonts w:ascii="Menlo" w:eastAsia="Times New Roman" w:hAnsi="Menlo" w:cs="Menlo"/>
-          <w:color w:val="BBBBBB"/>
-          <w:kern w:val="0"/>
-          <w:sz w:val="20"/>
-          <w:szCs w:val="20"/>
-          <w:lang w:eastAsia="en-GB"/>
-          <w14:ligatures w14:val="none"/>
-        </w:rPr>
-        <w:t xml:space="preserve"> </w:t>
-      </w:r>
-      <w:r>
-        <w:rPr>
-          <w:rFonts w:ascii="Menlo" w:eastAsia="Times New Roman" w:hAnsi="Menlo" w:cs="Menlo"/>
-          <w:color w:val="D01040"/>
-          <w:kern w:val="0"/>
-          <w:sz w:val="20"/>
-          <w:szCs w:val="20"/>
-          <w:lang w:eastAsia="en-GB"/>
-          <w14:ligatures w14:val="none"/>
-        </w:rPr>
-        <w:t>"</w:t>
-      </w:r>
-      <w:proofErr w:type="spellStart"/>
-      <w:r>
-        <w:rPr>
-          <w:rFonts w:ascii="Menlo" w:eastAsia="Times New Roman" w:hAnsi="Menlo" w:cs="Menlo"/>
-          <w:color w:val="D01040"/>
-          <w:kern w:val="0"/>
-          <w:sz w:val="20"/>
-          <w:szCs w:val="20"/>
-          <w:lang w:eastAsia="en-GB"/>
-          <w14:ligatures w14:val="none"/>
-        </w:rPr>
-        <w:t>limma</w:t>
-      </w:r>
-      <w:proofErr w:type="spellEnd"/>
-      <w:r>
-        <w:rPr>
-          <w:rFonts w:ascii="Menlo" w:eastAsia="Times New Roman" w:hAnsi="Menlo" w:cs="Menlo"/>
-          <w:color w:val="D01040"/>
-          <w:kern w:val="0"/>
-          <w:sz w:val="20"/>
-          <w:szCs w:val="20"/>
-          <w:lang w:eastAsia="en-GB"/>
-          <w14:ligatures w14:val="none"/>
-        </w:rPr>
-        <w:t>"</w:t>
+        <w:t>"limma"</w:t>
       </w:r>
       <w:r>
         <w:rPr>
@@ -1475,15 +1133,7 @@
         </w:numPr>
       </w:pPr>
       <w:r>
-        <w:t xml:space="preserve">Replace </w:t>
-      </w:r>
-      <w:proofErr w:type="spellStart"/>
-      <w:r>
-        <w:t>hdm</w:t>
-      </w:r>
-      <w:proofErr w:type="spellEnd"/>
-      <w:r>
-        <w:t xml:space="preserve"> with der p 1 (active/inactive) as well?</w:t>
+        <w:t>Replace hdm with der p 1 (active/inactive) as well?</w:t>
       </w:r>
     </w:p>
     <w:p>
@@ -1495,23 +1145,7 @@
         </w:numPr>
       </w:pPr>
       <w:r>
-        <w:t>Remove ‘has</w:t>
-      </w:r>
-      <w:proofErr w:type="gramStart"/>
-      <w:r>
-        <w:t>-‘ from</w:t>
-      </w:r>
-      <w:proofErr w:type="gramEnd"/>
-      <w:r>
-        <w:t xml:space="preserve"> micro </w:t>
-      </w:r>
-      <w:proofErr w:type="spellStart"/>
-      <w:r>
-        <w:t>rna</w:t>
-      </w:r>
-      <w:proofErr w:type="spellEnd"/>
-      <w:r>
-        <w:t xml:space="preserve"> names. Looks like people just have it as miR-574-5p instead of hsa-miR-574-5p in research papers.</w:t>
+        <w:t>Remove ‘has-‘ from micro rna names. Looks like people just have it as miR-574-5p instead of hsa-miR-574-5p in research papers.</w:t>
       </w:r>
     </w:p>
     <w:p>
@@ -1536,6 +1170,81 @@
       </w:pPr>
       <w:r>
         <w:t>Need to make sure all plots say ‘untreated’ because saying control is ambiguous – as you can have positive and negative controls</w:t>
+      </w:r>
+    </w:p>
+    <w:p>
+      <w:pPr>
+        <w:pStyle w:val="ListParagraph"/>
+        <w:numPr>
+          <w:ilvl w:val="0"/>
+          <w:numId w:val="1"/>
+        </w:numPr>
+      </w:pPr>
+      <w:r>
+        <w:t>Make it sound like a story</w:t>
+      </w:r>
+    </w:p>
+    <w:p>
+      <w:pPr>
+        <w:pStyle w:val="ListParagraph"/>
+        <w:numPr>
+          <w:ilvl w:val="1"/>
+          <w:numId w:val="1"/>
+        </w:numPr>
+      </w:pPr>
+      <w:r>
+        <w:t>Figure out what the data say</w:t>
+      </w:r>
+    </w:p>
+    <w:p>
+      <w:pPr>
+        <w:pStyle w:val="ListParagraph"/>
+        <w:numPr>
+          <w:ilvl w:val="1"/>
+          <w:numId w:val="1"/>
+        </w:numPr>
+      </w:pPr>
+      <w:r>
+        <w:t>Make sure it aligns with the intro/aims</w:t>
+      </w:r>
+    </w:p>
+    <w:p>
+      <w:pPr>
+        <w:pStyle w:val="ListParagraph"/>
+        <w:numPr>
+          <w:ilvl w:val="1"/>
+          <w:numId w:val="1"/>
+        </w:numPr>
+      </w:pPr>
+      <w:r>
+        <w:t>All results section should be relevant to the research question</w:t>
+      </w:r>
+    </w:p>
+    <w:p>
+      <w:pPr>
+        <w:pStyle w:val="ListParagraph"/>
+        <w:numPr>
+          <w:ilvl w:val="1"/>
+          <w:numId w:val="1"/>
+        </w:numPr>
+      </w:pPr>
+      <w:r>
+        <w:t xml:space="preserve">Need to label each DE plot with interesting miRNAs </w:t>
+      </w:r>
+      <w:r>
+        <w:t xml:space="preserve">that get mentioned in the results body </w:t>
+      </w:r>
+    </w:p>
+    <w:p>
+      <w:pPr>
+        <w:pStyle w:val="ListParagraph"/>
+        <w:numPr>
+          <w:ilvl w:val="2"/>
+          <w:numId w:val="1"/>
+        </w:numPr>
+      </w:pPr>
+      <w:r>
+        <w:t>Need to decide whether I’m looking at the most DE miRNAs or ones associated with key pathways</w:t>
       </w:r>
     </w:p>
     <w:p>
@@ -1589,6 +1298,7 @@
         <w:rPr>
           <w:noProof/>
         </w:rPr>
+        <w:lastRenderedPageBreak/>
         <w:drawing>
           <wp:inline distT="0" distB="0" distL="0" distR="0" wp14:anchorId="0F52D6F4" wp14:editId="62993AA3">
             <wp:extent cx="5731510" cy="955040"/>
@@ -1679,15 +1389,7 @@
         </w:numPr>
       </w:pPr>
       <w:r>
-        <w:t xml:space="preserve">See bioinformatics section of the methods. This paper is from </w:t>
-      </w:r>
-      <w:proofErr w:type="spellStart"/>
-      <w:r>
-        <w:t>tamiRNA</w:t>
-      </w:r>
-      <w:proofErr w:type="spellEnd"/>
-      <w:r>
-        <w:t xml:space="preserve"> analysis of their propriety miRNA workflow </w:t>
+        <w:t xml:space="preserve">See bioinformatics section of the methods. This paper is from tamiRNA analysis of their propriety miRNA workflow </w:t>
       </w:r>
       <w:hyperlink r:id="rId15" w:history="1">
         <w:r>
@@ -1706,7 +1408,6 @@
         <w:rPr>
           <w:noProof/>
         </w:rPr>
-        <w:lastRenderedPageBreak/>
         <w:drawing>
           <wp:inline distT="0" distB="0" distL="0" distR="0" wp14:anchorId="67F6F1FD" wp14:editId="63B20F00">
             <wp:extent cx="5731510" cy="2835910"/>
@@ -1776,15 +1477,7 @@
         </w:numPr>
       </w:pPr>
       <w:r>
-        <w:t xml:space="preserve">Got some good training videos for pathway enrichment </w:t>
-      </w:r>
-      <w:proofErr w:type="spellStart"/>
-      <w:r>
-        <w:t>anlysis</w:t>
-      </w:r>
-      <w:proofErr w:type="spellEnd"/>
-      <w:r>
-        <w:t xml:space="preserve"> etc. </w:t>
+        <w:t xml:space="preserve">Got some good training videos for pathway enrichment anlysis etc. </w:t>
       </w:r>
       <w:hyperlink r:id="rId17" w:history="1">
         <w:r>
@@ -1841,11 +1534,9 @@
           <w:numId w:val="1"/>
         </w:numPr>
       </w:pPr>
-      <w:proofErr w:type="spellStart"/>
       <w:r>
         <w:t>clusterProfiler</w:t>
       </w:r>
-      <w:proofErr w:type="spellEnd"/>
     </w:p>
     <w:p>
       <w:pPr>
@@ -1855,11 +1546,9 @@
           <w:numId w:val="1"/>
         </w:numPr>
       </w:pPr>
-      <w:proofErr w:type="spellStart"/>
       <w:r>
         <w:t>ReactomePA</w:t>
       </w:r>
-      <w:proofErr w:type="spellEnd"/>
     </w:p>
     <w:p>
       <w:pPr>
@@ -1869,11 +1558,9 @@
           <w:numId w:val="1"/>
         </w:numPr>
       </w:pPr>
-      <w:proofErr w:type="spellStart"/>
       <w:r>
         <w:t>enrichplot</w:t>
       </w:r>
-      <w:proofErr w:type="spellEnd"/>
     </w:p>
     <w:p>
       <w:pPr>
@@ -1883,11 +1570,9 @@
           <w:numId w:val="1"/>
         </w:numPr>
       </w:pPr>
-      <w:proofErr w:type="spellStart"/>
       <w:r>
         <w:t>fgsea</w:t>
       </w:r>
-      <w:proofErr w:type="spellEnd"/>
     </w:p>
     <w:p>
       <w:pPr>
@@ -1917,37 +1602,9 @@
           <w:numId w:val="1"/>
         </w:numPr>
       </w:pPr>
-      <w:proofErr w:type="spellStart"/>
-      <w:r>
-        <w:t>ToppGene</w:t>
-      </w:r>
-      <w:proofErr w:type="spellEnd"/>
-      <w:r>
-        <w:t xml:space="preserve"> was used for functional enrichment analysis of the miRNA targets (51) with a Bonferroni FDR &lt;0.05. Biological process gene ontology (GO) terms generated through </w:t>
-      </w:r>
-      <w:proofErr w:type="spellStart"/>
-      <w:r>
-        <w:t>ToppGene</w:t>
-      </w:r>
-      <w:proofErr w:type="spellEnd"/>
-      <w:r>
-        <w:t xml:space="preserve"> were then summarised, and </w:t>
-      </w:r>
-      <w:proofErr w:type="spellStart"/>
-      <w:r>
-        <w:t>REViGO</w:t>
-      </w:r>
-      <w:proofErr w:type="spellEnd"/>
-      <w:r>
-        <w:t xml:space="preserve"> (52) and </w:t>
-      </w:r>
-      <w:proofErr w:type="spellStart"/>
-      <w:r>
-        <w:t>Cytoscape</w:t>
-      </w:r>
-      <w:proofErr w:type="spellEnd"/>
-      <w:r>
-        <w:t xml:space="preserve"> (53) were used to visualise the network.</w:t>
+      <w:r>
+        <w:lastRenderedPageBreak/>
+        <w:t>ToppGene was used for functional enrichment analysis of the miRNA targets (51) with a Bonferroni FDR &lt;0.05. Biological process gene ontology (GO) terms generated through ToppGene were then summarised, and REViGO (52) and Cytoscape (53) were used to visualise the network.</w:t>
       </w:r>
       <w:r>
         <w:t xml:space="preserve"> </w:t>
@@ -1982,15 +1639,7 @@
         </w:numPr>
       </w:pPr>
       <w:r>
-        <w:t xml:space="preserve">Use </w:t>
-      </w:r>
-      <w:proofErr w:type="spellStart"/>
-      <w:r>
-        <w:t>plotly</w:t>
-      </w:r>
-      <w:proofErr w:type="spellEnd"/>
-      <w:r>
-        <w:t xml:space="preserve"> in r for interactive plots. See for details </w:t>
+        <w:t xml:space="preserve">Use plotly in r for interactive plots. See for details </w:t>
       </w:r>
       <w:r>
         <w:sym w:font="Wingdings" w:char="F0E0"/>
@@ -2126,7 +1775,6 @@
           <w:numId w:val="3"/>
         </w:numPr>
       </w:pPr>
-      <w:proofErr w:type="gramStart"/>
       <w:r>
         <w:t>let</w:t>
       </w:r>
@@ -2134,11 +1782,7 @@
         <w:t>-</w:t>
       </w:r>
       <w:r>
-        <w:t>7</w:t>
-      </w:r>
-      <w:proofErr w:type="gramEnd"/>
-      <w:r>
-        <w:t xml:space="preserve"> </w:t>
+        <w:t xml:space="preserve">7 </w:t>
       </w:r>
       <w:r>
         <w:t>=</w:t>
@@ -2291,6 +1935,7 @@
         <w:rPr>
           <w:noProof/>
         </w:rPr>
+        <w:lastRenderedPageBreak/>
         <w:drawing>
           <wp:inline distT="0" distB="0" distL="0" distR="0" wp14:anchorId="6415A522" wp14:editId="593C753A">
             <wp:extent cx="5731510" cy="1586865"/>
@@ -2378,7 +2023,6 @@
           <w:b/>
           <w:bCs/>
         </w:rPr>
-        <w:lastRenderedPageBreak/>
         <w:t xml:space="preserve">Extract from project pt1 paper </w:t>
       </w:r>
       <w:r>
@@ -2396,39 +2040,7 @@
         <w:t xml:space="preserve"> </w:t>
       </w:r>
       <w:r>
-        <w:t xml:space="preserve">Next-generation sequencing (NGS) data was analysed using the </w:t>
-      </w:r>
-      <w:proofErr w:type="spellStart"/>
-      <w:r>
-        <w:t>miND</w:t>
-      </w:r>
-      <w:proofErr w:type="spellEnd"/>
-      <w:r>
-        <w:t xml:space="preserve">® analysis pipeline (20). The resulting differentially expressed miRNAs were investigated using Qiagen Ingenuity Pathway Software. This analysis used MicroRNA Target Filter to identify the gene targets of the differentially expressed miRNAs, genes were selected based on experimental evidence from </w:t>
-      </w:r>
-      <w:proofErr w:type="spellStart"/>
-      <w:r>
-        <w:t>TargetScan</w:t>
-      </w:r>
-      <w:proofErr w:type="spellEnd"/>
-      <w:r>
-        <w:t xml:space="preserve">. </w:t>
-      </w:r>
-      <w:proofErr w:type="spellStart"/>
-      <w:r>
-        <w:t>TarBase</w:t>
-      </w:r>
-      <w:proofErr w:type="spellEnd"/>
-      <w:r>
-        <w:t xml:space="preserve">, </w:t>
-      </w:r>
-      <w:proofErr w:type="spellStart"/>
-      <w:r>
-        <w:t>miRecords</w:t>
-      </w:r>
-      <w:proofErr w:type="spellEnd"/>
-      <w:r>
-        <w:t xml:space="preserve"> and Ingenuity Knowledge Base. The miRNA-gene pairings were matched based on the directionality of the miRNA abundance and used to perform pathway enrichment analysis.</w:t>
+        <w:t>Next-generation sequencing (NGS) data was analysed using the miND® analysis pipeline (20). The resulting differentially expressed miRNAs were investigated using Qiagen Ingenuity Pathway Software. This analysis used MicroRNA Target Filter to identify the gene targets of the differentially expressed miRNAs, genes were selected based on experimental evidence from TargetScan. TarBase, miRecords and Ingenuity Knowledge Base. The miRNA-gene pairings were matched based on the directionality of the miRNA abundance and used to perform pathway enrichment analysis.</w:t>
       </w:r>
     </w:p>
     <w:p>
@@ -2525,6 +2137,7 @@
           <w:b/>
           <w:bCs/>
         </w:rPr>
+        <w:lastRenderedPageBreak/>
         <w:t xml:space="preserve">Potential open-source pipelines for pathway analysis </w:t>
       </w:r>
       <w:r>
@@ -2553,13 +2166,8 @@
           <w:numId w:val="7"/>
         </w:numPr>
       </w:pPr>
-      <w:proofErr w:type="spellStart"/>
-      <w:r>
-        <w:t>TargetFinder</w:t>
-      </w:r>
-      <w:proofErr w:type="spellEnd"/>
-      <w:r>
-        <w:t>: A widely used command-line tool designed by the Carrington Lab to computationally predict small RNA binding sites on target transcripts.</w:t>
+      <w:r>
+        <w:t>TargetFinder: A widely used command-line tool designed by the Carrington Lab to computationally predict small RNA binding sites on target transcripts.</w:t>
       </w:r>
     </w:p>
     <w:p>
@@ -2570,21 +2178,8 @@
           <w:numId w:val="7"/>
         </w:numPr>
       </w:pPr>
-      <w:proofErr w:type="spellStart"/>
-      <w:r>
-        <w:t>MiRNATarget</w:t>
-      </w:r>
-      <w:proofErr w:type="spellEnd"/>
-      <w:r>
-        <w:t xml:space="preserve">: A command-line wrapper for the </w:t>
-      </w:r>
-      <w:proofErr w:type="spellStart"/>
-      <w:r>
-        <w:t>psRNATarget</w:t>
-      </w:r>
-      <w:proofErr w:type="spellEnd"/>
-      <w:r>
-        <w:t xml:space="preserve"> workflow that identifies potential miRNA target locations across a genome.</w:t>
+      <w:r>
+        <w:t>MiRNATarget: A command-line wrapper for the psRNATarget workflow that identifies potential miRNA target locations across a genome.</w:t>
       </w:r>
     </w:p>
     <w:p>
@@ -2595,13 +2190,8 @@
           <w:numId w:val="7"/>
         </w:numPr>
       </w:pPr>
-      <w:proofErr w:type="spellStart"/>
-      <w:r>
-        <w:t>miRTarget</w:t>
-      </w:r>
-      <w:proofErr w:type="spellEnd"/>
-      <w:r>
-        <w:t>: A package that pulls predicted miRNA targets by aggregating results across multiple established databases. [1, 2, 3, 4, 5]</w:t>
+      <w:r>
+        <w:t>miRTarget: A package that pulls predicted miRNA targets by aggregating results across multiple established databases. [1, 2, 3, 4, 5]</w:t>
       </w:r>
     </w:p>
     <w:p>
@@ -2617,68 +2207,22 @@
         <w:pStyle w:val="ListParagraph"/>
       </w:pPr>
       <w:r>
-        <w:t xml:space="preserve">GitHub - </w:t>
-      </w:r>
-      <w:proofErr w:type="spellStart"/>
-      <w:r>
-        <w:t>jtremblay</w:t>
-      </w:r>
-      <w:proofErr w:type="spellEnd"/>
-      <w:r>
-        <w:t>/</w:t>
-      </w:r>
-      <w:proofErr w:type="spellStart"/>
-      <w:r>
-        <w:t>MiRNATarget</w:t>
-      </w:r>
-      <w:proofErr w:type="spellEnd"/>
-      <w:r>
-        <w:t xml:space="preserve">: A command line version of the </w:t>
-      </w:r>
-      <w:proofErr w:type="spellStart"/>
-      <w:r>
-        <w:t>psRNATarget</w:t>
-      </w:r>
-      <w:proofErr w:type="spellEnd"/>
-      <w:r>
-        <w:t xml:space="preserve"> workflow that predicts potential miRNA target locations on a genome.</w:t>
-      </w:r>
-    </w:p>
-    <w:p>
-      <w:pPr>
-        <w:pStyle w:val="ListParagraph"/>
-      </w:pPr>
-      <w:r>
-        <w:t xml:space="preserve">A command line version of the </w:t>
-      </w:r>
-      <w:proofErr w:type="spellStart"/>
-      <w:r>
-        <w:t>psRNATarget</w:t>
-      </w:r>
-      <w:proofErr w:type="spellEnd"/>
-      <w:r>
-        <w:t xml:space="preserve"> workflow that predicts potential miRNA target locations on a genome. - </w:t>
-      </w:r>
-      <w:proofErr w:type="spellStart"/>
-      <w:r>
-        <w:t>jtremblay</w:t>
-      </w:r>
-      <w:proofErr w:type="spellEnd"/>
-      <w:r>
-        <w:t>/</w:t>
-      </w:r>
-      <w:proofErr w:type="spellStart"/>
-      <w:r>
-        <w:t>MiRNATarget</w:t>
-      </w:r>
-      <w:proofErr w:type="spellEnd"/>
-    </w:p>
-    <w:p>
-      <w:pPr>
-        <w:pStyle w:val="ListParagraph"/>
-      </w:pPr>
-      <w:r>
-        <w:lastRenderedPageBreak/>
+        <w:t>GitHub - jtremblay/MiRNATarget: A command line version of the psRNATarget workflow that predicts potential miRNA target locations on a genome.</w:t>
+      </w:r>
+    </w:p>
+    <w:p>
+      <w:pPr>
+        <w:pStyle w:val="ListParagraph"/>
+      </w:pPr>
+      <w:r>
+        <w:t>A command line version of the psRNATarget workflow that predicts potential miRNA target locations on a genome. - jtremblay/MiRNATarget</w:t>
+      </w:r>
+    </w:p>
+    <w:p>
+      <w:pPr>
+        <w:pStyle w:val="ListParagraph"/>
+      </w:pPr>
+      <w:r>
         <w:t xml:space="preserve"> </w:t>
       </w:r>
     </w:p>
@@ -3286,7 +2830,7 @@
         <w:rFonts w:ascii="Courier New" w:hAnsi="Courier New" w:hint="default"/>
       </w:rPr>
     </w:lvl>
-    <w:lvl w:ilvl="2" w:tplc="08090005" w:tentative="1">
+    <w:lvl w:ilvl="2" w:tplc="08090005">
       <w:start w:val="1"/>
       <w:numFmt w:val="bullet"/>
       <w:lvlText w:val=""/>

</xml_diff>

<commit_message>
ADDING TODAY'S WORK - 09.07.2026
</commit_message>
<xml_diff>
--- a/resources/Notes - Individual Research Project.docx
+++ b/resources/Notes - Individual Research Project.docx
@@ -149,7 +149,28 @@
         </w:numPr>
       </w:pPr>
       <w:r>
-        <w:t>Using dplyr::select() might be better for reproducibility than just select().</w:t>
+        <w:t xml:space="preserve">Using </w:t>
+      </w:r>
+      <w:proofErr w:type="spellStart"/>
+      <w:proofErr w:type="gramStart"/>
+      <w:r>
+        <w:t>dplyr</w:t>
+      </w:r>
+      <w:proofErr w:type="spellEnd"/>
+      <w:r>
+        <w:t>::select(</w:t>
+      </w:r>
+      <w:proofErr w:type="gramEnd"/>
+      <w:r>
+        <w:t xml:space="preserve">) might be better for reproducibility than just </w:t>
+      </w:r>
+      <w:proofErr w:type="gramStart"/>
+      <w:r>
+        <w:t>select(</w:t>
+      </w:r>
+      <w:proofErr w:type="gramEnd"/>
+      <w:r>
+        <w:t>).</w:t>
       </w:r>
     </w:p>
     <w:p>
@@ -161,10 +182,26 @@
         </w:numPr>
       </w:pPr>
       <w:r>
-        <w:t>I’ve had issues when using select() with deseq2 due to a conflict with deseq2-associated packages</w:t>
-      </w:r>
-      <w:r>
-        <w:t>. Using the :: will make it reproducible in case someone else has conflicting packages loaded or they update packages which will then cause conflict.</w:t>
+        <w:t xml:space="preserve">I’ve had issues when using </w:t>
+      </w:r>
+      <w:proofErr w:type="gramStart"/>
+      <w:r>
+        <w:t>select(</w:t>
+      </w:r>
+      <w:proofErr w:type="gramEnd"/>
+      <w:r>
+        <w:t>) with deseq2 due to a conflict with deseq2-associated packages</w:t>
+      </w:r>
+      <w:r>
+        <w:t xml:space="preserve">. Using </w:t>
+      </w:r>
+      <w:proofErr w:type="gramStart"/>
+      <w:r>
+        <w:t>the :</w:t>
+      </w:r>
+      <w:proofErr w:type="gramEnd"/>
+      <w:r>
+        <w:t>: will make it reproducible in case someone else has conflicting packages loaded or they update packages which will then cause conflict.</w:t>
       </w:r>
       <w:r>
         <w:t xml:space="preserve"> </w:t>
@@ -188,8 +225,17 @@
           <w:b/>
           <w:bCs/>
         </w:rPr>
-        <w:t>– seen it in other githubs</w:t>
-      </w:r>
+        <w:t xml:space="preserve">– seen it in other </w:t>
+      </w:r>
+      <w:proofErr w:type="spellStart"/>
+      <w:r>
+        <w:rPr>
+          <w:b/>
+          <w:bCs/>
+        </w:rPr>
+        <w:t>githubs</w:t>
+      </w:r>
+      <w:proofErr w:type="spellEnd"/>
     </w:p>
     <w:p>
       <w:pPr>
@@ -212,7 +258,15 @@
         </w:numPr>
       </w:pPr>
       <w:r>
-        <w:t xml:space="preserve">Company that performed the bioinformatics analysis for them = tamiRNA </w:t>
+        <w:t xml:space="preserve">Company that performed the bioinformatics analysis for them = </w:t>
+      </w:r>
+      <w:proofErr w:type="spellStart"/>
+      <w:r>
+        <w:t>tamiRNA</w:t>
+      </w:r>
+      <w:proofErr w:type="spellEnd"/>
+      <w:r>
+        <w:t xml:space="preserve"> </w:t>
       </w:r>
       <w:hyperlink r:id="rId6" w:history="1">
         <w:r>
@@ -244,7 +298,15 @@
         </w:numPr>
       </w:pPr>
       <w:r>
-        <w:t>see l4137 example github from previous year</w:t>
+        <w:t xml:space="preserve">see l4137 example </w:t>
+      </w:r>
+      <w:proofErr w:type="spellStart"/>
+      <w:r>
+        <w:t>github</w:t>
+      </w:r>
+      <w:proofErr w:type="spellEnd"/>
+      <w:r>
+        <w:t xml:space="preserve"> from previous year</w:t>
       </w:r>
       <w:r>
         <w:t xml:space="preserve"> </w:t>
@@ -293,7 +355,20 @@
       </w:pPr>
       <w:r>
         <w:lastRenderedPageBreak/>
-        <w:t xml:space="preserve">Need to include R sessionInfo() somewhere: </w:t>
+        <w:t xml:space="preserve">Need to include R </w:t>
+      </w:r>
+      <w:proofErr w:type="spellStart"/>
+      <w:proofErr w:type="gramStart"/>
+      <w:r>
+        <w:t>sessionInfo</w:t>
+      </w:r>
+      <w:proofErr w:type="spellEnd"/>
+      <w:r>
+        <w:t>(</w:t>
+      </w:r>
+      <w:proofErr w:type="gramEnd"/>
+      <w:r>
+        <w:t xml:space="preserve">) somewhere: </w:t>
       </w:r>
       <w:r>
         <w:rPr>
@@ -396,14 +471,27 @@
       <w:r>
         <w:t xml:space="preserve">If there’s time AND my results align with the </w:t>
       </w:r>
-      <w:r>
-        <w:t>tamiRNA results, can look at making a simple</w:t>
+      <w:proofErr w:type="spellStart"/>
+      <w:r>
+        <w:t>tamiRNA</w:t>
+      </w:r>
+      <w:proofErr w:type="spellEnd"/>
+      <w:r>
+        <w:t xml:space="preserve"> results, can look at making a simple</w:t>
       </w:r>
       <w:r>
         <w:t xml:space="preserve"> web</w:t>
       </w:r>
       <w:r>
-        <w:t xml:space="preserve"> app that takes the data in then you can select what you want to do with it and it will output the deseq2 results/graphs</w:t>
+        <w:t xml:space="preserve"> app that takes the data in then you can select what you want to do with </w:t>
+      </w:r>
+      <w:proofErr w:type="gramStart"/>
+      <w:r>
+        <w:t>it</w:t>
+      </w:r>
+      <w:proofErr w:type="gramEnd"/>
+      <w:r>
+        <w:t xml:space="preserve"> and it will output the deseq2 results/graphs</w:t>
       </w:r>
     </w:p>
     <w:p>
@@ -427,7 +515,23 @@
         </w:numPr>
       </w:pPr>
       <w:r>
-        <w:t xml:space="preserve">Could create a parallel report at the end (similar to the quast reports) that compares the </w:t>
+        <w:t>Could create a parallel report at the end (</w:t>
+      </w:r>
+      <w:proofErr w:type="gramStart"/>
+      <w:r>
+        <w:t>similar to</w:t>
+      </w:r>
+      <w:proofErr w:type="gramEnd"/>
+      <w:r>
+        <w:t xml:space="preserve"> the </w:t>
+      </w:r>
+      <w:proofErr w:type="spellStart"/>
+      <w:r>
+        <w:t>quast</w:t>
+      </w:r>
+      <w:proofErr w:type="spellEnd"/>
+      <w:r>
+        <w:t xml:space="preserve"> reports) that compares the </w:t>
       </w:r>
       <w:r>
         <w:t>results from multiple tests with different parameters e.g. different samples excluded based on quality</w:t>
@@ -550,6 +654,8 @@
           <w14:ligatures w14:val="none"/>
         </w:rPr>
       </w:pPr>
+      <w:proofErr w:type="spellStart"/>
+      <w:proofErr w:type="gramStart"/>
       <w:r>
         <w:rPr>
           <w:rFonts w:ascii="Menlo" w:eastAsia="Times New Roman" w:hAnsi="Menlo" w:cs="Menlo"/>
@@ -562,6 +668,7 @@
         </w:rPr>
         <w:t>BiocManager</w:t>
       </w:r>
+      <w:proofErr w:type="spellEnd"/>
       <w:r>
         <w:rPr>
           <w:rFonts w:ascii="Menlo" w:eastAsia="Times New Roman" w:hAnsi="Menlo" w:cs="Menlo"/>
@@ -614,6 +721,7 @@
         </w:rPr>
         <w:t>(</w:t>
       </w:r>
+      <w:proofErr w:type="gramEnd"/>
       <w:r>
         <w:rPr>
           <w:rFonts w:ascii="Menlo" w:eastAsia="Times New Roman" w:hAnsi="Menlo" w:cs="Menlo"/>
@@ -624,7 +732,33 @@
           <w:lang w:eastAsia="en-GB"/>
           <w14:ligatures w14:val="none"/>
         </w:rPr>
-        <w:t>"globaltest"</w:t>
+        <w:t>"</w:t>
+      </w:r>
+      <w:proofErr w:type="spellStart"/>
+      <w:r>
+        <w:rPr>
+          <w:rFonts w:ascii="Menlo" w:eastAsia="Times New Roman" w:hAnsi="Menlo" w:cs="Menlo"/>
+          <w:color w:val="D01040"/>
+          <w:kern w:val="0"/>
+          <w:sz w:val="20"/>
+          <w:szCs w:val="20"/>
+          <w:lang w:eastAsia="en-GB"/>
+          <w14:ligatures w14:val="none"/>
+        </w:rPr>
+        <w:t>globaltest</w:t>
+      </w:r>
+      <w:proofErr w:type="spellEnd"/>
+      <w:r>
+        <w:rPr>
+          <w:rFonts w:ascii="Menlo" w:eastAsia="Times New Roman" w:hAnsi="Menlo" w:cs="Menlo"/>
+          <w:color w:val="D01040"/>
+          <w:kern w:val="0"/>
+          <w:sz w:val="20"/>
+          <w:szCs w:val="20"/>
+          <w:lang w:eastAsia="en-GB"/>
+          <w14:ligatures w14:val="none"/>
+        </w:rPr>
+        <w:t>"</w:t>
       </w:r>
       <w:r>
         <w:rPr>
@@ -660,7 +794,33 @@
           <w:lang w:eastAsia="en-GB"/>
           <w14:ligatures w14:val="none"/>
         </w:rPr>
-        <w:t>"topGO"</w:t>
+        <w:t>"</w:t>
+      </w:r>
+      <w:proofErr w:type="spellStart"/>
+      <w:r>
+        <w:rPr>
+          <w:rFonts w:ascii="Menlo" w:eastAsia="Times New Roman" w:hAnsi="Menlo" w:cs="Menlo"/>
+          <w:color w:val="D01040"/>
+          <w:kern w:val="0"/>
+          <w:sz w:val="20"/>
+          <w:szCs w:val="20"/>
+          <w:lang w:eastAsia="en-GB"/>
+          <w14:ligatures w14:val="none"/>
+        </w:rPr>
+        <w:t>topGO</w:t>
+      </w:r>
+      <w:proofErr w:type="spellEnd"/>
+      <w:r>
+        <w:rPr>
+          <w:rFonts w:ascii="Menlo" w:eastAsia="Times New Roman" w:hAnsi="Menlo" w:cs="Menlo"/>
+          <w:color w:val="D01040"/>
+          <w:kern w:val="0"/>
+          <w:sz w:val="20"/>
+          <w:szCs w:val="20"/>
+          <w:lang w:eastAsia="en-GB"/>
+          <w14:ligatures w14:val="none"/>
+        </w:rPr>
+        <w:t>"</w:t>
       </w:r>
       <w:r>
         <w:rPr>
@@ -696,7 +856,33 @@
           <w:lang w:eastAsia="en-GB"/>
           <w14:ligatures w14:val="none"/>
         </w:rPr>
-        <w:t>"golubEsets"</w:t>
+        <w:t>"</w:t>
+      </w:r>
+      <w:proofErr w:type="spellStart"/>
+      <w:r>
+        <w:rPr>
+          <w:rFonts w:ascii="Menlo" w:eastAsia="Times New Roman" w:hAnsi="Menlo" w:cs="Menlo"/>
+          <w:color w:val="D01040"/>
+          <w:kern w:val="0"/>
+          <w:sz w:val="20"/>
+          <w:szCs w:val="20"/>
+          <w:lang w:eastAsia="en-GB"/>
+          <w14:ligatures w14:val="none"/>
+        </w:rPr>
+        <w:t>golubEsets</w:t>
+      </w:r>
+      <w:proofErr w:type="spellEnd"/>
+      <w:r>
+        <w:rPr>
+          <w:rFonts w:ascii="Menlo" w:eastAsia="Times New Roman" w:hAnsi="Menlo" w:cs="Menlo"/>
+          <w:color w:val="D01040"/>
+          <w:kern w:val="0"/>
+          <w:sz w:val="20"/>
+          <w:szCs w:val="20"/>
+          <w:lang w:eastAsia="en-GB"/>
+          <w14:ligatures w14:val="none"/>
+        </w:rPr>
+        <w:t>"</w:t>
       </w:r>
       <w:r>
         <w:rPr>
@@ -732,7 +918,33 @@
           <w:lang w:eastAsia="en-GB"/>
           <w14:ligatures w14:val="none"/>
         </w:rPr>
-        <w:t>"vsn"</w:t>
+        <w:t>"</w:t>
+      </w:r>
+      <w:proofErr w:type="spellStart"/>
+      <w:r>
+        <w:rPr>
+          <w:rFonts w:ascii="Menlo" w:eastAsia="Times New Roman" w:hAnsi="Menlo" w:cs="Menlo"/>
+          <w:color w:val="D01040"/>
+          <w:kern w:val="0"/>
+          <w:sz w:val="20"/>
+          <w:szCs w:val="20"/>
+          <w:lang w:eastAsia="en-GB"/>
+          <w14:ligatures w14:val="none"/>
+        </w:rPr>
+        <w:t>vsn</w:t>
+      </w:r>
+      <w:proofErr w:type="spellEnd"/>
+      <w:r>
+        <w:rPr>
+          <w:rFonts w:ascii="Menlo" w:eastAsia="Times New Roman" w:hAnsi="Menlo" w:cs="Menlo"/>
+          <w:color w:val="D01040"/>
+          <w:kern w:val="0"/>
+          <w:sz w:val="20"/>
+          <w:szCs w:val="20"/>
+          <w:lang w:eastAsia="en-GB"/>
+          <w14:ligatures w14:val="none"/>
+        </w:rPr>
+        <w:t>"</w:t>
       </w:r>
       <w:r>
         <w:rPr>
@@ -804,7 +1016,33 @@
           <w:lang w:eastAsia="en-GB"/>
           <w14:ligatures w14:val="none"/>
         </w:rPr>
-        <w:t>"GO.db"</w:t>
+        <w:t>"</w:t>
+      </w:r>
+      <w:proofErr w:type="spellStart"/>
+      <w:r>
+        <w:rPr>
+          <w:rFonts w:ascii="Menlo" w:eastAsia="Times New Roman" w:hAnsi="Menlo" w:cs="Menlo"/>
+          <w:color w:val="D01040"/>
+          <w:kern w:val="0"/>
+          <w:sz w:val="20"/>
+          <w:szCs w:val="20"/>
+          <w:lang w:eastAsia="en-GB"/>
+          <w14:ligatures w14:val="none"/>
+        </w:rPr>
+        <w:t>GO.db</w:t>
+      </w:r>
+      <w:proofErr w:type="spellEnd"/>
+      <w:r>
+        <w:rPr>
+          <w:rFonts w:ascii="Menlo" w:eastAsia="Times New Roman" w:hAnsi="Menlo" w:cs="Menlo"/>
+          <w:color w:val="D01040"/>
+          <w:kern w:val="0"/>
+          <w:sz w:val="20"/>
+          <w:szCs w:val="20"/>
+          <w:lang w:eastAsia="en-GB"/>
+          <w14:ligatures w14:val="none"/>
+        </w:rPr>
+        <w:t>"</w:t>
       </w:r>
       <w:r>
         <w:rPr>
@@ -840,7 +1078,33 @@
           <w:lang w:eastAsia="en-GB"/>
           <w14:ligatures w14:val="none"/>
         </w:rPr>
-        <w:t>"AnnotationDbi"</w:t>
+        <w:t>"</w:t>
+      </w:r>
+      <w:proofErr w:type="spellStart"/>
+      <w:r>
+        <w:rPr>
+          <w:rFonts w:ascii="Menlo" w:eastAsia="Times New Roman" w:hAnsi="Menlo" w:cs="Menlo"/>
+          <w:color w:val="D01040"/>
+          <w:kern w:val="0"/>
+          <w:sz w:val="20"/>
+          <w:szCs w:val="20"/>
+          <w:lang w:eastAsia="en-GB"/>
+          <w14:ligatures w14:val="none"/>
+        </w:rPr>
+        <w:t>AnnotationDbi</w:t>
+      </w:r>
+      <w:proofErr w:type="spellEnd"/>
+      <w:r>
+        <w:rPr>
+          <w:rFonts w:ascii="Menlo" w:eastAsia="Times New Roman" w:hAnsi="Menlo" w:cs="Menlo"/>
+          <w:color w:val="D01040"/>
+          <w:kern w:val="0"/>
+          <w:sz w:val="20"/>
+          <w:szCs w:val="20"/>
+          <w:lang w:eastAsia="en-GB"/>
+          <w14:ligatures w14:val="none"/>
+        </w:rPr>
+        <w:t>"</w:t>
       </w:r>
       <w:r>
         <w:rPr>
@@ -912,7 +1176,33 @@
           <w:lang w:eastAsia="en-GB"/>
           <w14:ligatures w14:val="none"/>
         </w:rPr>
-        <w:t>"topGO"</w:t>
+        <w:t>"</w:t>
+      </w:r>
+      <w:proofErr w:type="spellStart"/>
+      <w:r>
+        <w:rPr>
+          <w:rFonts w:ascii="Menlo" w:eastAsia="Times New Roman" w:hAnsi="Menlo" w:cs="Menlo"/>
+          <w:color w:val="D01040"/>
+          <w:kern w:val="0"/>
+          <w:sz w:val="20"/>
+          <w:szCs w:val="20"/>
+          <w:lang w:eastAsia="en-GB"/>
+          <w14:ligatures w14:val="none"/>
+        </w:rPr>
+        <w:t>topGO</w:t>
+      </w:r>
+      <w:proofErr w:type="spellEnd"/>
+      <w:r>
+        <w:rPr>
+          <w:rFonts w:ascii="Menlo" w:eastAsia="Times New Roman" w:hAnsi="Menlo" w:cs="Menlo"/>
+          <w:color w:val="D01040"/>
+          <w:kern w:val="0"/>
+          <w:sz w:val="20"/>
+          <w:szCs w:val="20"/>
+          <w:lang w:eastAsia="en-GB"/>
+          <w14:ligatures w14:val="none"/>
+        </w:rPr>
+        <w:t>"</w:t>
       </w:r>
       <w:r>
         <w:rPr>
@@ -984,7 +1274,33 @@
           <w:lang w:eastAsia="en-GB"/>
           <w14:ligatures w14:val="none"/>
         </w:rPr>
-        <w:t>"Biobase"</w:t>
+        <w:t>"</w:t>
+      </w:r>
+      <w:proofErr w:type="spellStart"/>
+      <w:r>
+        <w:rPr>
+          <w:rFonts w:ascii="Menlo" w:eastAsia="Times New Roman" w:hAnsi="Menlo" w:cs="Menlo"/>
+          <w:color w:val="D01040"/>
+          <w:kern w:val="0"/>
+          <w:sz w:val="20"/>
+          <w:szCs w:val="20"/>
+          <w:lang w:eastAsia="en-GB"/>
+          <w14:ligatures w14:val="none"/>
+        </w:rPr>
+        <w:t>Biobase</w:t>
+      </w:r>
+      <w:proofErr w:type="spellEnd"/>
+      <w:r>
+        <w:rPr>
+          <w:rFonts w:ascii="Menlo" w:eastAsia="Times New Roman" w:hAnsi="Menlo" w:cs="Menlo"/>
+          <w:color w:val="D01040"/>
+          <w:kern w:val="0"/>
+          <w:sz w:val="20"/>
+          <w:szCs w:val="20"/>
+          <w:lang w:eastAsia="en-GB"/>
+          <w14:ligatures w14:val="none"/>
+        </w:rPr>
+        <w:t>"</w:t>
       </w:r>
       <w:r>
         <w:rPr>
@@ -1020,7 +1336,33 @@
           <w:lang w:eastAsia="en-GB"/>
           <w14:ligatures w14:val="none"/>
         </w:rPr>
-        <w:t>"limma"</w:t>
+        <w:t>"</w:t>
+      </w:r>
+      <w:proofErr w:type="spellStart"/>
+      <w:r>
+        <w:rPr>
+          <w:rFonts w:ascii="Menlo" w:eastAsia="Times New Roman" w:hAnsi="Menlo" w:cs="Menlo"/>
+          <w:color w:val="D01040"/>
+          <w:kern w:val="0"/>
+          <w:sz w:val="20"/>
+          <w:szCs w:val="20"/>
+          <w:lang w:eastAsia="en-GB"/>
+          <w14:ligatures w14:val="none"/>
+        </w:rPr>
+        <w:t>limma</w:t>
+      </w:r>
+      <w:proofErr w:type="spellEnd"/>
+      <w:r>
+        <w:rPr>
+          <w:rFonts w:ascii="Menlo" w:eastAsia="Times New Roman" w:hAnsi="Menlo" w:cs="Menlo"/>
+          <w:color w:val="D01040"/>
+          <w:kern w:val="0"/>
+          <w:sz w:val="20"/>
+          <w:szCs w:val="20"/>
+          <w:lang w:eastAsia="en-GB"/>
+          <w14:ligatures w14:val="none"/>
+        </w:rPr>
+        <w:t>"</w:t>
       </w:r>
       <w:r>
         <w:rPr>
@@ -1133,7 +1475,15 @@
         </w:numPr>
       </w:pPr>
       <w:r>
-        <w:t>Replace hdm with der p 1 (active/inactive) as well?</w:t>
+        <w:t xml:space="preserve">Replace </w:t>
+      </w:r>
+      <w:proofErr w:type="spellStart"/>
+      <w:r>
+        <w:t>hdm</w:t>
+      </w:r>
+      <w:proofErr w:type="spellEnd"/>
+      <w:r>
+        <w:t xml:space="preserve"> with der p 1 (active/inactive) as well?</w:t>
       </w:r>
     </w:p>
     <w:p>
@@ -1145,7 +1495,23 @@
         </w:numPr>
       </w:pPr>
       <w:r>
-        <w:t>Remove ‘has-‘ from micro rna names. Looks like people just have it as miR-574-5p instead of hsa-miR-574-5p in research papers.</w:t>
+        <w:t>Remove ‘has</w:t>
+      </w:r>
+      <w:proofErr w:type="gramStart"/>
+      <w:r>
+        <w:t>-‘ from</w:t>
+      </w:r>
+      <w:proofErr w:type="gramEnd"/>
+      <w:r>
+        <w:t xml:space="preserve"> micro </w:t>
+      </w:r>
+      <w:proofErr w:type="spellStart"/>
+      <w:r>
+        <w:t>rna</w:t>
+      </w:r>
+      <w:proofErr w:type="spellEnd"/>
+      <w:r>
+        <w:t xml:space="preserve"> names. Looks like people just have it as miR-574-5p instead of hsa-miR-574-5p in research papers.</w:t>
       </w:r>
     </w:p>
     <w:p>
@@ -1245,6 +1611,18 @@
       </w:pPr>
       <w:r>
         <w:t>Need to decide whether I’m looking at the most DE miRNAs or ones associated with key pathways</w:t>
+      </w:r>
+    </w:p>
+    <w:p>
+      <w:pPr>
+        <w:pStyle w:val="ListParagraph"/>
+        <w:numPr>
+          <w:ilvl w:val="0"/>
+          <w:numId w:val="1"/>
+        </w:numPr>
+      </w:pPr>
+      <w:r>
+        <w:t>Don’t say ‘we’. Used past tense</w:t>
       </w:r>
     </w:p>
     <w:p>
@@ -1389,7 +1767,15 @@
         </w:numPr>
       </w:pPr>
       <w:r>
-        <w:t xml:space="preserve">See bioinformatics section of the methods. This paper is from tamiRNA analysis of their propriety miRNA workflow </w:t>
+        <w:t xml:space="preserve">See bioinformatics section of the methods. This paper is from </w:t>
+      </w:r>
+      <w:proofErr w:type="spellStart"/>
+      <w:r>
+        <w:t>tamiRNA</w:t>
+      </w:r>
+      <w:proofErr w:type="spellEnd"/>
+      <w:r>
+        <w:t xml:space="preserve"> analysis of their propriety miRNA workflow </w:t>
       </w:r>
       <w:hyperlink r:id="rId15" w:history="1">
         <w:r>
@@ -1477,14 +1863,34 @@
         </w:numPr>
       </w:pPr>
       <w:r>
-        <w:t xml:space="preserve">Got some good training videos for pathway enrichment anlysis etc. </w:t>
+        <w:t xml:space="preserve">Got some good training videos for pathway enrichment </w:t>
+      </w:r>
+      <w:proofErr w:type="spellStart"/>
+      <w:r>
+        <w:t>anlysis</w:t>
+      </w:r>
+      <w:proofErr w:type="spellEnd"/>
+      <w:r>
+        <w:t xml:space="preserve"> etc. </w:t>
       </w:r>
       <w:hyperlink r:id="rId17" w:history="1">
         <w:r>
           <w:rPr>
             <w:rStyle w:val="Hyperlink"/>
           </w:rPr>
-          <w:t>https://bioinformatics.ccr.cancer.gov/btep/btep-video-archive-of-past-classes/</w:t>
+          <w:t>https://bioinformatics.ccr.cancer.gov/btep/btep-video-archive</w:t>
+        </w:r>
+        <w:r>
+          <w:rPr>
+            <w:rStyle w:val="Hyperlink"/>
+          </w:rPr>
+          <w:t>-</w:t>
+        </w:r>
+        <w:r>
+          <w:rPr>
+            <w:rStyle w:val="Hyperlink"/>
+          </w:rPr>
+          <w:t>of-past-classes/</w:t>
         </w:r>
       </w:hyperlink>
     </w:p>
@@ -1534,9 +1940,11 @@
           <w:numId w:val="1"/>
         </w:numPr>
       </w:pPr>
+      <w:proofErr w:type="spellStart"/>
       <w:r>
         <w:t>clusterProfiler</w:t>
       </w:r>
+      <w:proofErr w:type="spellEnd"/>
     </w:p>
     <w:p>
       <w:pPr>
@@ -1546,9 +1954,11 @@
           <w:numId w:val="1"/>
         </w:numPr>
       </w:pPr>
+      <w:proofErr w:type="spellStart"/>
       <w:r>
         <w:t>ReactomePA</w:t>
       </w:r>
+      <w:proofErr w:type="spellEnd"/>
     </w:p>
     <w:p>
       <w:pPr>
@@ -1558,9 +1968,11 @@
           <w:numId w:val="1"/>
         </w:numPr>
       </w:pPr>
+      <w:proofErr w:type="spellStart"/>
       <w:r>
         <w:t>enrichplot</w:t>
       </w:r>
+      <w:proofErr w:type="spellEnd"/>
     </w:p>
     <w:p>
       <w:pPr>
@@ -1570,9 +1982,11 @@
           <w:numId w:val="1"/>
         </w:numPr>
       </w:pPr>
+      <w:proofErr w:type="spellStart"/>
       <w:r>
         <w:t>fgsea</w:t>
       </w:r>
+      <w:proofErr w:type="spellEnd"/>
     </w:p>
     <w:p>
       <w:pPr>
@@ -1602,9 +2016,38 @@
           <w:numId w:val="1"/>
         </w:numPr>
       </w:pPr>
+      <w:proofErr w:type="spellStart"/>
       <w:r>
         <w:lastRenderedPageBreak/>
-        <w:t>ToppGene was used for functional enrichment analysis of the miRNA targets (51) with a Bonferroni FDR &lt;0.05. Biological process gene ontology (GO) terms generated through ToppGene were then summarised, and REViGO (52) and Cytoscape (53) were used to visualise the network.</w:t>
+        <w:t>ToppGene</w:t>
+      </w:r>
+      <w:proofErr w:type="spellEnd"/>
+      <w:r>
+        <w:t xml:space="preserve"> was used for functional enrichment analysis of the miRNA targets (51) with a Bonferroni FDR &lt;0.05. Biological process gene ontology (GO) terms generated through </w:t>
+      </w:r>
+      <w:proofErr w:type="spellStart"/>
+      <w:r>
+        <w:t>ToppGene</w:t>
+      </w:r>
+      <w:proofErr w:type="spellEnd"/>
+      <w:r>
+        <w:t xml:space="preserve"> were then summarised, and </w:t>
+      </w:r>
+      <w:proofErr w:type="spellStart"/>
+      <w:r>
+        <w:t>REViGO</w:t>
+      </w:r>
+      <w:proofErr w:type="spellEnd"/>
+      <w:r>
+        <w:t xml:space="preserve"> (52) and </w:t>
+      </w:r>
+      <w:proofErr w:type="spellStart"/>
+      <w:r>
+        <w:t>Cytoscape</w:t>
+      </w:r>
+      <w:proofErr w:type="spellEnd"/>
+      <w:r>
+        <w:t xml:space="preserve"> (53) were used to visualise the network.</w:t>
       </w:r>
       <w:r>
         <w:t xml:space="preserve"> </w:t>
@@ -1639,7 +2082,15 @@
         </w:numPr>
       </w:pPr>
       <w:r>
-        <w:t xml:space="preserve">Use plotly in r for interactive plots. See for details </w:t>
+        <w:t xml:space="preserve">Use </w:t>
+      </w:r>
+      <w:proofErr w:type="spellStart"/>
+      <w:r>
+        <w:t>plotly</w:t>
+      </w:r>
+      <w:proofErr w:type="spellEnd"/>
+      <w:r>
+        <w:t xml:space="preserve"> in r for interactive plots. See for details </w:t>
       </w:r>
       <w:r>
         <w:sym w:font="Wingdings" w:char="F0E0"/>
@@ -1775,6 +2226,7 @@
           <w:numId w:val="3"/>
         </w:numPr>
       </w:pPr>
+      <w:proofErr w:type="gramStart"/>
       <w:r>
         <w:t>let</w:t>
       </w:r>
@@ -1782,7 +2234,11 @@
         <w:t>-</w:t>
       </w:r>
       <w:r>
-        <w:t xml:space="preserve">7 </w:t>
+        <w:t>7</w:t>
+      </w:r>
+      <w:proofErr w:type="gramEnd"/>
+      <w:r>
+        <w:t xml:space="preserve"> </w:t>
       </w:r>
       <w:r>
         <w:t>=</w:t>
@@ -2040,7 +2496,39 @@
         <w:t xml:space="preserve"> </w:t>
       </w:r>
       <w:r>
-        <w:t>Next-generation sequencing (NGS) data was analysed using the miND® analysis pipeline (20). The resulting differentially expressed miRNAs were investigated using Qiagen Ingenuity Pathway Software. This analysis used MicroRNA Target Filter to identify the gene targets of the differentially expressed miRNAs, genes were selected based on experimental evidence from TargetScan. TarBase, miRecords and Ingenuity Knowledge Base. The miRNA-gene pairings were matched based on the directionality of the miRNA abundance and used to perform pathway enrichment analysis.</w:t>
+        <w:t xml:space="preserve">Next-generation sequencing (NGS) data was analysed using the </w:t>
+      </w:r>
+      <w:proofErr w:type="spellStart"/>
+      <w:r>
+        <w:t>miND</w:t>
+      </w:r>
+      <w:proofErr w:type="spellEnd"/>
+      <w:r>
+        <w:t xml:space="preserve">® analysis pipeline (20). The resulting differentially expressed miRNAs were investigated using Qiagen Ingenuity Pathway Software. This analysis used MicroRNA Target Filter to identify the gene targets of the differentially expressed miRNAs, genes were selected based on experimental evidence from </w:t>
+      </w:r>
+      <w:proofErr w:type="spellStart"/>
+      <w:r>
+        <w:t>TargetScan</w:t>
+      </w:r>
+      <w:proofErr w:type="spellEnd"/>
+      <w:r>
+        <w:t xml:space="preserve">. </w:t>
+      </w:r>
+      <w:proofErr w:type="spellStart"/>
+      <w:r>
+        <w:t>TarBase</w:t>
+      </w:r>
+      <w:proofErr w:type="spellEnd"/>
+      <w:r>
+        <w:t xml:space="preserve">, </w:t>
+      </w:r>
+      <w:proofErr w:type="spellStart"/>
+      <w:r>
+        <w:t>miRecords</w:t>
+      </w:r>
+      <w:proofErr w:type="spellEnd"/>
+      <w:r>
+        <w:t xml:space="preserve"> and Ingenuity Knowledge Base. The miRNA-gene pairings were matched based on the directionality of the miRNA abundance and used to perform pathway enrichment analysis.</w:t>
       </w:r>
     </w:p>
     <w:p>
@@ -2166,8 +2654,13 @@
           <w:numId w:val="7"/>
         </w:numPr>
       </w:pPr>
-      <w:r>
-        <w:t>TargetFinder: A widely used command-line tool designed by the Carrington Lab to computationally predict small RNA binding sites on target transcripts.</w:t>
+      <w:proofErr w:type="spellStart"/>
+      <w:r>
+        <w:t>TargetFinder</w:t>
+      </w:r>
+      <w:proofErr w:type="spellEnd"/>
+      <w:r>
+        <w:t>: A widely used command-line tool designed by the Carrington Lab to computationally predict small RNA binding sites on target transcripts.</w:t>
       </w:r>
     </w:p>
     <w:p>
@@ -2178,8 +2671,21 @@
           <w:numId w:val="7"/>
         </w:numPr>
       </w:pPr>
-      <w:r>
-        <w:t>MiRNATarget: A command-line wrapper for the psRNATarget workflow that identifies potential miRNA target locations across a genome.</w:t>
+      <w:proofErr w:type="spellStart"/>
+      <w:r>
+        <w:t>MiRNATarget</w:t>
+      </w:r>
+      <w:proofErr w:type="spellEnd"/>
+      <w:r>
+        <w:t xml:space="preserve">: A command-line wrapper for the </w:t>
+      </w:r>
+      <w:proofErr w:type="spellStart"/>
+      <w:r>
+        <w:t>psRNATarget</w:t>
+      </w:r>
+      <w:proofErr w:type="spellEnd"/>
+      <w:r>
+        <w:t xml:space="preserve"> workflow that identifies potential miRNA target locations across a genome.</w:t>
       </w:r>
     </w:p>
     <w:p>
@@ -2190,8 +2696,13 @@
           <w:numId w:val="7"/>
         </w:numPr>
       </w:pPr>
-      <w:r>
-        <w:t>miRTarget: A package that pulls predicted miRNA targets by aggregating results across multiple established databases. [1, 2, 3, 4, 5]</w:t>
+      <w:proofErr w:type="spellStart"/>
+      <w:r>
+        <w:t>miRTarget</w:t>
+      </w:r>
+      <w:proofErr w:type="spellEnd"/>
+      <w:r>
+        <w:t>: A package that pulls predicted miRNA targets by aggregating results across multiple established databases. [1, 2, 3, 4, 5]</w:t>
       </w:r>
     </w:p>
     <w:p>
@@ -2207,16 +2718,61 @@
         <w:pStyle w:val="ListParagraph"/>
       </w:pPr>
       <w:r>
-        <w:t>GitHub - jtremblay/MiRNATarget: A command line version of the psRNATarget workflow that predicts potential miRNA target locations on a genome.</w:t>
-      </w:r>
-    </w:p>
-    <w:p>
-      <w:pPr>
-        <w:pStyle w:val="ListParagraph"/>
-      </w:pPr>
-      <w:r>
-        <w:t>A command line version of the psRNATarget workflow that predicts potential miRNA target locations on a genome. - jtremblay/MiRNATarget</w:t>
-      </w:r>
+        <w:t xml:space="preserve">GitHub - </w:t>
+      </w:r>
+      <w:proofErr w:type="spellStart"/>
+      <w:r>
+        <w:t>jtremblay</w:t>
+      </w:r>
+      <w:proofErr w:type="spellEnd"/>
+      <w:r>
+        <w:t>/</w:t>
+      </w:r>
+      <w:proofErr w:type="spellStart"/>
+      <w:r>
+        <w:t>MiRNATarget</w:t>
+      </w:r>
+      <w:proofErr w:type="spellEnd"/>
+      <w:r>
+        <w:t xml:space="preserve">: A command line version of the </w:t>
+      </w:r>
+      <w:proofErr w:type="spellStart"/>
+      <w:r>
+        <w:t>psRNATarget</w:t>
+      </w:r>
+      <w:proofErr w:type="spellEnd"/>
+      <w:r>
+        <w:t xml:space="preserve"> workflow that predicts potential miRNA target locations on a genome.</w:t>
+      </w:r>
+    </w:p>
+    <w:p>
+      <w:pPr>
+        <w:pStyle w:val="ListParagraph"/>
+      </w:pPr>
+      <w:r>
+        <w:t xml:space="preserve">A command line version of the </w:t>
+      </w:r>
+      <w:proofErr w:type="spellStart"/>
+      <w:r>
+        <w:t>psRNATarget</w:t>
+      </w:r>
+      <w:proofErr w:type="spellEnd"/>
+      <w:r>
+        <w:t xml:space="preserve"> workflow that predicts potential miRNA target locations on a genome. - </w:t>
+      </w:r>
+      <w:proofErr w:type="spellStart"/>
+      <w:r>
+        <w:t>jtremblay</w:t>
+      </w:r>
+      <w:proofErr w:type="spellEnd"/>
+      <w:r>
+        <w:t>/</w:t>
+      </w:r>
+      <w:proofErr w:type="spellStart"/>
+      <w:r>
+        <w:t>MiRNATarget</w:t>
+      </w:r>
+      <w:proofErr w:type="spellEnd"/>
     </w:p>
     <w:p>
       <w:pPr>

</xml_diff>

<commit_message>
ADDING TODAY'S WORK - 22.07.2026
</commit_message>
<xml_diff>
--- a/resources/Notes - Individual Research Project.docx
+++ b/resources/Notes - Individual Research Project.docx
@@ -1684,6 +1684,27 @@
     <w:p>
       <w:pPr>
         <w:pStyle w:val="ListParagraph"/>
+        <w:numPr>
+          <w:ilvl w:val="0"/>
+          <w:numId w:val="1"/>
+        </w:numPr>
+      </w:pPr>
+      <w:r>
+        <w:t>Make sure all cm</w:t>
+      </w:r>
+      <w:r>
+        <w:rPr>
+          <w:vertAlign w:val="superscript"/>
+        </w:rPr>
+        <w:t>2</w:t>
+      </w:r>
+      <w:r>
+        <w:t xml:space="preserve"> are written with the 2 in superscript and not normal</w:t>
+      </w:r>
+    </w:p>
+    <w:p>
+      <w:pPr>
+        <w:pStyle w:val="ListParagraph"/>
       </w:pPr>
     </w:p>
     <w:p>
@@ -1698,6 +1719,7 @@
           <w:b/>
           <w:bCs/>
         </w:rPr>
+        <w:lastRenderedPageBreak/>
         <w:t>PART 1 – DGEA</w:t>
       </w:r>
     </w:p>
@@ -1710,7 +1732,6 @@
         </w:numPr>
       </w:pPr>
       <w:r>
-        <w:lastRenderedPageBreak/>
         <w:t xml:space="preserve">Need to be confident with the annotation for miRNA. </w:t>
       </w:r>
       <w:hyperlink r:id="rId12" w:history="1">
@@ -2028,6 +2049,7 @@
       </w:pPr>
       <w:proofErr w:type="spellStart"/>
       <w:r>
+        <w:lastRenderedPageBreak/>
         <w:t>fgsea</w:t>
       </w:r>
       <w:proofErr w:type="spellEnd"/>
@@ -2041,7 +2063,6 @@
         </w:numPr>
       </w:pPr>
       <w:r>
-        <w:lastRenderedPageBreak/>
         <w:t xml:space="preserve">Pathway analysis software used in one of the 3 initial references supplied </w:t>
       </w:r>
       <w:hyperlink r:id="rId19" w:history="1">
@@ -2408,6 +2429,7 @@
     </w:p>
     <w:p>
       <w:r>
+        <w:lastRenderedPageBreak/>
         <w:tab/>
       </w:r>
       <w:r>
@@ -2435,7 +2457,6 @@
         <w:rPr>
           <w:noProof/>
         </w:rPr>
-        <w:lastRenderedPageBreak/>
         <w:drawing>
           <wp:inline distT="0" distB="0" distL="0" distR="0" wp14:anchorId="6415A522" wp14:editId="593C753A">
             <wp:extent cx="5731510" cy="1586865"/>
@@ -2669,7 +2690,6 @@
           <w:b/>
           <w:bCs/>
         </w:rPr>
-        <w:lastRenderedPageBreak/>
         <w:t xml:space="preserve">Potential open-source pipelines for pathway analysis </w:t>
       </w:r>
       <w:r>

</xml_diff>

<commit_message>
ADDING TODAY'S WORK - 24.07.2026
</commit_message>
<xml_diff>
--- a/resources/Notes - Individual Research Project.docx
+++ b/resources/Notes - Individual Research Project.docx
@@ -1705,6 +1705,27 @@
     <w:p>
       <w:pPr>
         <w:pStyle w:val="ListParagraph"/>
+        <w:numPr>
+          <w:ilvl w:val="0"/>
+          <w:numId w:val="1"/>
+        </w:numPr>
+      </w:pPr>
+      <w:r>
+        <w:t>Change ‘proprietary’ to commercial be</w:t>
+      </w:r>
+      <w:r>
+        <w:t>c</w:t>
+      </w:r>
+      <w:r>
+        <w:t xml:space="preserve">ause even open-source and open-access software is still </w:t>
+      </w:r>
+      <w:r>
+        <w:t>proprietary</w:t>
+      </w:r>
+    </w:p>
+    <w:p>
+      <w:pPr>
+        <w:pStyle w:val="ListParagraph"/>
       </w:pPr>
     </w:p>
     <w:p>
@@ -1719,7 +1740,6 @@
           <w:b/>
           <w:bCs/>
         </w:rPr>
-        <w:lastRenderedPageBreak/>
         <w:t>PART 1 – DGEA</w:t>
       </w:r>
     </w:p>
@@ -2021,6 +2041,7 @@
       </w:pPr>
       <w:proofErr w:type="spellStart"/>
       <w:r>
+        <w:lastRenderedPageBreak/>
         <w:t>ReactomePA</w:t>
       </w:r>
       <w:proofErr w:type="spellEnd"/>
@@ -2049,7 +2070,6 @@
       </w:pPr>
       <w:proofErr w:type="spellStart"/>
       <w:r>
-        <w:lastRenderedPageBreak/>
         <w:t>fgsea</w:t>
       </w:r>
       <w:proofErr w:type="spellEnd"/>

</xml_diff>